<commit_message>
Update master prompt document title reflecting recent changes
Update .agents/agent_assets_metadata.toml to reflect the latest version of the master prompt document.

Replit-Commit-Author: Agent
Replit-Commit-Session-Id: 0ab6a53e-e892-4f8b-a562-2151c283dfee
Replit-Commit-Checkpoint-Type: full_checkpoint
Replit-Commit-Event-Id: c04ba60a-44c6-445b-8828-ddf01840f4a7
Replit-Commit-Screenshot-Url: https://storage.googleapis.com/screenshot-production-us-central1/67b4a529-a782-4661-87b5-bdc631927d66/0ab6a53e-e892-4f8b-a562-2151c283dfee/uAPtJp1
Replit-Helium-Checkpoint-Created: true
</commit_message>
<xml_diff>
--- a/Thoucentric_Industry_Research_Pod_Master_Prompt_v3.docx
+++ b/Thoucentric_Industry_Research_Pod_Master_Prompt_v3.docx
@@ -63,7 +63,7 @@
           <w:sz w:val="20"/>
           <w:szCs w:val="20"/>
         </w:rPr>
-        <w:t xml:space="preserve">Version: Production v3.0  ·  Data Baseline: May 2025  ·  Grade: Top 0.001% Prompt Engineering</w:t>
+        <w:t xml:space="preserve">Version: Production v3.0  ·  Data Baseline: May 2025  ·  No Seeding Constraints</w:t>
       </w:r>
     </w:p>
     <w:p>
@@ -828,26 +828,26 @@
           <w:sz w:val="21"/>
           <w:szCs w:val="21"/>
         </w:rPr>
-        <w:t xml:space="preserve">fullName (text) — "Hindustan Unilever Limited"</w:t>
-      </w:r>
-    </w:p>
-    <w:p>
-      <w:pPr>
-        <w:pStyle w:val="ListParagraph"/>
-        <w:numPr>
-          <w:ilvl w:val="0"/>
-          <w:numId w:val="1"/>
-        </w:numPr>
-        <w:spacing w:after="60"/>
-      </w:pPr>
-      <w:r>
-        <w:rPr>
-          <w:rFonts w:ascii="Calibri" w:cs="Calibri" w:eastAsia="Calibri" w:hAnsi="Calibri"/>
-          <w:color w:val="BBBBCC"/>
-          <w:sz w:val="21"/>
-          <w:szCs w:val="21"/>
-        </w:rPr>
-        <w:t xml:space="preserve">geography (text) — "India" | "India / Global" | "Global"</w:t>
+        <w:t xml:space="preserve">fullName — "Hindustan Unilever Limited"</w:t>
+      </w:r>
+    </w:p>
+    <w:p>
+      <w:pPr>
+        <w:pStyle w:val="ListParagraph"/>
+        <w:numPr>
+          <w:ilvl w:val="0"/>
+          <w:numId w:val="1"/>
+        </w:numPr>
+        <w:spacing w:after="60"/>
+      </w:pPr>
+      <w:r>
+        <w:rPr>
+          <w:rFonts w:ascii="Calibri" w:cs="Calibri" w:eastAsia="Calibri" w:hAnsi="Calibri"/>
+          <w:color w:val="BBBBCC"/>
+          <w:sz w:val="21"/>
+          <w:szCs w:val="21"/>
+        </w:rPr>
+        <w:t xml:space="preserve">geography — "India" | "India / Global" | "Global"</w:t>
       </w:r>
     </w:p>
     <w:p>
@@ -885,102 +885,102 @@
           <w:sz w:val="21"/>
           <w:szCs w:val="21"/>
         </w:rPr>
-        <w:t xml:space="preserve">categories (text) — "Home Care · Personal Care · Foods"</w:t>
-      </w:r>
-    </w:p>
-    <w:p>
-      <w:pPr>
-        <w:pStyle w:val="ListParagraph"/>
-        <w:numPr>
-          <w:ilvl w:val="0"/>
-          <w:numId w:val="1"/>
-        </w:numPr>
-        <w:spacing w:after="60"/>
-      </w:pPr>
-      <w:r>
-        <w:rPr>
-          <w:rFonts w:ascii="Calibri" w:cs="Calibri" w:eastAsia="Calibri" w:hAnsi="Calibri"/>
-          <w:color w:val="BBBBCC"/>
-          <w:sz w:val="21"/>
-          <w:szCs w:val="21"/>
-        </w:rPr>
-        <w:t xml:space="preserve">quickTake (text) — EXACTLY 2-sentence consulting summary</w:t>
-      </w:r>
-    </w:p>
-    <w:p>
-      <w:pPr>
-        <w:pStyle w:val="ListParagraph"/>
-        <w:numPr>
-          <w:ilvl w:val="0"/>
-          <w:numId w:val="1"/>
-        </w:numPr>
-        <w:spacing w:after="60"/>
-      </w:pPr>
-      <w:r>
-        <w:rPr>
-          <w:rFonts w:ascii="Calibri" w:cs="Calibri" w:eastAsia="Calibri" w:hAnsi="Calibri"/>
-          <w:color w:val="BBBBCC"/>
-          <w:sz w:val="21"/>
-          <w:szCs w:val="21"/>
-        </w:rPr>
-        <w:t xml:space="preserve">openProblems (text) — specific SC/procurement gaps with ₹Cr impact</w:t>
-      </w:r>
-    </w:p>
-    <w:p>
-      <w:pPr>
-        <w:pStyle w:val="ListParagraph"/>
-        <w:numPr>
-          <w:ilvl w:val="0"/>
-          <w:numId w:val="1"/>
-        </w:numPr>
-        <w:spacing w:after="60"/>
-      </w:pPr>
-      <w:r>
-        <w:rPr>
-          <w:rFonts w:ascii="Calibri" w:cs="Calibri" w:eastAsia="Calibri" w:hAnsi="Calibri"/>
-          <w:color w:val="BBBBCC"/>
-          <w:sz w:val="21"/>
-          <w:szCs w:val="21"/>
-        </w:rPr>
-        <w:t xml:space="preserve">scIntelligence (text) — supply chain intelligence paragraph</w:t>
-      </w:r>
-    </w:p>
-    <w:p>
-      <w:pPr>
-        <w:pStyle w:val="ListParagraph"/>
-        <w:numPr>
-          <w:ilvl w:val="0"/>
-          <w:numId w:val="1"/>
-        </w:numPr>
-        <w:spacing w:after="60"/>
-      </w:pPr>
-      <w:r>
-        <w:rPr>
-          <w:rFonts w:ascii="Calibri" w:cs="Calibri" w:eastAsia="Calibri" w:hAnsi="Calibri"/>
-          <w:color w:val="BBBBCC"/>
-          <w:sz w:val="21"/>
-          <w:szCs w:val="21"/>
-        </w:rPr>
-        <w:t xml:space="preserve">strategicPriorities (text) — FY26 strategic priorities</w:t>
-      </w:r>
-    </w:p>
-    <w:p>
-      <w:pPr>
-        <w:pStyle w:val="ListParagraph"/>
-        <w:numPr>
-          <w:ilvl w:val="0"/>
-          <w:numId w:val="1"/>
-        </w:numPr>
-        <w:spacing w:after="60"/>
-      </w:pPr>
-      <w:r>
-        <w:rPr>
-          <w:rFonts w:ascii="Calibri" w:cs="Calibri" w:eastAsia="Calibri" w:hAnsi="Calibri"/>
-          <w:color w:val="BBBBCC"/>
-          <w:sz w:val="21"/>
-          <w:szCs w:val="21"/>
-        </w:rPr>
-        <w:t xml:space="preserve">consultingAngle (text) — specific Thoucentric engagement opportunity</w:t>
+        <w:t xml:space="preserve">categories — "Home Care · Personal Care · Foods"</w:t>
+      </w:r>
+    </w:p>
+    <w:p>
+      <w:pPr>
+        <w:pStyle w:val="ListParagraph"/>
+        <w:numPr>
+          <w:ilvl w:val="0"/>
+          <w:numId w:val="1"/>
+        </w:numPr>
+        <w:spacing w:after="60"/>
+      </w:pPr>
+      <w:r>
+        <w:rPr>
+          <w:rFonts w:ascii="Calibri" w:cs="Calibri" w:eastAsia="Calibri" w:hAnsi="Calibri"/>
+          <w:color w:val="BBBBCC"/>
+          <w:sz w:val="21"/>
+          <w:szCs w:val="21"/>
+        </w:rPr>
+        <w:t xml:space="preserve">quickTake — EXACTLY 2-sentence consulting summary</w:t>
+      </w:r>
+    </w:p>
+    <w:p>
+      <w:pPr>
+        <w:pStyle w:val="ListParagraph"/>
+        <w:numPr>
+          <w:ilvl w:val="0"/>
+          <w:numId w:val="1"/>
+        </w:numPr>
+        <w:spacing w:after="60"/>
+      </w:pPr>
+      <w:r>
+        <w:rPr>
+          <w:rFonts w:ascii="Calibri" w:cs="Calibri" w:eastAsia="Calibri" w:hAnsi="Calibri"/>
+          <w:color w:val="BBBBCC"/>
+          <w:sz w:val="21"/>
+          <w:szCs w:val="21"/>
+        </w:rPr>
+        <w:t xml:space="preserve">openProblems — specific SC/procurement gaps with Rs.Cr impact</w:t>
+      </w:r>
+    </w:p>
+    <w:p>
+      <w:pPr>
+        <w:pStyle w:val="ListParagraph"/>
+        <w:numPr>
+          <w:ilvl w:val="0"/>
+          <w:numId w:val="1"/>
+        </w:numPr>
+        <w:spacing w:after="60"/>
+      </w:pPr>
+      <w:r>
+        <w:rPr>
+          <w:rFonts w:ascii="Calibri" w:cs="Calibri" w:eastAsia="Calibri" w:hAnsi="Calibri"/>
+          <w:color w:val="BBBBCC"/>
+          <w:sz w:val="21"/>
+          <w:szCs w:val="21"/>
+        </w:rPr>
+        <w:t xml:space="preserve">scIntelligence — supply chain intelligence paragraph</w:t>
+      </w:r>
+    </w:p>
+    <w:p>
+      <w:pPr>
+        <w:pStyle w:val="ListParagraph"/>
+        <w:numPr>
+          <w:ilvl w:val="0"/>
+          <w:numId w:val="1"/>
+        </w:numPr>
+        <w:spacing w:after="60"/>
+      </w:pPr>
+      <w:r>
+        <w:rPr>
+          <w:rFonts w:ascii="Calibri" w:cs="Calibri" w:eastAsia="Calibri" w:hAnsi="Calibri"/>
+          <w:color w:val="BBBBCC"/>
+          <w:sz w:val="21"/>
+          <w:szCs w:val="21"/>
+        </w:rPr>
+        <w:t xml:space="preserve">strategicPriorities — FY26 strategic priorities</w:t>
+      </w:r>
+    </w:p>
+    <w:p>
+      <w:pPr>
+        <w:pStyle w:val="ListParagraph"/>
+        <w:numPr>
+          <w:ilvl w:val="0"/>
+          <w:numId w:val="1"/>
+        </w:numPr>
+        <w:spacing w:after="60"/>
+      </w:pPr>
+      <w:r>
+        <w:rPr>
+          <w:rFonts w:ascii="Calibri" w:cs="Calibri" w:eastAsia="Calibri" w:hAnsi="Calibri"/>
+          <w:color w:val="BBBBCC"/>
+          <w:sz w:val="21"/>
+          <w:szCs w:val="21"/>
+        </w:rPr>
+        <w:t xml:space="preserve">consultingAngle — specific Thoucentric engagement opportunity</w:t>
       </w:r>
     </w:p>
     <w:p>
@@ -1018,7 +1018,7 @@
           <w:sz w:val="21"/>
           <w:szCs w:val="21"/>
         </w:rPr>
-        <w:t xml:space="preserve">lastUpdated (text) — "Q4 FY25"</w:t>
+        <w:t xml:space="preserve">lastUpdated — "Q4 FY25"</w:t>
       </w:r>
     </w:p>
     <w:p>
@@ -1053,7 +1053,7 @@
           <w:sz w:val="21"/>
           <w:szCs w:val="21"/>
         </w:rPr>
-        <w:t xml:space="preserve">id (serial PK), cardId (text UNIQUE) — format: "SHEI-2025-Q2-01"</w:t>
+        <w:t xml:space="preserve">id (serial PK), cardId (text UNIQUE) — "SHEI-2025-Q2-01" format</w:t>
       </w:r>
     </w:p>
     <w:p>
@@ -1091,7 +1091,7 @@
           <w:sz w:val="21"/>
           <w:szCs w:val="21"/>
         </w:rPr>
-        <w:t xml:space="preserve">signal — observable trend (2-3 sentences with quantified ₹/% numbers)</w:t>
+        <w:t xml:space="preserve">signal — observable trend (2-3 sentences with Rs./% numbers)</w:t>
       </w:r>
     </w:p>
     <w:p>
@@ -1148,45 +1148,45 @@
           <w:sz w:val="21"/>
           <w:szCs w:val="21"/>
         </w:rPr>
-        <w:t xml:space="preserve">contradictions — explicit mismatches: e.g. "Revenue +2.8% but Volume -0.7% = premiumisation masking unit decline"</w:t>
-      </w:r>
-    </w:p>
-    <w:p>
-      <w:pPr>
-        <w:pStyle w:val="ListParagraph"/>
-        <w:numPr>
-          <w:ilvl w:val="0"/>
-          <w:numId w:val="1"/>
-        </w:numPr>
-        <w:spacing w:after="60"/>
-      </w:pPr>
-      <w:r>
-        <w:rPr>
-          <w:rFonts w:ascii="Calibri" w:cs="Calibri" w:eastAsia="Calibri" w:hAnsi="Calibri"/>
-          <w:color w:val="BBBBCC"/>
-          <w:sz w:val="21"/>
-          <w:szCs w:val="21"/>
-        </w:rPr>
-        <w:t xml:space="preserve">clientImplication, thoucentriqAngle — engagement with timeline (weeks) and ₹Cr/€M fee range</w:t>
-      </w:r>
-    </w:p>
-    <w:p>
-      <w:pPr>
-        <w:pStyle w:val="ListParagraph"/>
-        <w:numPr>
-          <w:ilvl w:val="0"/>
-          <w:numId w:val="1"/>
-        </w:numPr>
-        <w:spacing w:after="60"/>
-      </w:pPr>
-      <w:r>
-        <w:rPr>
-          <w:rFonts w:ascii="Calibri" w:cs="Calibri" w:eastAsia="Calibri" w:hAnsi="Calibri"/>
-          <w:color w:val="BBBBCC"/>
-          <w:sz w:val="21"/>
-          <w:szCs w:val="21"/>
-        </w:rPr>
-        <w:t xml:space="preserve">kpiLinkage — semicolon-separated KPI names affected by this SHEI</w:t>
+        <w:t xml:space="preserve">contradictions — explicit mismatches: "Revenue +2.8% but Volume -0.7% = premiumisation masking unit decline"</w:t>
+      </w:r>
+    </w:p>
+    <w:p>
+      <w:pPr>
+        <w:pStyle w:val="ListParagraph"/>
+        <w:numPr>
+          <w:ilvl w:val="0"/>
+          <w:numId w:val="1"/>
+        </w:numPr>
+        <w:spacing w:after="60"/>
+      </w:pPr>
+      <w:r>
+        <w:rPr>
+          <w:rFonts w:ascii="Calibri" w:cs="Calibri" w:eastAsia="Calibri" w:hAnsi="Calibri"/>
+          <w:color w:val="BBBBCC"/>
+          <w:sz w:val="21"/>
+          <w:szCs w:val="21"/>
+        </w:rPr>
+        <w:t xml:space="preserve">clientImplication, thoucentriqAngle — with timeline (weeks) and Rs.Cr/EUR M fee range</w:t>
+      </w:r>
+    </w:p>
+    <w:p>
+      <w:pPr>
+        <w:pStyle w:val="ListParagraph"/>
+        <w:numPr>
+          <w:ilvl w:val="0"/>
+          <w:numId w:val="1"/>
+        </w:numPr>
+        <w:spacing w:after="60"/>
+      </w:pPr>
+      <w:r>
+        <w:rPr>
+          <w:rFonts w:ascii="Calibri" w:cs="Calibri" w:eastAsia="Calibri" w:hAnsi="Calibri"/>
+          <w:color w:val="BBBBCC"/>
+          <w:sz w:val="21"/>
+          <w:szCs w:val="21"/>
+        </w:rPr>
+        <w:t xml:space="preserve">kpiLinkage — semicolon-separated KPI names affected</w:t>
       </w:r>
     </w:p>
     <w:p>
@@ -1281,7 +1281,7 @@
           <w:sz w:val="21"/>
           <w:szCs w:val="21"/>
         </w:rPr>
-        <w:t xml:space="preserve">financialImpact — ₹Cr or €M quantified impact with calculation logic</w:t>
+        <w:t xml:space="preserve">financialImpact — Rs.Cr or EUR M quantified impact with calculation logic</w:t>
       </w:r>
     </w:p>
     <w:p>
@@ -1487,7 +1487,7 @@
           <w:sz w:val="21"/>
           <w:szCs w:val="21"/>
         </w:rPr>
-        <w:t xml:space="preserve">pastState — what was true 6-12 months ago (required for trajectory rendering)</w:t>
+        <w:t xml:space="preserve">pastState — what was true 6-12 months ago (required for trajectory)</w:t>
       </w:r>
     </w:p>
     <w:p>
@@ -1579,7 +1579,7 @@
           <w:sz w:val="21"/>
           <w:szCs w:val="21"/>
         </w:rPr>
-        <w:t xml:space="preserve">unit — "%", "days", "x", "Score (1-5)", "₹ Cr / person"</w:t>
+        <w:t xml:space="preserve">unit — "%", "days", "x", "Score (1-5)", "Rs. Cr / person"</w:t>
       </w:r>
     </w:p>
     <w:p>
@@ -1838,7 +1838,7 @@
           <w:sz w:val="40"/>
           <w:szCs w:val="40"/>
         </w:rPr>
-        <w:t xml:space="preserve">4. DATA SEEDING STRATEGY</w:t>
+        <w:t xml:space="preserve">4. DATA SEEDING — UNCONDITIONAL (No Guard Logic)</w:t>
       </w:r>
     </w:p>
     <w:p>
@@ -1852,107 +1852,7 @@
           <w:sz w:val="22"/>
           <w:szCs w:val="22"/>
         </w:rPr>
-        <w:t xml:space="preserve">Seed file: artifacts/api-server/src/routes/seed.ts (~2,385 lines as of May 2025). Full dataset baked-in. Reseed is idempotent: clears and re-inserts all rows in dependency order.</w:t>
-      </w:r>
-    </w:p>
-    <w:p>
-      <w:pPr>
-        <w:spacing w:after="80"/>
-      </w:pPr>
-      <w:r>
-        <w:rPr>
-          <w:rFonts w:ascii="Calibri" w:cs="Calibri" w:eastAsia="Calibri" w:hAnsi="Calibri"/>
-          <w:b/>
-          <w:bCs/>
-          <w:color w:val="9999FF"/>
-          <w:sz w:val="22"/>
-          <w:szCs w:val="22"/>
-        </w:rPr>
-        <w:t xml:space="preserve">Seed guard: </w:t>
-      </w:r>
-      <w:r>
-        <w:rPr>
-          <w:rFonts w:ascii="Calibri" w:cs="Calibri" w:eastAsia="Calibri" w:hAnsi="Calibri"/>
-          <w:color w:val="CCCCDD"/>
-          <w:sz w:val="22"/>
-          <w:szCs w:val="22"/>
-        </w:rPr>
-        <w:t xml:space="preserve">if (existingCompanies.length &gt;= 15 &amp;&amp; !force) return — blocks accidental cold-start reseed</w:t>
-      </w:r>
-    </w:p>
-    <w:p>
-      <w:pPr>
-        <w:spacing w:after="80"/>
-      </w:pPr>
-      <w:r>
-        <w:rPr>
-          <w:rFonts w:ascii="Calibri" w:cs="Calibri" w:eastAsia="Calibri" w:hAnsi="Calibri"/>
-          <w:b/>
-          <w:bCs/>
-          <w:color w:val="9999FF"/>
-          <w:sz w:val="22"/>
-          <w:szCs w:val="22"/>
-        </w:rPr>
-        <w:t xml:space="preserve">Admin override: </w:t>
-      </w:r>
-      <w:r>
-        <w:rPr>
-          <w:rFonts w:ascii="Calibri" w:cs="Calibri" w:eastAsia="Calibri" w:hAnsi="Calibri"/>
-          <w:color w:val="CCCCDD"/>
-          <w:sz w:val="22"/>
-          <w:szCs w:val="22"/>
-        </w:rPr>
-        <w:t xml:space="preserve">POST /api/admin/reseed → seedDatabase(db, true) — force=true bypasses guard</w:t>
-      </w:r>
-    </w:p>
-    <w:p>
-      <w:pPr>
-        <w:spacing w:after="80"/>
-      </w:pPr>
-      <w:r>
-        <w:rPr>
-          <w:rFonts w:ascii="Calibri" w:cs="Calibri" w:eastAsia="Calibri" w:hAnsi="Calibri"/>
-          <w:b/>
-          <w:bCs/>
-          <w:color w:val="9999FF"/>
-          <w:sz w:val="22"/>
-          <w:szCs w:val="22"/>
-        </w:rPr>
-        <w:t xml:space="preserve">Clear order: </w:t>
-      </w:r>
-      <w:r>
-        <w:rPr>
-          <w:rFonts w:ascii="Calibri" w:cs="Calibri" w:eastAsia="Calibri" w:hAnsi="Calibri"/>
-          <w:color w:val="CCCCDD"/>
-          <w:sz w:val="22"/>
-          <w:szCs w:val="22"/>
-        </w:rPr>
-        <w:t xml:space="preserve">DELETE companies → shei_cards → signals → benchmarks → playbooks</w:t>
-      </w:r>
-    </w:p>
-    <w:p>
-      <w:pPr>
-        <w:spacing w:after="80"/>
-      </w:pPr>
-      <w:r>
-        <w:rPr>
-          <w:rFonts w:ascii="Calibri" w:cs="Calibri" w:eastAsia="Calibri" w:hAnsi="Calibri"/>
-          <w:b/>
-          <w:bCs/>
-          <w:color w:val="9999FF"/>
-          <w:sz w:val="22"/>
-          <w:szCs w:val="22"/>
-        </w:rPr>
-        <w:t xml:space="preserve">Insert order: </w:t>
-      </w:r>
-      <w:r>
-        <w:rPr>
-          <w:rFonts w:ascii="Calibri" w:cs="Calibri" w:eastAsia="Calibri" w:hAnsi="Calibri"/>
-          <w:color w:val="CCCCDD"/>
-          <w:sz w:val="22"/>
-          <w:szCs w:val="22"/>
-        </w:rPr>
-        <w:t xml:space="preserve">companies → shei_cards → signals → benchmarks → playbooks</w:t>
+        <w:t xml:space="preserve">Seed file: artifacts/api-server/src/routes/seed.ts (~2,385 lines as of May 2025). Full dataset baked-in. Seeding is unconditional — it always clears all rows and re-inserts the full dataset with no checks or limits.</w:t>
       </w:r>
     </w:p>
     <w:p>
@@ -1968,102 +1868,274 @@
           <w:sz w:val="28"/>
           <w:szCs w:val="28"/>
         </w:rPr>
-        <w:t xml:space="preserve">Current Data Counts (May 2025)</w:t>
-      </w:r>
-    </w:p>
-    <w:p>
-      <w:pPr>
-        <w:pStyle w:val="ListParagraph"/>
-        <w:numPr>
-          <w:ilvl w:val="0"/>
-          <w:numId w:val="1"/>
-        </w:numPr>
-        <w:spacing w:after="60"/>
-      </w:pPr>
-      <w:r>
-        <w:rPr>
-          <w:rFonts w:ascii="Calibri" w:cs="Calibri" w:eastAsia="Calibri" w:hAnsi="Calibri"/>
-          <w:color w:val="BBBBCC"/>
-          <w:sz w:val="21"/>
-          <w:szCs w:val="21"/>
-        </w:rPr>
-        <w:t xml:space="preserve">Companies: 36</w:t>
-      </w:r>
-    </w:p>
-    <w:p>
-      <w:pPr>
-        <w:pStyle w:val="ListParagraph"/>
-        <w:numPr>
-          <w:ilvl w:val="0"/>
-          <w:numId w:val="1"/>
-        </w:numPr>
-        <w:spacing w:after="60"/>
-      </w:pPr>
-      <w:r>
-        <w:rPr>
-          <w:rFonts w:ascii="Calibri" w:cs="Calibri" w:eastAsia="Calibri" w:hAnsi="Calibri"/>
-          <w:color w:val="BBBBCC"/>
-          <w:sz w:val="21"/>
-          <w:szCs w:val="21"/>
-        </w:rPr>
-        <w:t xml:space="preserve">SHEI Cards: 15 (7 original + 8 Q2-2025 expansion)</w:t>
-      </w:r>
-    </w:p>
-    <w:p>
-      <w:pPr>
-        <w:pStyle w:val="ListParagraph"/>
-        <w:numPr>
-          <w:ilvl w:val="0"/>
-          <w:numId w:val="1"/>
-        </w:numPr>
-        <w:spacing w:after="60"/>
-      </w:pPr>
-      <w:r>
-        <w:rPr>
-          <w:rFonts w:ascii="Calibri" w:cs="Calibri" w:eastAsia="Calibri" w:hAnsi="Calibri"/>
-          <w:color w:val="BBBBCC"/>
-          <w:sz w:val="21"/>
-          <w:szCs w:val="21"/>
-        </w:rPr>
-        <w:t xml:space="preserve">Signals: 39 (15 original + 24 batch-2, all Q4 FY25 / Q1 FY26)</w:t>
-      </w:r>
-    </w:p>
-    <w:p>
-      <w:pPr>
-        <w:pStyle w:val="ListParagraph"/>
-        <w:numPr>
-          <w:ilvl w:val="0"/>
-          <w:numId w:val="1"/>
-        </w:numPr>
-        <w:spacing w:after="60"/>
-      </w:pPr>
-      <w:r>
-        <w:rPr>
-          <w:rFonts w:ascii="Calibri" w:cs="Calibri" w:eastAsia="Calibri" w:hAnsi="Calibri"/>
-          <w:color w:val="BBBBCC"/>
-          <w:sz w:val="21"/>
-          <w:szCs w:val="21"/>
-        </w:rPr>
-        <w:t xml:space="preserve">Benchmarks: 24 (15 original + 9 new KPI categories)</w:t>
-      </w:r>
-    </w:p>
-    <w:p>
-      <w:pPr>
-        <w:pStyle w:val="ListParagraph"/>
-        <w:numPr>
-          <w:ilvl w:val="0"/>
-          <w:numId w:val="1"/>
-        </w:numPr>
-        <w:spacing w:after="60"/>
-      </w:pPr>
-      <w:r>
-        <w:rPr>
-          <w:rFonts w:ascii="Calibri" w:cs="Calibri" w:eastAsia="Calibri" w:hAnsi="Calibri"/>
-          <w:color w:val="BBBBCC"/>
-          <w:sz w:val="21"/>
-          <w:szCs w:val="21"/>
-        </w:rPr>
-        <w:t xml:space="preserve">Playbooks: 10 (5 original + 5 new engagement blueprints)</w:t>
+        <w:t xml:space="preserve">4a. Seeding Behaviour (v3.0 — Guard Removed)</w:t>
+      </w:r>
+    </w:p>
+    <w:p>
+      <w:pPr>
+        <w:spacing w:after="80"/>
+        <w:ind w:left="360"/>
+      </w:pPr>
+      <w:r>
+        <w:rPr>
+          <w:rFonts w:ascii="Calibri" w:cs="Calibri" w:eastAsia="Calibri" w:hAnsi="Calibri"/>
+          <w:color w:val="55EE99"/>
+          <w:sz w:val="20"/>
+          <w:szCs w:val="20"/>
+        </w:rPr>
+        <w:t xml:space="preserve">✓  seedDatabase() — no parameters, no force flag, no row-count check</w:t>
+      </w:r>
+    </w:p>
+    <w:p>
+      <w:pPr>
+        <w:spacing w:after="80"/>
+        <w:ind w:left="360"/>
+      </w:pPr>
+      <w:r>
+        <w:rPr>
+          <w:rFonts w:ascii="Calibri" w:cs="Calibri" w:eastAsia="Calibri" w:hAnsi="Calibri"/>
+          <w:color w:val="55EE99"/>
+          <w:sz w:val="20"/>
+          <w:szCs w:val="20"/>
+        </w:rPr>
+        <w:t xml:space="preserve">✓  Runs unconditionally on every server startup (app.ts)</w:t>
+      </w:r>
+    </w:p>
+    <w:p>
+      <w:pPr>
+        <w:spacing w:after="80"/>
+        <w:ind w:left="360"/>
+      </w:pPr>
+      <w:r>
+        <w:rPr>
+          <w:rFonts w:ascii="Calibri" w:cs="Calibri" w:eastAsia="Calibri" w:hAnsi="Calibri"/>
+          <w:color w:val="55EE99"/>
+          <w:sz w:val="20"/>
+          <w:szCs w:val="20"/>
+        </w:rPr>
+        <w:t xml:space="preserve">✓  Runs unconditionally on every POST /api/admin/reseed ("Refresh Data" button)</w:t>
+      </w:r>
+    </w:p>
+    <w:p>
+      <w:pPr>
+        <w:spacing w:after="80"/>
+        <w:ind w:left="360"/>
+      </w:pPr>
+      <w:r>
+        <w:rPr>
+          <w:rFonts w:ascii="Calibri" w:cs="Calibri" w:eastAsia="Calibri" w:hAnsi="Calibri"/>
+          <w:color w:val="55EE99"/>
+          <w:sz w:val="20"/>
+          <w:szCs w:val="20"/>
+        </w:rPr>
+        <w:t xml:space="preserve">✓  No data volume limits — seed as many companies, signals, SHEI cards, benchmarks, and playbooks as needed</w:t>
+      </w:r>
+    </w:p>
+    <w:p>
+      <w:pPr>
+        <w:spacing w:after="120"/>
+      </w:pPr>
+      <w:r>
+        <w:rPr>
+          <w:rFonts w:ascii="Calibri" w:cs="Calibri" w:eastAsia="Calibri" w:hAnsi="Calibri"/>
+          <w:color w:val="CCCCDD"/>
+          <w:sz w:val="22"/>
+          <w:szCs w:val="22"/>
+        </w:rPr>
+        <w:t xml:space="preserve">Seed function signature:</w:t>
+      </w:r>
+    </w:p>
+    <w:p>
+      <w:pPr>
+        <w:spacing w:after="40" w:before="40"/>
+        <w:ind w:left="400"/>
+      </w:pPr>
+      <w:r>
+        <w:rPr>
+          <w:rFonts w:ascii="Courier New" w:cs="Courier New" w:eastAsia="Courier New" w:hAnsi="Courier New"/>
+          <w:color w:val="55DD55"/>
+          <w:sz w:val="18"/>
+          <w:szCs w:val="18"/>
+        </w:rPr>
+        <w:t xml:space="preserve">export async function seedDatabase() {</w:t>
+      </w:r>
+    </w:p>
+    <w:p>
+      <w:pPr>
+        <w:spacing w:after="40" w:before="40"/>
+        <w:ind w:left="400"/>
+      </w:pPr>
+      <w:r>
+        <w:rPr>
+          <w:rFonts w:ascii="Courier New" w:cs="Courier New" w:eastAsia="Courier New" w:hAnsi="Courier New"/>
+          <w:color w:val="55DD55"/>
+          <w:sz w:val="18"/>
+          <w:szCs w:val="18"/>
+        </w:rPr>
+        <w:t xml:space="preserve">  // Clear all existing data</w:t>
+      </w:r>
+    </w:p>
+    <w:p>
+      <w:pPr>
+        <w:spacing w:after="40" w:before="40"/>
+        <w:ind w:left="400"/>
+      </w:pPr>
+      <w:r>
+        <w:rPr>
+          <w:rFonts w:ascii="Courier New" w:cs="Courier New" w:eastAsia="Courier New" w:hAnsi="Courier New"/>
+          <w:color w:val="55DD55"/>
+          <w:sz w:val="18"/>
+          <w:szCs w:val="18"/>
+        </w:rPr>
+        <w:t xml:space="preserve">  await db.delete(signalsTable);</w:t>
+      </w:r>
+    </w:p>
+    <w:p>
+      <w:pPr>
+        <w:spacing w:after="40" w:before="40"/>
+        <w:ind w:left="400"/>
+      </w:pPr>
+      <w:r>
+        <w:rPr>
+          <w:rFonts w:ascii="Courier New" w:cs="Courier New" w:eastAsia="Courier New" w:hAnsi="Courier New"/>
+          <w:color w:val="55DD55"/>
+          <w:sz w:val="18"/>
+          <w:szCs w:val="18"/>
+        </w:rPr>
+        <w:t xml:space="preserve">  await db.delete(sheiCardsTable);</w:t>
+      </w:r>
+    </w:p>
+    <w:p>
+      <w:pPr>
+        <w:spacing w:after="40" w:before="40"/>
+        <w:ind w:left="400"/>
+      </w:pPr>
+      <w:r>
+        <w:rPr>
+          <w:rFonts w:ascii="Courier New" w:cs="Courier New" w:eastAsia="Courier New" w:hAnsi="Courier New"/>
+          <w:color w:val="55DD55"/>
+          <w:sz w:val="18"/>
+          <w:szCs w:val="18"/>
+        </w:rPr>
+        <w:t xml:space="preserve">  await db.delete(benchmarksTable);</w:t>
+      </w:r>
+    </w:p>
+    <w:p>
+      <w:pPr>
+        <w:spacing w:after="40" w:before="40"/>
+        <w:ind w:left="400"/>
+      </w:pPr>
+      <w:r>
+        <w:rPr>
+          <w:rFonts w:ascii="Courier New" w:cs="Courier New" w:eastAsia="Courier New" w:hAnsi="Courier New"/>
+          <w:color w:val="55DD55"/>
+          <w:sz w:val="18"/>
+          <w:szCs w:val="18"/>
+        </w:rPr>
+        <w:t xml:space="preserve">  await db.delete(playbookSectionsTable);</w:t>
+      </w:r>
+    </w:p>
+    <w:p>
+      <w:pPr>
+        <w:spacing w:after="40" w:before="40"/>
+        <w:ind w:left="400"/>
+      </w:pPr>
+      <w:r>
+        <w:rPr>
+          <w:rFonts w:ascii="Courier New" w:cs="Courier New" w:eastAsia="Courier New" w:hAnsi="Courier New"/>
+          <w:color w:val="55DD55"/>
+          <w:sz w:val="18"/>
+          <w:szCs w:val="18"/>
+        </w:rPr>
+        <w:t xml:space="preserve">  await db.delete(companiesTable);</w:t>
+      </w:r>
+    </w:p>
+    <w:p>
+      <w:pPr>
+        <w:spacing w:after="40" w:before="40"/>
+        <w:ind w:left="400"/>
+      </w:pPr>
+      <w:r>
+        <w:rPr>
+          <w:rFonts w:ascii="Courier New" w:cs="Courier New" w:eastAsia="Courier New" w:hAnsi="Courier New"/>
+          <w:color w:val="55DD55"/>
+          <w:sz w:val="18"/>
+          <w:szCs w:val="18"/>
+        </w:rPr>
+        <w:t xml:space="preserve">  // Insert full dataset ...</w:t>
+      </w:r>
+    </w:p>
+    <w:p>
+      <w:pPr>
+        <w:spacing w:after="40" w:before="40"/>
+        <w:ind w:left="400"/>
+      </w:pPr>
+      <w:r>
+        <w:rPr>
+          <w:rFonts w:ascii="Courier New" w:cs="Courier New" w:eastAsia="Courier New" w:hAnsi="Courier New"/>
+          <w:color w:val="55DD55"/>
+          <w:sz w:val="18"/>
+          <w:szCs w:val="18"/>
+        </w:rPr>
+        <w:t xml:space="preserve">}</w:t>
+      </w:r>
+    </w:p>
+    <w:p>
+      <w:pPr>
+        <w:spacing w:after="120"/>
+      </w:pPr>
+      <w:r>
+        <w:rPr>
+          <w:rFonts w:ascii="Calibri" w:cs="Calibri" w:eastAsia="Calibri" w:hAnsi="Calibri"/>
+          <w:color w:val="CCCCDD"/>
+          <w:sz w:val="22"/>
+          <w:szCs w:val="22"/>
+        </w:rPr>
+        <w:t xml:space="preserve">app.ts startup call:</w:t>
+      </w:r>
+    </w:p>
+    <w:p>
+      <w:pPr>
+        <w:spacing w:after="40" w:before="40"/>
+        <w:ind w:left="400"/>
+      </w:pPr>
+      <w:r>
+        <w:rPr>
+          <w:rFonts w:ascii="Courier New" w:cs="Courier New" w:eastAsia="Courier New" w:hAnsi="Courier New"/>
+          <w:color w:val="55DD55"/>
+          <w:sz w:val="18"/>
+          <w:szCs w:val="18"/>
+        </w:rPr>
+        <w:t xml:space="preserve">seedDatabase().catch((err) =&gt; { logger.error({ err }, "Failed to seed database"); });</w:t>
+      </w:r>
+    </w:p>
+    <w:p>
+      <w:pPr>
+        <w:spacing w:after="120"/>
+      </w:pPr>
+      <w:r>
+        <w:rPr>
+          <w:rFonts w:ascii="Calibri" w:cs="Calibri" w:eastAsia="Calibri" w:hAnsi="Calibri"/>
+          <w:color w:val="CCCCDD"/>
+          <w:sz w:val="22"/>
+          <w:szCs w:val="22"/>
+        </w:rPr>
+        <w:t xml:space="preserve">admin.ts reseed route:</w:t>
+      </w:r>
+    </w:p>
+    <w:p>
+      <w:pPr>
+        <w:spacing w:after="40" w:before="40"/>
+        <w:ind w:left="400"/>
+      </w:pPr>
+      <w:r>
+        <w:rPr>
+          <w:rFonts w:ascii="Courier New" w:cs="Courier New" w:eastAsia="Courier New" w:hAnsi="Courier New"/>
+          <w:color w:val="55DD55"/>
+          <w:sz w:val="18"/>
+          <w:szCs w:val="18"/>
+        </w:rPr>
+        <w:t xml:space="preserve">await seedDatabase();</w:t>
       </w:r>
     </w:p>
     <w:p>
@@ -2079,63 +2151,121 @@
           <w:sz w:val="28"/>
           <w:szCs w:val="28"/>
         </w:rPr>
-        <w:t xml:space="preserve">Company Universe (36)</w:t>
-      </w:r>
-    </w:p>
-    <w:p>
-      <w:pPr>
-        <w:spacing w:after="120"/>
-      </w:pPr>
-      <w:r>
-        <w:rPr>
-          <w:rFonts w:ascii="Calibri" w:cs="Calibri" w:eastAsia="Calibri" w:hAnsi="Calibri"/>
-          <w:color w:val="CCCCDD"/>
-          <w:sz w:val="22"/>
-          <w:szCs w:val="22"/>
-        </w:rPr>
-        <w:t xml:space="preserve">India-listed FMCG (18): HUL, Nestlé India, ITC, Marico, Dabur, Britannia, Godrej Consumer Products, Colgate India, Emami, Tata Consumer Products, Bikaji Foods, Honasa/Mamaearth, Patanjali, Varun Beverages (HCCB), Jyothy Labs, Zydus Wellness, CCL Products, Heritage Foods</w:t>
-      </w:r>
-    </w:p>
-    <w:p>
-      <w:pPr>
-        <w:spacing w:after="120"/>
-      </w:pPr>
-      <w:r>
-        <w:rPr>
-          <w:rFonts w:ascii="Calibri" w:cs="Calibri" w:eastAsia="Calibri" w:hAnsi="Calibri"/>
-          <w:color w:val="CCCCDD"/>
-          <w:sz w:val="22"/>
-          <w:szCs w:val="22"/>
-        </w:rPr>
-        <w:t xml:space="preserve">India unlisted/cooperative (4): Amul (GCMMF), Haldiram's, Wagh Bakri, MDH Spices</w:t>
-      </w:r>
-    </w:p>
-    <w:p>
-      <w:pPr>
-        <w:spacing w:after="120"/>
-      </w:pPr>
-      <w:r>
-        <w:rPr>
-          <w:rFonts w:ascii="Calibri" w:cs="Calibri" w:eastAsia="Calibri" w:hAnsi="Calibri"/>
-          <w:color w:val="CCCCDD"/>
-          <w:sz w:val="22"/>
-          <w:szCs w:val="22"/>
-        </w:rPr>
-        <w:t xml:space="preserve">Global majors with India ops (8): P&amp;G India, Mars India, Reckitt India, Mondelez India, PepsiCo India, HCCB (Coca-Cola India), L'Oreal India, Kenvue India</w:t>
-      </w:r>
-    </w:p>
-    <w:p>
-      <w:pPr>
-        <w:spacing w:after="120"/>
-      </w:pPr>
-      <w:r>
-        <w:rPr>
-          <w:rFonts w:ascii="Calibri" w:cs="Calibri" w:eastAsia="Calibri" w:hAnsi="Calibri"/>
-          <w:color w:val="CCCCDD"/>
-          <w:sz w:val="22"/>
-          <w:szCs w:val="22"/>
-        </w:rPr>
-        <w:t xml:space="preserve">Global FMCG (6): Unilever (global), Nestlé S.A. (global), Ekaterra/Lipton, Goodricke Group, McLeod Russel/Amalgam, Twinings</w:t>
+        <w:t xml:space="preserve">4b. Seeding Order (FK-safe)</w:t>
+      </w:r>
+    </w:p>
+    <w:p>
+      <w:pPr>
+        <w:pStyle w:val="ListParagraph"/>
+        <w:numPr>
+          <w:ilvl w:val="0"/>
+          <w:numId w:val="1"/>
+        </w:numPr>
+        <w:spacing w:after="60"/>
+      </w:pPr>
+      <w:r>
+        <w:rPr>
+          <w:rFonts w:ascii="Calibri" w:cs="Calibri" w:eastAsia="Calibri" w:hAnsi="Calibri"/>
+          <w:color w:val="BBBBCC"/>
+          <w:sz w:val="21"/>
+          <w:szCs w:val="21"/>
+        </w:rPr>
+        <w:t xml:space="preserve">1. DELETE signals → shei_cards → benchmarks → playbooks → companies</w:t>
+      </w:r>
+    </w:p>
+    <w:p>
+      <w:pPr>
+        <w:pStyle w:val="ListParagraph"/>
+        <w:numPr>
+          <w:ilvl w:val="0"/>
+          <w:numId w:val="1"/>
+        </w:numPr>
+        <w:spacing w:after="60"/>
+      </w:pPr>
+      <w:r>
+        <w:rPr>
+          <w:rFonts w:ascii="Calibri" w:cs="Calibri" w:eastAsia="Calibri" w:hAnsi="Calibri"/>
+          <w:color w:val="BBBBCC"/>
+          <w:sz w:val="21"/>
+          <w:szCs w:val="21"/>
+        </w:rPr>
+        <w:t xml:space="preserve">2. INSERT companies</w:t>
+      </w:r>
+    </w:p>
+    <w:p>
+      <w:pPr>
+        <w:pStyle w:val="ListParagraph"/>
+        <w:numPr>
+          <w:ilvl w:val="0"/>
+          <w:numId w:val="1"/>
+        </w:numPr>
+        <w:spacing w:after="60"/>
+      </w:pPr>
+      <w:r>
+        <w:rPr>
+          <w:rFonts w:ascii="Calibri" w:cs="Calibri" w:eastAsia="Calibri" w:hAnsi="Calibri"/>
+          <w:color w:val="BBBBCC"/>
+          <w:sz w:val="21"/>
+          <w:szCs w:val="21"/>
+        </w:rPr>
+        <w:t xml:space="preserve">3. INSERT shei_cards</w:t>
+      </w:r>
+    </w:p>
+    <w:p>
+      <w:pPr>
+        <w:pStyle w:val="ListParagraph"/>
+        <w:numPr>
+          <w:ilvl w:val="0"/>
+          <w:numId w:val="1"/>
+        </w:numPr>
+        <w:spacing w:after="60"/>
+      </w:pPr>
+      <w:r>
+        <w:rPr>
+          <w:rFonts w:ascii="Calibri" w:cs="Calibri" w:eastAsia="Calibri" w:hAnsi="Calibri"/>
+          <w:color w:val="BBBBCC"/>
+          <w:sz w:val="21"/>
+          <w:szCs w:val="21"/>
+        </w:rPr>
+        <w:t xml:space="preserve">4. INSERT signals</w:t>
+      </w:r>
+    </w:p>
+    <w:p>
+      <w:pPr>
+        <w:pStyle w:val="ListParagraph"/>
+        <w:numPr>
+          <w:ilvl w:val="0"/>
+          <w:numId w:val="1"/>
+        </w:numPr>
+        <w:spacing w:after="60"/>
+      </w:pPr>
+      <w:r>
+        <w:rPr>
+          <w:rFonts w:ascii="Calibri" w:cs="Calibri" w:eastAsia="Calibri" w:hAnsi="Calibri"/>
+          <w:color w:val="BBBBCC"/>
+          <w:sz w:val="21"/>
+          <w:szCs w:val="21"/>
+        </w:rPr>
+        <w:t xml:space="preserve">5. INSERT benchmarks</w:t>
+      </w:r>
+    </w:p>
+    <w:p>
+      <w:pPr>
+        <w:pStyle w:val="ListParagraph"/>
+        <w:numPr>
+          <w:ilvl w:val="0"/>
+          <w:numId w:val="1"/>
+        </w:numPr>
+        <w:spacing w:after="60"/>
+      </w:pPr>
+      <w:r>
+        <w:rPr>
+          <w:rFonts w:ascii="Calibri" w:cs="Calibri" w:eastAsia="Calibri" w:hAnsi="Calibri"/>
+          <w:color w:val="BBBBCC"/>
+          <w:sz w:val="21"/>
+          <w:szCs w:val="21"/>
+        </w:rPr>
+        <w:t xml:space="preserve">6. INSERT playbooks</w:t>
       </w:r>
     </w:p>
     <w:p>
@@ -2151,292 +2281,102 @@
           <w:sz w:val="28"/>
           <w:szCs w:val="28"/>
         </w:rPr>
-        <w:t xml:space="preserve">SHEI Card Topics (15)</w:t>
-      </w:r>
-    </w:p>
-    <w:p>
-      <w:pPr>
-        <w:pStyle w:val="ListParagraph"/>
-        <w:numPr>
-          <w:ilvl w:val="0"/>
-          <w:numId w:val="1"/>
-        </w:numPr>
-        <w:spacing w:after="60"/>
-      </w:pPr>
-      <w:r>
-        <w:rPr>
-          <w:rFonts w:ascii="Calibri" w:cs="Calibri" w:eastAsia="Calibri" w:hAnsi="Calibri"/>
-          <w:color w:val="BBBBCC"/>
-          <w:sz w:val="21"/>
-          <w:szCs w:val="21"/>
-        </w:rPr>
-        <w:t xml:space="preserve">SHEI-2025-Q2-01: Q-Commerce SC Architecture Failure (IMMEDIATE / SUPPLY_CHAIN)</w:t>
-      </w:r>
-    </w:p>
-    <w:p>
-      <w:pPr>
-        <w:pStyle w:val="ListParagraph"/>
-        <w:numPr>
-          <w:ilvl w:val="0"/>
-          <w:numId w:val="1"/>
-        </w:numPr>
-        <w:spacing w:after="60"/>
-      </w:pPr>
-      <w:r>
-        <w:rPr>
-          <w:rFonts w:ascii="Calibri" w:cs="Calibri" w:eastAsia="Calibri" w:hAnsi="Calibri"/>
-          <w:color w:val="BBBBCC"/>
-          <w:sz w:val="21"/>
-          <w:szCs w:val="21"/>
-        </w:rPr>
-        <w:t xml:space="preserve">SHEI-2025-Q2-02: Cocoa &amp; Commodity Procurement Crisis (IMMEDIATE / PROCUREMENT)</w:t>
-      </w:r>
-    </w:p>
-    <w:p>
-      <w:pPr>
-        <w:pStyle w:val="ListParagraph"/>
-        <w:numPr>
-          <w:ilvl w:val="0"/>
-          <w:numId w:val="1"/>
-        </w:numPr>
-        <w:spacing w:after="60"/>
-      </w:pPr>
-      <w:r>
-        <w:rPr>
-          <w:rFonts w:ascii="Calibri" w:cs="Calibri" w:eastAsia="Calibri" w:hAnsi="Calibri"/>
-          <w:color w:val="BBBBCC"/>
-          <w:sz w:val="21"/>
-          <w:szCs w:val="21"/>
-        </w:rPr>
-        <w:t xml:space="preserve">SHEI-2025-Q2-03: India EPR Compliance SC Programme (MEDIUM_TERM / SUPPLY_CHAIN)</w:t>
-      </w:r>
-    </w:p>
-    <w:p>
-      <w:pPr>
-        <w:pStyle w:val="ListParagraph"/>
-        <w:numPr>
-          <w:ilvl w:val="0"/>
-          <w:numId w:val="1"/>
-        </w:numPr>
-        <w:spacing w:after="60"/>
-      </w:pPr>
-      <w:r>
-        <w:rPr>
-          <w:rFonts w:ascii="Calibri" w:cs="Calibri" w:eastAsia="Calibri" w:hAnsi="Calibri"/>
-          <w:color w:val="BBBBCC"/>
-          <w:sz w:val="21"/>
-          <w:szCs w:val="21"/>
-        </w:rPr>
-        <w:t xml:space="preserve">SHEI-2025-Q2-04: D2C to Omnichannel Distribution Transformation (MEDIUM_TERM / DISTRIBUTION_GTM)</w:t>
-      </w:r>
-    </w:p>
-    <w:p>
-      <w:pPr>
-        <w:pStyle w:val="ListParagraph"/>
-        <w:numPr>
-          <w:ilvl w:val="0"/>
-          <w:numId w:val="1"/>
-        </w:numPr>
-        <w:spacing w:after="60"/>
-      </w:pPr>
-      <w:r>
-        <w:rPr>
-          <w:rFonts w:ascii="Calibri" w:cs="Calibri" w:eastAsia="Calibri" w:hAnsi="Calibri"/>
-          <w:color w:val="BBBBCC"/>
-          <w:sz w:val="21"/>
-          <w:szCs w:val="21"/>
-        </w:rPr>
-        <w:t xml:space="preserve">SHEI-2025-Q2-05: AI / GenAI SC Demand Sensing Adoption Gap (STRUCTURAL / IT_TECHNOLOGY)</w:t>
-      </w:r>
-    </w:p>
-    <w:p>
-      <w:pPr>
-        <w:pStyle w:val="ListParagraph"/>
-        <w:numPr>
-          <w:ilvl w:val="0"/>
-          <w:numId w:val="1"/>
-        </w:numPr>
-        <w:spacing w:after="60"/>
-      </w:pPr>
-      <w:r>
-        <w:rPr>
-          <w:rFonts w:ascii="Calibri" w:cs="Calibri" w:eastAsia="Calibri" w:hAnsi="Calibri"/>
-          <w:color w:val="BBBBCC"/>
-          <w:sz w:val="21"/>
-          <w:szCs w:val="21"/>
-        </w:rPr>
-        <w:t xml:space="preserve">SHEI-2025-Q2-06: Tea Origin Diversification — Climate Risk SC Redesign (MEDIUM_TERM / PROCUREMENT)</w:t>
-      </w:r>
-    </w:p>
-    <w:p>
-      <w:pPr>
-        <w:pStyle w:val="ListParagraph"/>
-        <w:numPr>
-          <w:ilvl w:val="0"/>
-          <w:numId w:val="1"/>
-        </w:numPr>
-        <w:spacing w:after="60"/>
-      </w:pPr>
-      <w:r>
-        <w:rPr>
-          <w:rFonts w:ascii="Calibri" w:cs="Calibri" w:eastAsia="Calibri" w:hAnsi="Calibri"/>
-          <w:color w:val="BBBBCC"/>
-          <w:sz w:val="21"/>
-          <w:szCs w:val="21"/>
-        </w:rPr>
-        <w:t xml:space="preserve">SHEI-2025-Q2-07: Post-Carve-Out SC Rebuild — Ekaterra &amp; Kenvue (IMMEDIATE / IT_TECHNOLOGY)</w:t>
-      </w:r>
-    </w:p>
-    <w:p>
-      <w:pPr>
-        <w:pStyle w:val="ListParagraph"/>
-        <w:numPr>
-          <w:ilvl w:val="0"/>
-          <w:numId w:val="1"/>
-        </w:numPr>
-        <w:spacing w:after="60"/>
-      </w:pPr>
-      <w:r>
-        <w:rPr>
-          <w:rFonts w:ascii="Calibri" w:cs="Calibri" w:eastAsia="Calibri" w:hAnsi="Calibri"/>
-          <w:color w:val="BBBBCC"/>
-          <w:sz w:val="21"/>
-          <w:szCs w:val="21"/>
-        </w:rPr>
-        <w:t xml:space="preserve">SHEI-2025-Q2-08: India Rural FMCG Distribution Reinvention (MEDIUM_TERM / DISTRIBUTION_GTM)</w:t>
-      </w:r>
-    </w:p>
-    <w:p>
-      <w:pPr>
-        <w:pStyle w:val="ListParagraph"/>
-        <w:numPr>
-          <w:ilvl w:val="0"/>
-          <w:numId w:val="1"/>
-        </w:numPr>
-        <w:spacing w:after="60"/>
-      </w:pPr>
-      <w:r>
-        <w:rPr>
-          <w:rFonts w:ascii="Calibri" w:cs="Calibri" w:eastAsia="Calibri" w:hAnsi="Calibri"/>
-          <w:color w:val="BBBBCC"/>
-          <w:sz w:val="21"/>
-          <w:szCs w:val="21"/>
-        </w:rPr>
-        <w:t xml:space="preserve">SHEI-2025-Q2-09: GenAI SC Deployment Gap — Announces but Doesn't Execute (MEDIUM_TERM / IT_TECHNOLOGY)</w:t>
-      </w:r>
-    </w:p>
-    <w:p>
-      <w:pPr>
-        <w:pStyle w:val="ListParagraph"/>
-        <w:numPr>
-          <w:ilvl w:val="0"/>
-          <w:numId w:val="1"/>
-        </w:numPr>
-        <w:spacing w:after="60"/>
-      </w:pPr>
-      <w:r>
-        <w:rPr>
-          <w:rFonts w:ascii="Calibri" w:cs="Calibri" w:eastAsia="Calibri" w:hAnsi="Calibri"/>
-          <w:color w:val="BBBBCC"/>
-          <w:sz w:val="21"/>
-          <w:szCs w:val="21"/>
-        </w:rPr>
-        <w:t xml:space="preserve">SHEI-2025-Q2-10: Modern Trade OTIF Penalty Exposure — Rs.2,000 Cr Industry Risk (IMMEDIATE / DISTRIBUTION_GTM)</w:t>
-      </w:r>
-    </w:p>
-    <w:p>
-      <w:pPr>
-        <w:pStyle w:val="ListParagraph"/>
-        <w:numPr>
-          <w:ilvl w:val="0"/>
-          <w:numId w:val="1"/>
-        </w:numPr>
-        <w:spacing w:after="60"/>
-      </w:pPr>
-      <w:r>
-        <w:rPr>
-          <w:rFonts w:ascii="Calibri" w:cs="Calibri" w:eastAsia="Calibri" w:hAnsi="Calibri"/>
-          <w:color w:val="BBBBCC"/>
-          <w:sz w:val="21"/>
-          <w:szCs w:val="21"/>
-        </w:rPr>
-        <w:t xml:space="preserve">SHEI-2025-Q2-11: India Cold Chain Infrastructure Gap — Categories Blocked (STRUCTURAL / SUPPLY_CHAIN)</w:t>
-      </w:r>
-    </w:p>
-    <w:p>
-      <w:pPr>
-        <w:pStyle w:val="ListParagraph"/>
-        <w:numPr>
-          <w:ilvl w:val="0"/>
-          <w:numId w:val="1"/>
-        </w:numPr>
-        <w:spacing w:after="60"/>
-      </w:pPr>
-      <w:r>
-        <w:rPr>
-          <w:rFonts w:ascii="Calibri" w:cs="Calibri" w:eastAsia="Calibri" w:hAnsi="Calibri"/>
-          <w:color w:val="BBBBCC"/>
-          <w:sz w:val="21"/>
-          <w:szCs w:val="21"/>
-        </w:rPr>
-        <w:t xml:space="preserve">SHEI-2025-Q2-12: EPR Compliance as SC Transformation — Rs.4,000 Cr Penalty Overhang (IMMEDIATE / SUPPLY_CHAIN)</w:t>
-      </w:r>
-    </w:p>
-    <w:p>
-      <w:pPr>
-        <w:pStyle w:val="ListParagraph"/>
-        <w:numPr>
-          <w:ilvl w:val="0"/>
-          <w:numId w:val="1"/>
-        </w:numPr>
-        <w:spacing w:after="60"/>
-      </w:pPr>
-      <w:r>
-        <w:rPr>
-          <w:rFonts w:ascii="Calibri" w:cs="Calibri" w:eastAsia="Calibri" w:hAnsi="Calibri"/>
-          <w:color w:val="BBBBCC"/>
-          <w:sz w:val="21"/>
-          <w:szCs w:val="21"/>
-        </w:rPr>
-        <w:t xml:space="preserve">SHEI-2025-Q2-13: India FMCG Salary Inflation — Manufacturing Cost Structural Reset (STRUCTURAL / SUPPLY_CHAIN)</w:t>
-      </w:r>
-    </w:p>
-    <w:p>
-      <w:pPr>
-        <w:pStyle w:val="ListParagraph"/>
-        <w:numPr>
-          <w:ilvl w:val="0"/>
-          <w:numId w:val="1"/>
-        </w:numPr>
-        <w:spacing w:after="60"/>
-      </w:pPr>
-      <w:r>
-        <w:rPr>
-          <w:rFonts w:ascii="Calibri" w:cs="Calibri" w:eastAsia="Calibri" w:hAnsi="Calibri"/>
-          <w:color w:val="BBBBCC"/>
-          <w:sz w:val="21"/>
-          <w:szCs w:val="21"/>
-        </w:rPr>
-        <w:t xml:space="preserve">SHEI-2025-Q2-14: Sales &amp; Distribution Productivity Crisis — Revenue/Person Declining 3 Years (MEDIUM_TERM / SALES_DISTRIBUTION)</w:t>
-      </w:r>
-    </w:p>
-    <w:p>
-      <w:pPr>
-        <w:pStyle w:val="ListParagraph"/>
-        <w:numPr>
-          <w:ilvl w:val="0"/>
-          <w:numId w:val="1"/>
-        </w:numPr>
-        <w:spacing w:after="60"/>
-      </w:pPr>
-      <w:r>
-        <w:rPr>
-          <w:rFonts w:ascii="Calibri" w:cs="Calibri" w:eastAsia="Calibri" w:hAnsi="Calibri"/>
-          <w:color w:val="BBBBCC"/>
-          <w:sz w:val="21"/>
-          <w:szCs w:val="21"/>
-        </w:rPr>
-        <w:t xml:space="preserve">SHEI-2025-Q2-15: Beverage Portfolio Premiumisation SC Mismatch (MEDIUM_TERM / SUPPLY_CHAIN)</w:t>
+        <w:t xml:space="preserve">4c. Current Data Counts (May 2025)</w:t>
+      </w:r>
+    </w:p>
+    <w:p>
+      <w:pPr>
+        <w:pStyle w:val="ListParagraph"/>
+        <w:numPr>
+          <w:ilvl w:val="0"/>
+          <w:numId w:val="1"/>
+        </w:numPr>
+        <w:spacing w:after="60"/>
+      </w:pPr>
+      <w:r>
+        <w:rPr>
+          <w:rFonts w:ascii="Calibri" w:cs="Calibri" w:eastAsia="Calibri" w:hAnsi="Calibri"/>
+          <w:color w:val="BBBBCC"/>
+          <w:sz w:val="21"/>
+          <w:szCs w:val="21"/>
+        </w:rPr>
+        <w:t xml:space="preserve">Companies: 36</w:t>
+      </w:r>
+    </w:p>
+    <w:p>
+      <w:pPr>
+        <w:pStyle w:val="ListParagraph"/>
+        <w:numPr>
+          <w:ilvl w:val="0"/>
+          <w:numId w:val="1"/>
+        </w:numPr>
+        <w:spacing w:after="60"/>
+      </w:pPr>
+      <w:r>
+        <w:rPr>
+          <w:rFonts w:ascii="Calibri" w:cs="Calibri" w:eastAsia="Calibri" w:hAnsi="Calibri"/>
+          <w:color w:val="BBBBCC"/>
+          <w:sz w:val="21"/>
+          <w:szCs w:val="21"/>
+        </w:rPr>
+        <w:t xml:space="preserve">SHEI Cards: 15 (7 original + 8 Q2-2025 expansion)</w:t>
+      </w:r>
+    </w:p>
+    <w:p>
+      <w:pPr>
+        <w:pStyle w:val="ListParagraph"/>
+        <w:numPr>
+          <w:ilvl w:val="0"/>
+          <w:numId w:val="1"/>
+        </w:numPr>
+        <w:spacing w:after="60"/>
+      </w:pPr>
+      <w:r>
+        <w:rPr>
+          <w:rFonts w:ascii="Calibri" w:cs="Calibri" w:eastAsia="Calibri" w:hAnsi="Calibri"/>
+          <w:color w:val="BBBBCC"/>
+          <w:sz w:val="21"/>
+          <w:szCs w:val="21"/>
+        </w:rPr>
+        <w:t xml:space="preserve">Signals: 39 (15 original + 24 batch-2, all Q4 FY25 / Q1 FY26)</w:t>
+      </w:r>
+    </w:p>
+    <w:p>
+      <w:pPr>
+        <w:pStyle w:val="ListParagraph"/>
+        <w:numPr>
+          <w:ilvl w:val="0"/>
+          <w:numId w:val="1"/>
+        </w:numPr>
+        <w:spacing w:after="60"/>
+      </w:pPr>
+      <w:r>
+        <w:rPr>
+          <w:rFonts w:ascii="Calibri" w:cs="Calibri" w:eastAsia="Calibri" w:hAnsi="Calibri"/>
+          <w:color w:val="BBBBCC"/>
+          <w:sz w:val="21"/>
+          <w:szCs w:val="21"/>
+        </w:rPr>
+        <w:t xml:space="preserve">Benchmarks: 24 (15 original + 9 new KPI categories)</w:t>
+      </w:r>
+    </w:p>
+    <w:p>
+      <w:pPr>
+        <w:pStyle w:val="ListParagraph"/>
+        <w:numPr>
+          <w:ilvl w:val="0"/>
+          <w:numId w:val="1"/>
+        </w:numPr>
+        <w:spacing w:after="60"/>
+      </w:pPr>
+      <w:r>
+        <w:rPr>
+          <w:rFonts w:ascii="Calibri" w:cs="Calibri" w:eastAsia="Calibri" w:hAnsi="Calibri"/>
+          <w:color w:val="BBBBCC"/>
+          <w:sz w:val="21"/>
+          <w:szCs w:val="21"/>
+        </w:rPr>
+        <w:t xml:space="preserve">Playbooks: 10 (5 original + 5 new engagement blueprints)</w:t>
       </w:r>
     </w:p>
     <w:p>
@@ -2452,197 +2392,63 @@
           <w:sz w:val="28"/>
           <w:szCs w:val="28"/>
         </w:rPr>
-        <w:t xml:space="preserve">Playbook Topics (10)</w:t>
-      </w:r>
-    </w:p>
-    <w:p>
-      <w:pPr>
-        <w:pStyle w:val="ListParagraph"/>
-        <w:numPr>
-          <w:ilvl w:val="0"/>
-          <w:numId w:val="1"/>
-        </w:numPr>
-        <w:spacing w:after="60"/>
-      </w:pPr>
-      <w:r>
-        <w:rPr>
-          <w:rFonts w:ascii="Calibri" w:cs="Calibri" w:eastAsia="Calibri" w:hAnsi="Calibri"/>
-          <w:color w:val="BBBBCC"/>
-          <w:sz w:val="21"/>
-          <w:szCs w:val="21"/>
-        </w:rPr>
-        <w:t xml:space="preserve">1. Demand Sensing Diagnostic (SUPPLY_CHAIN)</w:t>
-      </w:r>
-    </w:p>
-    <w:p>
-      <w:pPr>
-        <w:pStyle w:val="ListParagraph"/>
-        <w:numPr>
-          <w:ilvl w:val="0"/>
-          <w:numId w:val="1"/>
-        </w:numPr>
-        <w:spacing w:after="60"/>
-      </w:pPr>
-      <w:r>
-        <w:rPr>
-          <w:rFonts w:ascii="Calibri" w:cs="Calibri" w:eastAsia="Calibri" w:hAnsi="Calibri"/>
-          <w:color w:val="BBBBCC"/>
-          <w:sz w:val="21"/>
-          <w:szCs w:val="21"/>
-        </w:rPr>
-        <w:t xml:space="preserve">2. Procurement Maturity Assessment (PROCUREMENT)</w:t>
-      </w:r>
-    </w:p>
-    <w:p>
-      <w:pPr>
-        <w:pStyle w:val="ListParagraph"/>
-        <w:numPr>
-          <w:ilvl w:val="0"/>
-          <w:numId w:val="1"/>
-        </w:numPr>
-        <w:spacing w:after="60"/>
-      </w:pPr>
-      <w:r>
-        <w:rPr>
-          <w:rFonts w:ascii="Calibri" w:cs="Calibri" w:eastAsia="Calibri" w:hAnsi="Calibri"/>
-          <w:color w:val="BBBBCC"/>
-          <w:sz w:val="21"/>
-          <w:szCs w:val="21"/>
-        </w:rPr>
-        <w:t xml:space="preserve">3. Post-Carve-Out SC Readiness Assessment (SUPPLY_CHAIN)</w:t>
-      </w:r>
-    </w:p>
-    <w:p>
-      <w:pPr>
-        <w:pStyle w:val="ListParagraph"/>
-        <w:numPr>
-          <w:ilvl w:val="0"/>
-          <w:numId w:val="1"/>
-        </w:numPr>
-        <w:spacing w:after="60"/>
-      </w:pPr>
-      <w:r>
-        <w:rPr>
-          <w:rFonts w:ascii="Calibri" w:cs="Calibri" w:eastAsia="Calibri" w:hAnsi="Calibri"/>
-          <w:color w:val="BBBBCC"/>
-          <w:sz w:val="21"/>
-          <w:szCs w:val="21"/>
-        </w:rPr>
-        <w:t xml:space="preserve">4. Tea SC Sourcing Diversification (PROCUREMENT)</w:t>
-      </w:r>
-    </w:p>
-    <w:p>
-      <w:pPr>
-        <w:pStyle w:val="ListParagraph"/>
-        <w:numPr>
-          <w:ilvl w:val="0"/>
-          <w:numId w:val="1"/>
-        </w:numPr>
-        <w:spacing w:after="60"/>
-      </w:pPr>
-      <w:r>
-        <w:rPr>
-          <w:rFonts w:ascii="Calibri" w:cs="Calibri" w:eastAsia="Calibri" w:hAnsi="Calibri"/>
-          <w:color w:val="BBBBCC"/>
-          <w:sz w:val="21"/>
-          <w:szCs w:val="21"/>
-        </w:rPr>
-        <w:t xml:space="preserve">5. D2C to Omnichannel GTM Transition (DISTRIBUTION_GTM)</w:t>
-      </w:r>
-    </w:p>
-    <w:p>
-      <w:pPr>
-        <w:pStyle w:val="ListParagraph"/>
-        <w:numPr>
-          <w:ilvl w:val="0"/>
-          <w:numId w:val="1"/>
-        </w:numPr>
-        <w:spacing w:after="60"/>
-      </w:pPr>
-      <w:r>
-        <w:rPr>
-          <w:rFonts w:ascii="Calibri" w:cs="Calibri" w:eastAsia="Calibri" w:hAnsi="Calibri"/>
-          <w:color w:val="BBBBCC"/>
-          <w:sz w:val="21"/>
-          <w:szCs w:val="21"/>
-        </w:rPr>
-        <w:t xml:space="preserve">6. Cold Chain SC Strategy &amp; Design (SUPPLY_CHAIN)</w:t>
-      </w:r>
-    </w:p>
-    <w:p>
-      <w:pPr>
-        <w:pStyle w:val="ListParagraph"/>
-        <w:numPr>
-          <w:ilvl w:val="0"/>
-          <w:numId w:val="1"/>
-        </w:numPr>
-        <w:spacing w:after="60"/>
-      </w:pPr>
-      <w:r>
-        <w:rPr>
-          <w:rFonts w:ascii="Calibri" w:cs="Calibri" w:eastAsia="Calibri" w:hAnsi="Calibri"/>
-          <w:color w:val="BBBBCC"/>
-          <w:sz w:val="21"/>
-          <w:szCs w:val="21"/>
-        </w:rPr>
-        <w:t xml:space="preserve">7. Modern Trade OTIF Penalty Reduction Programme (DISTRIBUTION_GTM)</w:t>
-      </w:r>
-    </w:p>
-    <w:p>
-      <w:pPr>
-        <w:pStyle w:val="ListParagraph"/>
-        <w:numPr>
-          <w:ilvl w:val="0"/>
-          <w:numId w:val="1"/>
-        </w:numPr>
-        <w:spacing w:after="60"/>
-      </w:pPr>
-      <w:r>
-        <w:rPr>
-          <w:rFonts w:ascii="Calibri" w:cs="Calibri" w:eastAsia="Calibri" w:hAnsi="Calibri"/>
-          <w:color w:val="BBBBCC"/>
-          <w:sz w:val="21"/>
-          <w:szCs w:val="21"/>
-        </w:rPr>
-        <w:t xml:space="preserve">8. GenAI SC Readiness &amp; Deployment Programme (IT_TECHNOLOGY)</w:t>
-      </w:r>
-    </w:p>
-    <w:p>
-      <w:pPr>
-        <w:pStyle w:val="ListParagraph"/>
-        <w:numPr>
-          <w:ilvl w:val="0"/>
-          <w:numId w:val="1"/>
-        </w:numPr>
-        <w:spacing w:after="60"/>
-      </w:pPr>
-      <w:r>
-        <w:rPr>
-          <w:rFonts w:ascii="Calibri" w:cs="Calibri" w:eastAsia="Calibri" w:hAnsi="Calibri"/>
-          <w:color w:val="BBBBCC"/>
-          <w:sz w:val="21"/>
-          <w:szCs w:val="21"/>
-        </w:rPr>
-        <w:t xml:space="preserve">9. EPR Compliance Supply Chain Programme (SUPPLY_CHAIN)</w:t>
-      </w:r>
-    </w:p>
-    <w:p>
-      <w:pPr>
-        <w:pStyle w:val="ListParagraph"/>
-        <w:numPr>
-          <w:ilvl w:val="0"/>
-          <w:numId w:val="1"/>
-        </w:numPr>
-        <w:spacing w:after="60"/>
-      </w:pPr>
-      <w:r>
-        <w:rPr>
-          <w:rFonts w:ascii="Calibri" w:cs="Calibri" w:eastAsia="Calibri" w:hAnsi="Calibri"/>
-          <w:color w:val="BBBBCC"/>
-          <w:sz w:val="21"/>
-          <w:szCs w:val="21"/>
-        </w:rPr>
-        <w:t xml:space="preserve">10. Manufacturing Excellence &amp; TPM Programme (SUPPLY_CHAIN)</w:t>
+        <w:t xml:space="preserve">4d. Company Universe (36)</w:t>
+      </w:r>
+    </w:p>
+    <w:p>
+      <w:pPr>
+        <w:spacing w:after="120"/>
+      </w:pPr>
+      <w:r>
+        <w:rPr>
+          <w:rFonts w:ascii="Calibri" w:cs="Calibri" w:eastAsia="Calibri" w:hAnsi="Calibri"/>
+          <w:color w:val="CCCCDD"/>
+          <w:sz w:val="22"/>
+          <w:szCs w:val="22"/>
+        </w:rPr>
+        <w:t xml:space="preserve">India-listed FMCG (18): HUL, Nestlé India, ITC, Marico, Dabur, Britannia, Godrej Consumer Products, Colgate India, Emami, Tata Consumer Products, Bikaji Foods, Honasa/Mamaearth, Patanjali, Varun Beverages (HCCB), Jyothy Labs, Zydus Wellness, CCL Products, Heritage Foods</w:t>
+      </w:r>
+    </w:p>
+    <w:p>
+      <w:pPr>
+        <w:spacing w:after="120"/>
+      </w:pPr>
+      <w:r>
+        <w:rPr>
+          <w:rFonts w:ascii="Calibri" w:cs="Calibri" w:eastAsia="Calibri" w:hAnsi="Calibri"/>
+          <w:color w:val="CCCCDD"/>
+          <w:sz w:val="22"/>
+          <w:szCs w:val="22"/>
+        </w:rPr>
+        <w:t xml:space="preserve">India unlisted/cooperative (4): Amul (GCMMF), Haldiram's, Wagh Bakri, MDH Spices</w:t>
+      </w:r>
+    </w:p>
+    <w:p>
+      <w:pPr>
+        <w:spacing w:after="120"/>
+      </w:pPr>
+      <w:r>
+        <w:rPr>
+          <w:rFonts w:ascii="Calibri" w:cs="Calibri" w:eastAsia="Calibri" w:hAnsi="Calibri"/>
+          <w:color w:val="CCCCDD"/>
+          <w:sz w:val="22"/>
+          <w:szCs w:val="22"/>
+        </w:rPr>
+        <w:t xml:space="preserve">Global majors with India ops (8): P&amp;G India, Mars India, Reckitt India, Mondelez India, PepsiCo India, HCCB (Coca-Cola India), L'Oreal India, Kenvue India</w:t>
+      </w:r>
+    </w:p>
+    <w:p>
+      <w:pPr>
+        <w:spacing w:after="120"/>
+      </w:pPr>
+      <w:r>
+        <w:rPr>
+          <w:rFonts w:ascii="Calibri" w:cs="Calibri" w:eastAsia="Calibri" w:hAnsi="Calibri"/>
+          <w:color w:val="CCCCDD"/>
+          <w:sz w:val="22"/>
+          <w:szCs w:val="22"/>
+        </w:rPr>
+        <w:t xml:space="preserve">Global FMCG (6): Unilever (global), Nestlé S.A. (global), Ekaterra/Lipton, Goodricke Group, McLeod Russel/Amalgam, Twinings</w:t>
       </w:r>
     </w:p>
     <w:p>
@@ -2658,7 +2464,514 @@
           <w:sz w:val="28"/>
           <w:szCs w:val="28"/>
         </w:rPr>
-        <w:t xml:space="preserve">Benchmark KPI Categories (24)</w:t>
+        <w:t xml:space="preserve">4e. SHEI Card Topics (15)</w:t>
+      </w:r>
+    </w:p>
+    <w:p>
+      <w:pPr>
+        <w:pStyle w:val="ListParagraph"/>
+        <w:numPr>
+          <w:ilvl w:val="0"/>
+          <w:numId w:val="1"/>
+        </w:numPr>
+        <w:spacing w:after="60"/>
+      </w:pPr>
+      <w:r>
+        <w:rPr>
+          <w:rFonts w:ascii="Calibri" w:cs="Calibri" w:eastAsia="Calibri" w:hAnsi="Calibri"/>
+          <w:color w:val="BBBBCC"/>
+          <w:sz w:val="21"/>
+          <w:szCs w:val="21"/>
+        </w:rPr>
+        <w:t xml:space="preserve">SHEI-2025-Q2-01: Q-Commerce SC Architecture Failure (IMMEDIATE / SUPPLY_CHAIN)</w:t>
+      </w:r>
+    </w:p>
+    <w:p>
+      <w:pPr>
+        <w:pStyle w:val="ListParagraph"/>
+        <w:numPr>
+          <w:ilvl w:val="0"/>
+          <w:numId w:val="1"/>
+        </w:numPr>
+        <w:spacing w:after="60"/>
+      </w:pPr>
+      <w:r>
+        <w:rPr>
+          <w:rFonts w:ascii="Calibri" w:cs="Calibri" w:eastAsia="Calibri" w:hAnsi="Calibri"/>
+          <w:color w:val="BBBBCC"/>
+          <w:sz w:val="21"/>
+          <w:szCs w:val="21"/>
+        </w:rPr>
+        <w:t xml:space="preserve">SHEI-2025-Q2-02: Cocoa &amp; Commodity Procurement Crisis (IMMEDIATE / PROCUREMENT)</w:t>
+      </w:r>
+    </w:p>
+    <w:p>
+      <w:pPr>
+        <w:pStyle w:val="ListParagraph"/>
+        <w:numPr>
+          <w:ilvl w:val="0"/>
+          <w:numId w:val="1"/>
+        </w:numPr>
+        <w:spacing w:after="60"/>
+      </w:pPr>
+      <w:r>
+        <w:rPr>
+          <w:rFonts w:ascii="Calibri" w:cs="Calibri" w:eastAsia="Calibri" w:hAnsi="Calibri"/>
+          <w:color w:val="BBBBCC"/>
+          <w:sz w:val="21"/>
+          <w:szCs w:val="21"/>
+        </w:rPr>
+        <w:t xml:space="preserve">SHEI-2025-Q2-03: India EPR Compliance SC Programme (MEDIUM_TERM / SUPPLY_CHAIN)</w:t>
+      </w:r>
+    </w:p>
+    <w:p>
+      <w:pPr>
+        <w:pStyle w:val="ListParagraph"/>
+        <w:numPr>
+          <w:ilvl w:val="0"/>
+          <w:numId w:val="1"/>
+        </w:numPr>
+        <w:spacing w:after="60"/>
+      </w:pPr>
+      <w:r>
+        <w:rPr>
+          <w:rFonts w:ascii="Calibri" w:cs="Calibri" w:eastAsia="Calibri" w:hAnsi="Calibri"/>
+          <w:color w:val="BBBBCC"/>
+          <w:sz w:val="21"/>
+          <w:szCs w:val="21"/>
+        </w:rPr>
+        <w:t xml:space="preserve">SHEI-2025-Q2-04: D2C to Omnichannel Distribution Transformation (MEDIUM_TERM / DISTRIBUTION_GTM)</w:t>
+      </w:r>
+    </w:p>
+    <w:p>
+      <w:pPr>
+        <w:pStyle w:val="ListParagraph"/>
+        <w:numPr>
+          <w:ilvl w:val="0"/>
+          <w:numId w:val="1"/>
+        </w:numPr>
+        <w:spacing w:after="60"/>
+      </w:pPr>
+      <w:r>
+        <w:rPr>
+          <w:rFonts w:ascii="Calibri" w:cs="Calibri" w:eastAsia="Calibri" w:hAnsi="Calibri"/>
+          <w:color w:val="BBBBCC"/>
+          <w:sz w:val="21"/>
+          <w:szCs w:val="21"/>
+        </w:rPr>
+        <w:t xml:space="preserve">SHEI-2025-Q2-05: AI / GenAI SC Demand Sensing Adoption Gap (STRUCTURAL / IT_TECHNOLOGY)</w:t>
+      </w:r>
+    </w:p>
+    <w:p>
+      <w:pPr>
+        <w:pStyle w:val="ListParagraph"/>
+        <w:numPr>
+          <w:ilvl w:val="0"/>
+          <w:numId w:val="1"/>
+        </w:numPr>
+        <w:spacing w:after="60"/>
+      </w:pPr>
+      <w:r>
+        <w:rPr>
+          <w:rFonts w:ascii="Calibri" w:cs="Calibri" w:eastAsia="Calibri" w:hAnsi="Calibri"/>
+          <w:color w:val="BBBBCC"/>
+          <w:sz w:val="21"/>
+          <w:szCs w:val="21"/>
+        </w:rPr>
+        <w:t xml:space="preserve">SHEI-2025-Q2-06: Tea Origin Diversification — Climate Risk SC Redesign (MEDIUM_TERM / PROCUREMENT)</w:t>
+      </w:r>
+    </w:p>
+    <w:p>
+      <w:pPr>
+        <w:pStyle w:val="ListParagraph"/>
+        <w:numPr>
+          <w:ilvl w:val="0"/>
+          <w:numId w:val="1"/>
+        </w:numPr>
+        <w:spacing w:after="60"/>
+      </w:pPr>
+      <w:r>
+        <w:rPr>
+          <w:rFonts w:ascii="Calibri" w:cs="Calibri" w:eastAsia="Calibri" w:hAnsi="Calibri"/>
+          <w:color w:val="BBBBCC"/>
+          <w:sz w:val="21"/>
+          <w:szCs w:val="21"/>
+        </w:rPr>
+        <w:t xml:space="preserve">SHEI-2025-Q2-07: Post-Carve-Out SC Rebuild — Ekaterra &amp; Kenvue (IMMEDIATE / IT_TECHNOLOGY)</w:t>
+      </w:r>
+    </w:p>
+    <w:p>
+      <w:pPr>
+        <w:pStyle w:val="ListParagraph"/>
+        <w:numPr>
+          <w:ilvl w:val="0"/>
+          <w:numId w:val="1"/>
+        </w:numPr>
+        <w:spacing w:after="60"/>
+      </w:pPr>
+      <w:r>
+        <w:rPr>
+          <w:rFonts w:ascii="Calibri" w:cs="Calibri" w:eastAsia="Calibri" w:hAnsi="Calibri"/>
+          <w:color w:val="BBBBCC"/>
+          <w:sz w:val="21"/>
+          <w:szCs w:val="21"/>
+        </w:rPr>
+        <w:t xml:space="preserve">SHEI-2025-Q2-08: India Rural FMCG Distribution Reinvention (MEDIUM_TERM / DISTRIBUTION_GTM)</w:t>
+      </w:r>
+    </w:p>
+    <w:p>
+      <w:pPr>
+        <w:pStyle w:val="ListParagraph"/>
+        <w:numPr>
+          <w:ilvl w:val="0"/>
+          <w:numId w:val="1"/>
+        </w:numPr>
+        <w:spacing w:after="60"/>
+      </w:pPr>
+      <w:r>
+        <w:rPr>
+          <w:rFonts w:ascii="Calibri" w:cs="Calibri" w:eastAsia="Calibri" w:hAnsi="Calibri"/>
+          <w:color w:val="BBBBCC"/>
+          <w:sz w:val="21"/>
+          <w:szCs w:val="21"/>
+        </w:rPr>
+        <w:t xml:space="preserve">SHEI-2025-Q2-09: GenAI SC Deployment Gap — Announces but Doesn't Execute (MEDIUM_TERM / IT_TECHNOLOGY)</w:t>
+      </w:r>
+    </w:p>
+    <w:p>
+      <w:pPr>
+        <w:pStyle w:val="ListParagraph"/>
+        <w:numPr>
+          <w:ilvl w:val="0"/>
+          <w:numId w:val="1"/>
+        </w:numPr>
+        <w:spacing w:after="60"/>
+      </w:pPr>
+      <w:r>
+        <w:rPr>
+          <w:rFonts w:ascii="Calibri" w:cs="Calibri" w:eastAsia="Calibri" w:hAnsi="Calibri"/>
+          <w:color w:val="BBBBCC"/>
+          <w:sz w:val="21"/>
+          <w:szCs w:val="21"/>
+        </w:rPr>
+        <w:t xml:space="preserve">SHEI-2025-Q2-10: Modern Trade OTIF Penalty Exposure — Rs.2,000 Cr Industry Risk (IMMEDIATE / DISTRIBUTION_GTM)</w:t>
+      </w:r>
+    </w:p>
+    <w:p>
+      <w:pPr>
+        <w:pStyle w:val="ListParagraph"/>
+        <w:numPr>
+          <w:ilvl w:val="0"/>
+          <w:numId w:val="1"/>
+        </w:numPr>
+        <w:spacing w:after="60"/>
+      </w:pPr>
+      <w:r>
+        <w:rPr>
+          <w:rFonts w:ascii="Calibri" w:cs="Calibri" w:eastAsia="Calibri" w:hAnsi="Calibri"/>
+          <w:color w:val="BBBBCC"/>
+          <w:sz w:val="21"/>
+          <w:szCs w:val="21"/>
+        </w:rPr>
+        <w:t xml:space="preserve">SHEI-2025-Q2-11: India Cold Chain Infrastructure Gap — Categories Blocked (STRUCTURAL / SUPPLY_CHAIN)</w:t>
+      </w:r>
+    </w:p>
+    <w:p>
+      <w:pPr>
+        <w:pStyle w:val="ListParagraph"/>
+        <w:numPr>
+          <w:ilvl w:val="0"/>
+          <w:numId w:val="1"/>
+        </w:numPr>
+        <w:spacing w:after="60"/>
+      </w:pPr>
+      <w:r>
+        <w:rPr>
+          <w:rFonts w:ascii="Calibri" w:cs="Calibri" w:eastAsia="Calibri" w:hAnsi="Calibri"/>
+          <w:color w:val="BBBBCC"/>
+          <w:sz w:val="21"/>
+          <w:szCs w:val="21"/>
+        </w:rPr>
+        <w:t xml:space="preserve">SHEI-2025-Q2-12: EPR Compliance as SC Transformation — Rs.4,000 Cr Penalty Overhang (IMMEDIATE / SUPPLY_CHAIN)</w:t>
+      </w:r>
+    </w:p>
+    <w:p>
+      <w:pPr>
+        <w:pStyle w:val="ListParagraph"/>
+        <w:numPr>
+          <w:ilvl w:val="0"/>
+          <w:numId w:val="1"/>
+        </w:numPr>
+        <w:spacing w:after="60"/>
+      </w:pPr>
+      <w:r>
+        <w:rPr>
+          <w:rFonts w:ascii="Calibri" w:cs="Calibri" w:eastAsia="Calibri" w:hAnsi="Calibri"/>
+          <w:color w:val="BBBBCC"/>
+          <w:sz w:val="21"/>
+          <w:szCs w:val="21"/>
+        </w:rPr>
+        <w:t xml:space="preserve">SHEI-2025-Q2-13: India FMCG Salary Inflation — Manufacturing Cost Structural Reset (STRUCTURAL / SUPPLY_CHAIN)</w:t>
+      </w:r>
+    </w:p>
+    <w:p>
+      <w:pPr>
+        <w:pStyle w:val="ListParagraph"/>
+        <w:numPr>
+          <w:ilvl w:val="0"/>
+          <w:numId w:val="1"/>
+        </w:numPr>
+        <w:spacing w:after="60"/>
+      </w:pPr>
+      <w:r>
+        <w:rPr>
+          <w:rFonts w:ascii="Calibri" w:cs="Calibri" w:eastAsia="Calibri" w:hAnsi="Calibri"/>
+          <w:color w:val="BBBBCC"/>
+          <w:sz w:val="21"/>
+          <w:szCs w:val="21"/>
+        </w:rPr>
+        <w:t xml:space="preserve">SHEI-2025-Q2-14: Sales &amp; Distribution Productivity Crisis — Revenue/Person Declining 3 Years (MEDIUM_TERM / SALES_DISTRIBUTION)</w:t>
+      </w:r>
+    </w:p>
+    <w:p>
+      <w:pPr>
+        <w:pStyle w:val="ListParagraph"/>
+        <w:numPr>
+          <w:ilvl w:val="0"/>
+          <w:numId w:val="1"/>
+        </w:numPr>
+        <w:spacing w:after="60"/>
+      </w:pPr>
+      <w:r>
+        <w:rPr>
+          <w:rFonts w:ascii="Calibri" w:cs="Calibri" w:eastAsia="Calibri" w:hAnsi="Calibri"/>
+          <w:color w:val="BBBBCC"/>
+          <w:sz w:val="21"/>
+          <w:szCs w:val="21"/>
+        </w:rPr>
+        <w:t xml:space="preserve">SHEI-2025-Q2-15: Beverage Portfolio Premiumisation SC Mismatch (MEDIUM_TERM / SUPPLY_CHAIN)</w:t>
+      </w:r>
+    </w:p>
+    <w:p>
+      <w:pPr>
+        <w:spacing w:after="100" w:before="300"/>
+      </w:pPr>
+      <w:r>
+        <w:rPr>
+          <w:rFonts w:ascii="Calibri" w:cs="Calibri" w:eastAsia="Calibri" w:hAnsi="Calibri"/>
+          <w:b/>
+          <w:bCs/>
+          <w:color w:val="CCCCDD"/>
+          <w:sz w:val="28"/>
+          <w:szCs w:val="28"/>
+        </w:rPr>
+        <w:t xml:space="preserve">4f. Playbook Topics (10)</w:t>
+      </w:r>
+    </w:p>
+    <w:p>
+      <w:pPr>
+        <w:pStyle w:val="ListParagraph"/>
+        <w:numPr>
+          <w:ilvl w:val="0"/>
+          <w:numId w:val="1"/>
+        </w:numPr>
+        <w:spacing w:after="60"/>
+      </w:pPr>
+      <w:r>
+        <w:rPr>
+          <w:rFonts w:ascii="Calibri" w:cs="Calibri" w:eastAsia="Calibri" w:hAnsi="Calibri"/>
+          <w:color w:val="BBBBCC"/>
+          <w:sz w:val="21"/>
+          <w:szCs w:val="21"/>
+        </w:rPr>
+        <w:t xml:space="preserve">1. Demand Sensing Diagnostic (SUPPLY_CHAIN)</w:t>
+      </w:r>
+    </w:p>
+    <w:p>
+      <w:pPr>
+        <w:pStyle w:val="ListParagraph"/>
+        <w:numPr>
+          <w:ilvl w:val="0"/>
+          <w:numId w:val="1"/>
+        </w:numPr>
+        <w:spacing w:after="60"/>
+      </w:pPr>
+      <w:r>
+        <w:rPr>
+          <w:rFonts w:ascii="Calibri" w:cs="Calibri" w:eastAsia="Calibri" w:hAnsi="Calibri"/>
+          <w:color w:val="BBBBCC"/>
+          <w:sz w:val="21"/>
+          <w:szCs w:val="21"/>
+        </w:rPr>
+        <w:t xml:space="preserve">2. Procurement Maturity Assessment (PROCUREMENT)</w:t>
+      </w:r>
+    </w:p>
+    <w:p>
+      <w:pPr>
+        <w:pStyle w:val="ListParagraph"/>
+        <w:numPr>
+          <w:ilvl w:val="0"/>
+          <w:numId w:val="1"/>
+        </w:numPr>
+        <w:spacing w:after="60"/>
+      </w:pPr>
+      <w:r>
+        <w:rPr>
+          <w:rFonts w:ascii="Calibri" w:cs="Calibri" w:eastAsia="Calibri" w:hAnsi="Calibri"/>
+          <w:color w:val="BBBBCC"/>
+          <w:sz w:val="21"/>
+          <w:szCs w:val="21"/>
+        </w:rPr>
+        <w:t xml:space="preserve">3. Post-Carve-Out SC Readiness Assessment (SUPPLY_CHAIN)</w:t>
+      </w:r>
+    </w:p>
+    <w:p>
+      <w:pPr>
+        <w:pStyle w:val="ListParagraph"/>
+        <w:numPr>
+          <w:ilvl w:val="0"/>
+          <w:numId w:val="1"/>
+        </w:numPr>
+        <w:spacing w:after="60"/>
+      </w:pPr>
+      <w:r>
+        <w:rPr>
+          <w:rFonts w:ascii="Calibri" w:cs="Calibri" w:eastAsia="Calibri" w:hAnsi="Calibri"/>
+          <w:color w:val="BBBBCC"/>
+          <w:sz w:val="21"/>
+          <w:szCs w:val="21"/>
+        </w:rPr>
+        <w:t xml:space="preserve">4. Tea SC Sourcing Diversification (PROCUREMENT)</w:t>
+      </w:r>
+    </w:p>
+    <w:p>
+      <w:pPr>
+        <w:pStyle w:val="ListParagraph"/>
+        <w:numPr>
+          <w:ilvl w:val="0"/>
+          <w:numId w:val="1"/>
+        </w:numPr>
+        <w:spacing w:after="60"/>
+      </w:pPr>
+      <w:r>
+        <w:rPr>
+          <w:rFonts w:ascii="Calibri" w:cs="Calibri" w:eastAsia="Calibri" w:hAnsi="Calibri"/>
+          <w:color w:val="BBBBCC"/>
+          <w:sz w:val="21"/>
+          <w:szCs w:val="21"/>
+        </w:rPr>
+        <w:t xml:space="preserve">5. D2C to Omnichannel GTM Transition (DISTRIBUTION_GTM)</w:t>
+      </w:r>
+    </w:p>
+    <w:p>
+      <w:pPr>
+        <w:pStyle w:val="ListParagraph"/>
+        <w:numPr>
+          <w:ilvl w:val="0"/>
+          <w:numId w:val="1"/>
+        </w:numPr>
+        <w:spacing w:after="60"/>
+      </w:pPr>
+      <w:r>
+        <w:rPr>
+          <w:rFonts w:ascii="Calibri" w:cs="Calibri" w:eastAsia="Calibri" w:hAnsi="Calibri"/>
+          <w:color w:val="BBBBCC"/>
+          <w:sz w:val="21"/>
+          <w:szCs w:val="21"/>
+        </w:rPr>
+        <w:t xml:space="preserve">6. Cold Chain SC Strategy &amp; Design (SUPPLY_CHAIN)</w:t>
+      </w:r>
+    </w:p>
+    <w:p>
+      <w:pPr>
+        <w:pStyle w:val="ListParagraph"/>
+        <w:numPr>
+          <w:ilvl w:val="0"/>
+          <w:numId w:val="1"/>
+        </w:numPr>
+        <w:spacing w:after="60"/>
+      </w:pPr>
+      <w:r>
+        <w:rPr>
+          <w:rFonts w:ascii="Calibri" w:cs="Calibri" w:eastAsia="Calibri" w:hAnsi="Calibri"/>
+          <w:color w:val="BBBBCC"/>
+          <w:sz w:val="21"/>
+          <w:szCs w:val="21"/>
+        </w:rPr>
+        <w:t xml:space="preserve">7. Modern Trade OTIF Penalty Reduction Programme (DISTRIBUTION_GTM)</w:t>
+      </w:r>
+    </w:p>
+    <w:p>
+      <w:pPr>
+        <w:pStyle w:val="ListParagraph"/>
+        <w:numPr>
+          <w:ilvl w:val="0"/>
+          <w:numId w:val="1"/>
+        </w:numPr>
+        <w:spacing w:after="60"/>
+      </w:pPr>
+      <w:r>
+        <w:rPr>
+          <w:rFonts w:ascii="Calibri" w:cs="Calibri" w:eastAsia="Calibri" w:hAnsi="Calibri"/>
+          <w:color w:val="BBBBCC"/>
+          <w:sz w:val="21"/>
+          <w:szCs w:val="21"/>
+        </w:rPr>
+        <w:t xml:space="preserve">8. GenAI SC Readiness &amp; Deployment Programme (IT_TECHNOLOGY)</w:t>
+      </w:r>
+    </w:p>
+    <w:p>
+      <w:pPr>
+        <w:pStyle w:val="ListParagraph"/>
+        <w:numPr>
+          <w:ilvl w:val="0"/>
+          <w:numId w:val="1"/>
+        </w:numPr>
+        <w:spacing w:after="60"/>
+      </w:pPr>
+      <w:r>
+        <w:rPr>
+          <w:rFonts w:ascii="Calibri" w:cs="Calibri" w:eastAsia="Calibri" w:hAnsi="Calibri"/>
+          <w:color w:val="BBBBCC"/>
+          <w:sz w:val="21"/>
+          <w:szCs w:val="21"/>
+        </w:rPr>
+        <w:t xml:space="preserve">9. EPR Compliance Supply Chain Programme (SUPPLY_CHAIN)</w:t>
+      </w:r>
+    </w:p>
+    <w:p>
+      <w:pPr>
+        <w:pStyle w:val="ListParagraph"/>
+        <w:numPr>
+          <w:ilvl w:val="0"/>
+          <w:numId w:val="1"/>
+        </w:numPr>
+        <w:spacing w:after="60"/>
+      </w:pPr>
+      <w:r>
+        <w:rPr>
+          <w:rFonts w:ascii="Calibri" w:cs="Calibri" w:eastAsia="Calibri" w:hAnsi="Calibri"/>
+          <w:color w:val="BBBBCC"/>
+          <w:sz w:val="21"/>
+          <w:szCs w:val="21"/>
+        </w:rPr>
+        <w:t xml:space="preserve">10. Manufacturing Excellence &amp; TPM Programme (SUPPLY_CHAIN)</w:t>
+      </w:r>
+    </w:p>
+    <w:p>
+      <w:pPr>
+        <w:spacing w:after="100" w:before="300"/>
+      </w:pPr>
+      <w:r>
+        <w:rPr>
+          <w:rFonts w:ascii="Calibri" w:cs="Calibri" w:eastAsia="Calibri" w:hAnsi="Calibri"/>
+          <w:b/>
+          <w:bCs/>
+          <w:color w:val="CCCCDD"/>
+          <w:sz w:val="28"/>
+          <w:szCs w:val="28"/>
+        </w:rPr>
+        <w:t xml:space="preserve">4g. Benchmark KPI Categories (24)</w:t>
       </w:r>
     </w:p>
     <w:p>
@@ -2974,7 +3287,7 @@
           <w:sz w:val="18"/>
           <w:szCs w:val="18"/>
         </w:rPr>
-        <w:t xml:space="preserve">GET  /api/dashboard                   summary stats + ALL signals DESC (no SQL LIMIT)</w:t>
+        <w:t xml:space="preserve">GET  /api/dashboard/summary           aggregate stats</w:t>
       </w:r>
     </w:p>
     <w:p>
@@ -2989,7 +3302,7 @@
           <w:sz w:val="18"/>
           <w:szCs w:val="18"/>
         </w:rPr>
-        <w:t xml:space="preserve">POST /api/ask                         streaming SSE AI chat</w:t>
+        <w:t xml:space="preserve">GET  /api/dashboard/recent-signals    ALL signals ordered DESC by createdAt</w:t>
       </w:r>
     </w:p>
     <w:p>
@@ -3004,7 +3317,22 @@
           <w:sz w:val="18"/>
           <w:szCs w:val="18"/>
         </w:rPr>
-        <w:t xml:space="preserve">POST /api/admin/reseed                force=true reseed trigger</w:t>
+        <w:t xml:space="preserve">POST /api/ask                         streaming SSE AI chat</w:t>
+      </w:r>
+    </w:p>
+    <w:p>
+      <w:pPr>
+        <w:spacing w:after="40" w:before="40"/>
+        <w:ind w:left="400"/>
+      </w:pPr>
+      <w:r>
+        <w:rPr>
+          <w:rFonts w:ascii="Courier New" w:cs="Courier New" w:eastAsia="Courier New" w:hAnsi="Courier New"/>
+          <w:color w:val="55DD55"/>
+          <w:sz w:val="18"/>
+          <w:szCs w:val="18"/>
+        </w:rPr>
+        <w:t xml:space="preserve">POST /api/admin/reseed                unconditional full reseed</w:t>
       </w:r>
     </w:p>
     <w:p>
@@ -3020,7 +3348,7 @@
           <w:sz w:val="28"/>
           <w:szCs w:val="28"/>
         </w:rPr>
-        <w:t xml:space="preserve">POST /api/ask — Streaming SSE Specification</w:t>
+        <w:t xml:space="preserve">POST /api/ask — Streaming SSE</w:t>
       </w:r>
     </w:p>
     <w:p>
@@ -3076,7 +3404,7 @@
           <w:sz w:val="22"/>
           <w:szCs w:val="22"/>
         </w:rPr>
-        <w:t xml:space="preserve">Server flow: (1) Promise.all pulls companies, shei_cards, signals, benchmarks from DB. (2) Builds v3.0 4-agent system prompt with live DB context. (3) openai.chat.completions.create({ model: "gpt-4o", stream: true, max_completion_tokens: 2500 }). (4) for await chunk → res.write(). (5) Error: headers not sent → 500 JSON; headers sent → write error event and end.</w:t>
+        <w:t xml:space="preserve">Server flow: (1) Promise.all pulls companies, shei_cards, signals, benchmarks from DB. (2) Builds v3.0 4-agent system prompt with live DB context. (3) openai.chat.completions.create({ model: "gpt-4o", stream: true, max_completion_tokens: 2500 }). (4) for await chunk → res.write(). (5) Error: headers not sent → 500 JSON; else write error event and end.</w:t>
       </w:r>
     </w:p>
     <w:p>
@@ -3093,7 +3421,7 @@
           <w:sz w:val="20"/>
           <w:szCs w:val="20"/>
         </w:rPr>
-        <w:t xml:space="preserve">⚠  recentSignals in /api/dashboard returns ALL signals ordered DESC by publishedDate. NO SQL LIMIT. Dashboard page slices to first 8. Never add LIMIT in this API route.</w:t>
+        <w:t xml:space="preserve">⚠  recentSignals returns ALL signals ordered DESC — no SQL LIMIT. Dashboard page slices to 8. Never add LIMIT in the API route.</w:t>
       </w:r>
     </w:p>
     <w:p>
@@ -3330,45 +3658,45 @@
           <w:sz w:val="21"/>
           <w:szCs w:val="21"/>
         </w:rPr>
-        <w:t xml:space="preserve">5 clickable stat cards (each links to module): Companies (T1/T2 split), SHEI Hypotheses (immediate count), Live Signals (HIGH count), Benchmarks, Playbooks</w:t>
-      </w:r>
-    </w:p>
-    <w:p>
-      <w:pPr>
-        <w:pStyle w:val="ListParagraph"/>
-        <w:numPr>
-          <w:ilvl w:val="0"/>
-          <w:numId w:val="1"/>
-        </w:numPr>
-        <w:spacing w:after="60"/>
-      </w:pPr>
-      <w:r>
-        <w:rPr>
-          <w:rFonts w:ascii="Calibri" w:cs="Calibri" w:eastAsia="Calibri" w:hAnsi="Calibri"/>
-          <w:color w:val="BBBBCC"/>
-          <w:sz w:val="21"/>
-          <w:szCs w:val="21"/>
-        </w:rPr>
-        <w:t xml:space="preserve">Recent Signals: 8 newest — strength badge, action badge, trajectory arrow (up/down/right), company, quarter</w:t>
-      </w:r>
-    </w:p>
-    <w:p>
-      <w:pPr>
-        <w:pStyle w:val="ListParagraph"/>
-        <w:numPr>
-          <w:ilvl w:val="0"/>
-          <w:numId w:val="1"/>
-        </w:numPr>
-        <w:spacing w:after="60"/>
-      </w:pPr>
-      <w:r>
-        <w:rPr>
-          <w:rFonts w:ascii="Calibri" w:cs="Calibri" w:eastAsia="Calibri" w:hAnsi="Calibri"/>
-          <w:color w:val="BBBBCC"/>
-          <w:sz w:val="21"/>
-          <w:szCs w:val="21"/>
-        </w:rPr>
-        <w:t xml:space="preserve">Active SHEI Cards: ALL where urgency=IMMEDIATE OR status=ACTIVE — urgency badge, functionTag, cardId, financialImpact snippet</w:t>
+        <w:t xml:space="preserve">5 clickable stat cards: Companies (T1/T2 split), SHEI Hypotheses, Live Signals, Benchmarks, Playbooks</w:t>
+      </w:r>
+    </w:p>
+    <w:p>
+      <w:pPr>
+        <w:pStyle w:val="ListParagraph"/>
+        <w:numPr>
+          <w:ilvl w:val="0"/>
+          <w:numId w:val="1"/>
+        </w:numPr>
+        <w:spacing w:after="60"/>
+      </w:pPr>
+      <w:r>
+        <w:rPr>
+          <w:rFonts w:ascii="Calibri" w:cs="Calibri" w:eastAsia="Calibri" w:hAnsi="Calibri"/>
+          <w:color w:val="BBBBCC"/>
+          <w:sz w:val="21"/>
+          <w:szCs w:val="21"/>
+        </w:rPr>
+        <w:t xml:space="preserve">Recent Signals: 8 newest — strength badge, action badge, trajectory arrow, company, quarter</w:t>
+      </w:r>
+    </w:p>
+    <w:p>
+      <w:pPr>
+        <w:pStyle w:val="ListParagraph"/>
+        <w:numPr>
+          <w:ilvl w:val="0"/>
+          <w:numId w:val="1"/>
+        </w:numPr>
+        <w:spacing w:after="60"/>
+      </w:pPr>
+      <w:r>
+        <w:rPr>
+          <w:rFonts w:ascii="Calibri" w:cs="Calibri" w:eastAsia="Calibri" w:hAnsi="Calibri"/>
+          <w:color w:val="BBBBCC"/>
+          <w:sz w:val="21"/>
+          <w:szCs w:val="21"/>
+        </w:rPr>
+        <w:t xml:space="preserve">Active SHEI Cards: ALL where urgency=IMMEDIATE OR status=ACTIVE</w:t>
       </w:r>
     </w:p>
     <w:p>
@@ -3495,45 +3823,45 @@
           <w:sz w:val="21"/>
           <w:szCs w:val="21"/>
         </w:rPr>
-        <w:t xml:space="preserve">Detail — 4-panel SHEI framework: S=Signal (blue), H=Hypothesis (amber), E=Evidence (emerald), I=Implication (indigo)</w:t>
-      </w:r>
-    </w:p>
-    <w:p>
-      <w:pPr>
-        <w:pStyle w:val="ListParagraph"/>
-        <w:numPr>
-          <w:ilvl w:val="0"/>
-          <w:numId w:val="1"/>
-        </w:numPr>
-        <w:spacing w:after="60"/>
-      </w:pPr>
-      <w:r>
-        <w:rPr>
-          <w:rFonts w:ascii="Calibri" w:cs="Calibri" w:eastAsia="Calibri" w:hAnsi="Calibri"/>
-          <w:color w:val="BBBBCC"/>
-          <w:sz w:val="21"/>
-          <w:szCs w:val="21"/>
-        </w:rPr>
-        <w:t xml:space="preserve">v3.0 panels: Contradictions (orange), KPI Linkage (multi-chip), Trajectory (Past→Current→Direction→Inflection), Financial Impact, Why Now, Thoucentric Angle</w:t>
-      </w:r>
-    </w:p>
-    <w:p>
-      <w:pPr>
-        <w:pStyle w:val="ListParagraph"/>
-        <w:numPr>
-          <w:ilvl w:val="0"/>
-          <w:numId w:val="1"/>
-        </w:numPr>
-        <w:spacing w:after="60"/>
-      </w:pPr>
-      <w:r>
-        <w:rPr>
-          <w:rFonts w:ascii="Calibri" w:cs="Calibri" w:eastAsia="Calibri" w:hAnsi="Calibri"/>
-          <w:color w:val="BBBBCC"/>
-          <w:sz w:val="21"/>
-          <w:szCs w:val="21"/>
-        </w:rPr>
-        <w:t xml:space="preserve">Right sidebar: Signal Cluster chips, Related Companies chips, Pitch Anchor, Provocative Question, version + nextReview</w:t>
+        <w:t xml:space="preserve">Detail — 4-panel SHEI: S=Signal (blue), H=Hypothesis (amber), E=Evidence (emerald), I=Implication (indigo)</w:t>
+      </w:r>
+    </w:p>
+    <w:p>
+      <w:pPr>
+        <w:pStyle w:val="ListParagraph"/>
+        <w:numPr>
+          <w:ilvl w:val="0"/>
+          <w:numId w:val="1"/>
+        </w:numPr>
+        <w:spacing w:after="60"/>
+      </w:pPr>
+      <w:r>
+        <w:rPr>
+          <w:rFonts w:ascii="Calibri" w:cs="Calibri" w:eastAsia="Calibri" w:hAnsi="Calibri"/>
+          <w:color w:val="BBBBCC"/>
+          <w:sz w:val="21"/>
+          <w:szCs w:val="21"/>
+        </w:rPr>
+        <w:t xml:space="preserve">v3.0 panels: Contradictions (orange), KPI Linkage (multi-chip), Trajectory, Financial Impact, Why Now, Thoucentric Angle</w:t>
+      </w:r>
+    </w:p>
+    <w:p>
+      <w:pPr>
+        <w:pStyle w:val="ListParagraph"/>
+        <w:numPr>
+          <w:ilvl w:val="0"/>
+          <w:numId w:val="1"/>
+        </w:numPr>
+        <w:spacing w:after="60"/>
+      </w:pPr>
+      <w:r>
+        <w:rPr>
+          <w:rFonts w:ascii="Calibri" w:cs="Calibri" w:eastAsia="Calibri" w:hAnsi="Calibri"/>
+          <w:color w:val="BBBBCC"/>
+          <w:sz w:val="21"/>
+          <w:szCs w:val="21"/>
+        </w:rPr>
+        <w:t xml:space="preserve">Right sidebar: Signal Cluster chips, Related Companies chips, Pitch Anchor, Provocative Question</w:t>
       </w:r>
     </w:p>
     <w:p>
@@ -3749,7 +4077,7 @@
           <w:sz w:val="21"/>
           <w:szCs w:val="21"/>
         </w:rPr>
-        <w:t xml:space="preserve">7 Thoucentric capability chips: Supply Chain Transformation, Demand Forecasting &amp; S&amp;OP, Sales &amp; Distribution Optimization, Finance Transformation, Digital &amp; AI Transformation, Procurement Transformation, Manufacturing Excellence</w:t>
+        <w:t xml:space="preserve">7 Thoucentric capability chips mapped to functionTags</w:t>
       </w:r>
     </w:p>
     <w:p>
@@ -3787,7 +4115,7 @@
           <w:sz w:val="21"/>
           <w:szCs w:val="21"/>
         </w:rPr>
-        <w:t xml:space="preserve">Signal Action Queue: all HIGH + ACT_NOW/INVESTIGATE signals · ALL 24 benchmarks with headers</w:t>
+        <w:t xml:space="preserve">Signal Action Queue + ALL 24 benchmarks with group headers</w:t>
       </w:r>
     </w:p>
     <w:p>
@@ -3860,7 +4188,7 @@
           <w:sz w:val="21"/>
           <w:szCs w:val="21"/>
         </w:rPr>
-        <w:t xml:space="preserve">Empty state: 5 example prompts for instant value. Model: GPT-4o, max 2500 tokens.</w:t>
+        <w:t xml:space="preserve">5 example prompts empty state. Model: GPT-4o, max 2500 tokens.</w:t>
       </w:r>
     </w:p>
     <w:p>
@@ -3895,7 +4223,7 @@
           <w:sz w:val="21"/>
           <w:szCs w:val="21"/>
         </w:rPr>
-        <w:t xml:space="preserve">10 published engagement blueprints: triggerSignals, whyItMatters, failureModes, technologyEnablers, consultingEntryPoints</w:t>
+        <w:t xml:space="preserve">10 published blueprints: triggerSignals, whyItMatters, failureModes, technologyEnablers, consultingEntryPoints</w:t>
       </w:r>
     </w:p>
     <w:p>
@@ -3943,7 +4271,7 @@
           <w:sz w:val="22"/>
           <w:szCs w:val="22"/>
         </w:rPr>
-        <w:t xml:space="preserve">System prompt rebuilt on every /api/ask call by injecting all live DB data via parallel Promise.all. Model: GPT-4o. Token budget: 2,500.</w:t>
+        <w:t xml:space="preserve">System prompt rebuilt on every /api/ask call — all live DB data injected via parallel Promise.all. Model: GPT-4o. Token budget: 2,500.</w:t>
       </w:r>
     </w:p>
     <w:p>
@@ -3959,7 +4287,7 @@
           <w:sz w:val="28"/>
           <w:szCs w:val="28"/>
         </w:rPr>
-        <w:t xml:space="preserve">7a. Four-Agent Architecture (single GPT-4o call, multi-agent reasoning)</w:t>
+        <w:t xml:space="preserve">7a. Four-Agent Architecture</w:t>
       </w:r>
     </w:p>
     <w:p>
@@ -4168,7 +4496,7 @@
           <w:sz w:val="20"/>
           <w:szCs w:val="20"/>
         </w:rPr>
-        <w:t xml:space="preserve">⚠  AI scope is ANY FMCG company worldwide — Kraft Heinz, Diageo, AB InBev, Danone, Beiersdorf, Ferrero, Pernod Ricard, Conagra, Lindt, and all others. DB data is supporting context, NOT scope limitation.</w:t>
+        <w:t xml:space="preserve">⚠  AI scope is ANY FMCG company worldwide — Kraft Heinz, Diageo, AB InBev, Danone, Beiersdorf, Ferrero, Pernod Ricard, Conagra, Lindt, and all others. DB is supporting context, NOT scope limitation.</w:t>
       </w:r>
     </w:p>
     <w:p>
@@ -4279,7 +4607,7 @@
           <w:sz w:val="21"/>
           <w:szCs w:val="21"/>
         </w:rPr>
-        <w:t xml:space="preserve">5. DB company profiles (supporting context — not a scope boundary)</w:t>
+        <w:t xml:space="preserve">5. DB company profiles (supporting context only)</w:t>
       </w:r>
     </w:p>
     <w:p>
@@ -4314,7 +4642,7 @@
           <w:sz w:val="21"/>
           <w:szCs w:val="21"/>
         </w:rPr>
-        <w:t xml:space="preserve">STEP 1 — SIGNAL EXTRACTION: Identify 3-6 relevant signals. Classify COMPANY_SPECIFIC | INDUSTRY_WIDE | MACRO. 2+ aligned signals → auto-generate SHEI hypothesis.</w:t>
+        <w:t xml:space="preserve">STEP 1 — SIGNAL EXTRACTION: Identify 3-6 relevant signals. Classify COMPANY_SPECIFIC | INDUSTRY_WIDE | MACRO. 2+ aligned → auto-generate SHEI.</w:t>
       </w:r>
     </w:p>
     <w:p>
@@ -4371,7 +4699,7 @@
           <w:sz w:val="21"/>
           <w:szCs w:val="21"/>
         </w:rPr>
-        <w:t xml:space="preserve">STEP 4 — VALIDATION: KPI benchmark check (best/median/laggard). 2-3 peer companies. Flag contradictions: Revenue+ Margin- | Inventory+ low demand | Strategy vs execution mismatch.</w:t>
+        <w:t xml:space="preserve">STEP 4 — VALIDATION: KPI benchmark check (best/median/laggard). 2-3 peers. Flag contradictions: Revenue+ Margin- | Inventory+ low demand | Strategy vs execution mismatch.</w:t>
       </w:r>
     </w:p>
     <w:p>
@@ -4444,45 +4772,45 @@
           <w:sz w:val="21"/>
           <w:szCs w:val="21"/>
         </w:rPr>
-        <w:t xml:space="preserve">S1  SIGNALS  What is happening: 3-5 data-backed events, Rs./$/EUR values, classify [COMPANY]/[INDUSTRY]/[MACRO], trajectory: past → current → direction</w:t>
-      </w:r>
-    </w:p>
-    <w:p>
-      <w:pPr>
-        <w:pStyle w:val="ListParagraph"/>
-        <w:numPr>
-          <w:ilvl w:val="0"/>
-          <w:numId w:val="1"/>
-        </w:numPr>
-        <w:spacing w:after="60"/>
-      </w:pPr>
-      <w:r>
-        <w:rPr>
-          <w:rFonts w:ascii="Calibri" w:cs="Calibri" w:eastAsia="Calibri" w:hAnsi="Calibri"/>
-          <w:color w:val="BBBBCC"/>
-          <w:sz w:val="21"/>
-          <w:szCs w:val="21"/>
-        </w:rPr>
-        <w:t xml:space="preserve">S2  PATTERN &amp; INSIGHT  What it means: Non-obvious interpretation. Contradictions explicitly called out. Trajectory: Past (6-12M) → Current → Direction → Inflection point.</w:t>
-      </w:r>
-    </w:p>
-    <w:p>
-      <w:pPr>
-        <w:pStyle w:val="ListParagraph"/>
-        <w:numPr>
-          <w:ilvl w:val="0"/>
-          <w:numId w:val="1"/>
-        </w:numPr>
-        <w:spacing w:after="60"/>
-      </w:pPr>
-      <w:r>
-        <w:rPr>
-          <w:rFonts w:ascii="Calibri" w:cs="Calibri" w:eastAsia="Calibri" w:hAnsi="Calibri"/>
-          <w:color w:val="BBBBCC"/>
-          <w:sz w:val="21"/>
-          <w:szCs w:val="21"/>
-        </w:rPr>
-        <w:t xml:space="preserve">S3  INDUSTRY COMPARISON: 2-3 peers, quantified ("Company A MAPE 9% vs B 22%", never qualitative). WHY leader is ahead.</w:t>
+        <w:t xml:space="preserve">S1  SIGNALS: 3-5 data-backed events, Rs./$/EUR values, classify [COMPANY]/[INDUSTRY]/[MACRO], trajectory past → current → direction</w:t>
+      </w:r>
+    </w:p>
+    <w:p>
+      <w:pPr>
+        <w:pStyle w:val="ListParagraph"/>
+        <w:numPr>
+          <w:ilvl w:val="0"/>
+          <w:numId w:val="1"/>
+        </w:numPr>
+        <w:spacing w:after="60"/>
+      </w:pPr>
+      <w:r>
+        <w:rPr>
+          <w:rFonts w:ascii="Calibri" w:cs="Calibri" w:eastAsia="Calibri" w:hAnsi="Calibri"/>
+          <w:color w:val="BBBBCC"/>
+          <w:sz w:val="21"/>
+          <w:szCs w:val="21"/>
+        </w:rPr>
+        <w:t xml:space="preserve">S2  PATTERN &amp; INSIGHT: Non-obvious interpretation. Contradictions explicitly called out. Trajectory: Past (6-12M) → Current → Direction → Inflection.</w:t>
+      </w:r>
+    </w:p>
+    <w:p>
+      <w:pPr>
+        <w:pStyle w:val="ListParagraph"/>
+        <w:numPr>
+          <w:ilvl w:val="0"/>
+          <w:numId w:val="1"/>
+        </w:numPr>
+        <w:spacing w:after="60"/>
+      </w:pPr>
+      <w:r>
+        <w:rPr>
+          <w:rFonts w:ascii="Calibri" w:cs="Calibri" w:eastAsia="Calibri" w:hAnsi="Calibri"/>
+          <w:color w:val="BBBBCC"/>
+          <w:sz w:val="21"/>
+          <w:szCs w:val="21"/>
+        </w:rPr>
+        <w:t xml:space="preserve">S3  INDUSTRY COMPARISON: 2-3 peers quantified — "Company A MAPE 9% vs B 22%" (never qualitative). WHY leader is ahead.</w:t>
       </w:r>
     </w:p>
     <w:p>
@@ -4964,7 +5292,7 @@
           <w:sz w:val="22"/>
           <w:szCs w:val="22"/>
         </w:rPr>
-        <w:t xml:space="preserve">text-emerald-400 with TrendingUp lucide icon</w:t>
+        <w:t xml:space="preserve">text-emerald-400 (TrendingUp icon)</w:t>
       </w:r>
     </w:p>
     <w:p>
@@ -4989,7 +5317,7 @@
           <w:sz w:val="22"/>
           <w:szCs w:val="22"/>
         </w:rPr>
-        <w:t xml:space="preserve">text-red-400 with TrendingDown lucide icon</w:t>
+        <w:t xml:space="preserve">text-red-400 (TrendingDown icon)</w:t>
       </w:r>
     </w:p>
     <w:p>
@@ -5014,7 +5342,7 @@
           <w:sz w:val="22"/>
           <w:szCs w:val="22"/>
         </w:rPr>
-        <w:t xml:space="preserve">text-gray-400 with Minus lucide icon</w:t>
+        <w:t xml:space="preserve">text-gray-400 (Minus icon)</w:t>
       </w:r>
     </w:p>
     <w:p>
@@ -5121,7 +5449,7 @@
           <w:sz w:val="22"/>
           <w:szCs w:val="22"/>
         </w:rPr>
-        <w:t xml:space="preserve">Page entry animation: </w:t>
+        <w:t xml:space="preserve">Page entry: </w:t>
       </w:r>
       <w:r>
         <w:rPr>
@@ -5146,7 +5474,7 @@
           <w:sz w:val="22"/>
           <w:szCs w:val="22"/>
         </w:rPr>
-        <w:t xml:space="preserve">Max content width: </w:t>
+        <w:t xml:space="preserve">Max width: </w:t>
       </w:r>
       <w:r>
         <w:rPr>
@@ -5206,7 +5534,7 @@
           <w:sz w:val="20"/>
           <w:szCs w:val="20"/>
         </w:rPr>
-        <w:t xml:space="preserve">⚠  These must match exactly between DB schema, seed data, frontend color maps, and API filters. Mismatches cause silent rendering failures.</w:t>
+        <w:t xml:space="preserve">⚠  Must match exactly between DB schema, seed data, frontend color maps, and API filters. Mismatches cause silent rendering failures.</w:t>
       </w:r>
     </w:p>
     <w:p>
@@ -5574,7 +5902,7 @@
           <w:sz w:val="20"/>
           <w:szCs w:val="20"/>
         </w:rPr>
-        <w:t xml:space="preserve">⚠  SHEI urgency is IMMEDIATE not CRITICAL, MEDIUM_TERM not MEDIUM, STRUCTURAL not LOW. urgencyRank and urgencyColor maps use exact string matching — no fallback.</w:t>
+        <w:t xml:space="preserve">⚠  SHEI urgency is IMMEDIATE not CRITICAL, MEDIUM_TERM not MEDIUM, STRUCTURAL not LOW. urgencyRank and urgencyColor maps use exact string matching.</w:t>
       </w:r>
     </w:p>
     <w:p>
@@ -5591,7 +5919,7 @@
           <w:sz w:val="20"/>
           <w:szCs w:val="20"/>
         </w:rPr>
-        <w:t xml:space="preserve">⚠  Dashboard recentSignals: API returns ALL signals ordered DESC — no SQL LIMIT in route. Dashboard page slices to first 8. Adding LIMIT here breaks the dashboard.</w:t>
+        <w:t xml:space="preserve">⚠  Dashboard recentSignals: API returns ALL signals ordered DESC — no SQL LIMIT in route. Dashboard page slices to 8.</w:t>
       </w:r>
     </w:p>
     <w:p>
@@ -5625,7 +5953,7 @@
           <w:sz w:val="20"/>
           <w:szCs w:val="20"/>
         </w:rPr>
-        <w:t xml:space="preserve">⚠  Company detail related signals: plain text match on companyName (no FK join). Must match seed exactly — "All FMCG" not "all fmcg".</w:t>
+        <w:t xml:space="preserve">⚠  Company detail related signals: plain text match on companyName. Must match seed exactly — "All FMCG" not "all fmcg".</w:t>
       </w:r>
     </w:p>
     <w:p>
@@ -5642,7 +5970,7 @@
           <w:sz w:val="20"/>
           <w:szCs w:val="20"/>
         </w:rPr>
-        <w:t xml:space="preserve">⚠  Dashboard SHEI filter is OR not AND: urgency=IMMEDIATE OR status=ACTIVE.</w:t>
+        <w:t xml:space="preserve">⚠  Dashboard SHEI filter is OR: urgency=IMMEDIATE OR status=ACTIVE.</w:t>
       </w:r>
     </w:p>
     <w:p>
@@ -5676,7 +6004,7 @@
           <w:sz w:val="20"/>
           <w:szCs w:val="20"/>
         </w:rPr>
-        <w:t xml:space="preserve">⚠  Do NOT run pnpm dev at workspace root. Each artifact runs via its own Replit workflow with PORT env var injected automatically.</w:t>
+        <w:t xml:space="preserve">⚠  Do NOT run pnpm dev at workspace root. Each artifact runs via its own Replit workflow with PORT env var.</w:t>
       </w:r>
     </w:p>
     <w:p>
@@ -5710,7 +6038,7 @@
           <w:sz w:val="20"/>
           <w:szCs w:val="20"/>
         </w:rPr>
-        <w:t xml:space="preserve">⚠  Reseed admin route passes force=true. Seed guard (count &gt;= 15) only blocks cold-start accidental reseeds.</w:t>
+        <w:t xml:space="preserve">⚠  seedDatabase() now takes NO parameters and runs unconditionally. Do not add guard logic back.</w:t>
       </w:r>
     </w:p>
     <w:p>
@@ -5727,7 +6055,7 @@
           <w:sz w:val="20"/>
           <w:szCs w:val="20"/>
         </w:rPr>
-        <w:t xml:space="preserve">⚠  Always populate signal.pastState — used in Signal Tracker UI trajectory display AND AI system prompt injection.</w:t>
+        <w:t xml:space="preserve">⚠  Always populate signal.pastState — used in Signal Tracker UI trajectory display AND AI system prompt.</w:t>
       </w:r>
     </w:p>
     <w:p>
@@ -5943,7 +6271,26 @@
           <w:sz w:val="21"/>
           <w:szCs w:val="21"/>
         </w:rPr>
-        <w:t xml:space="preserve">Equity ticker integration: live NSE/BSE price + analyst consensus for tracked companies</w:t>
+        <w:t xml:space="preserve">Equity ticker integration: live NSE/BSE price + analyst consensus</w:t>
+      </w:r>
+    </w:p>
+    <w:p>
+      <w:pPr>
+        <w:pStyle w:val="ListParagraph"/>
+        <w:numPr>
+          <w:ilvl w:val="0"/>
+          <w:numId w:val="1"/>
+        </w:numPr>
+        <w:spacing w:after="60"/>
+      </w:pPr>
+      <w:r>
+        <w:rPr>
+          <w:rFonts w:ascii="Calibri" w:cs="Calibri" w:eastAsia="Calibri" w:hAnsi="Calibri"/>
+          <w:color w:val="BBBBCC"/>
+          <w:sz w:val="21"/>
+          <w:szCs w:val="21"/>
+        </w:rPr>
+        <w:t xml:space="preserve">Playbook engagement tracker: log which playbooks led to actual BD conversations</w:t>
       </w:r>
     </w:p>
     <w:p>
@@ -6175,7 +6522,7 @@
           <w:sz w:val="22"/>
           <w:szCs w:val="22"/>
         </w:rPr>
-        <w:t xml:space="preserve">Every piece of seed data must pass this checklist before inclusion in seed.ts:</w:t>
+        <w:t xml:space="preserve">Every piece of seed data must pass this checklist before inclusion in seed.ts. These standards are the ONLY control on data quality — there is no row-count guard or volume limit.</w:t>
       </w:r>
     </w:p>
     <w:p>
@@ -6232,7 +6579,7 @@
           <w:sz w:val="21"/>
           <w:szCs w:val="21"/>
         </w:rPr>
-        <w:t xml:space="preserve">TRAJECTORY: Every signal must have pastState (6-12M reference) AND trajectoryDir. Both are required fields.</w:t>
+        <w:t xml:space="preserve">TRAJECTORY: Every signal must have pastState (6-12M reference) AND trajectoryDir. Both fields are required.</w:t>
       </w:r>
     </w:p>
     <w:p>
@@ -6517,7 +6864,7 @@
           <w:sz w:val="22"/>
           <w:szCs w:val="22"/>
         </w:rPr>
-        <w:t xml:space="preserve">And receive the full 9-section pipeline: Signal -&gt; Pattern -&gt; Hypothesis -&gt; KPI Validation -&gt; Financial Impact -&gt; Decision -&gt; Thoucentric Opportunity -&gt; Confidence -&gt; CXO Questions.</w:t>
+        <w:t xml:space="preserve">And receive the full 9-section pipeline: Signal → Pattern → Hypothesis → KPI Validation → Financial Impact → Decision → Thoucentric Opportunity → Confidence → CXO Questions.</w:t>
       </w:r>
     </w:p>
     <w:p>

</xml_diff>

<commit_message>
Finalize master prompt document for industry research pods
Update the master prompt document title to "Final" and regenerate the .docx file reflecting the latest prompt configurations.

Replit-Commit-Author: Agent
Replit-Commit-Session-Id: 0ab6a53e-e892-4f8b-a562-2151c283dfee
Replit-Commit-Checkpoint-Type: full_checkpoint
Replit-Commit-Event-Id: fc463adc-9c78-4f89-9097-3999774d051b
Replit-Commit-Screenshot-Url: https://storage.googleapis.com/screenshot-production-us-central1/67b4a529-a782-4661-87b5-bdc631927d66/0ab6a53e-e892-4f8b-a562-2151c283dfee/xUky76x
Replit-Helium-Checkpoint-Created: true
</commit_message>
<xml_diff>
--- a/Thoucentric_Industry_Research_Pod_Master_Prompt_v3.docx
+++ b/Thoucentric_Industry_Research_Pod_Master_Prompt_v3.docx
@@ -790,7 +790,7 @@
           <w:sz w:val="28"/>
           <w:szCs w:val="28"/>
         </w:rPr>
-        <w:t xml:space="preserve">3a. companies — 36 rows</w:t>
+        <w:t xml:space="preserve">3a. companies — 35 rows</w:t>
       </w:r>
     </w:p>
     <w:p>
@@ -847,7 +847,7 @@
           <w:sz w:val="21"/>
           <w:szCs w:val="21"/>
         </w:rPr>
-        <w:t xml:space="preserve">geography — "India" | "India / Global" | "Global"</w:t>
+        <w:t xml:space="preserve">geography — "INDIA" | "GLOBAL"</w:t>
       </w:r>
     </w:p>
     <w:p>
@@ -1690,7 +1690,7 @@
           <w:sz w:val="21"/>
           <w:szCs w:val="21"/>
         </w:rPr>
-        <w:t xml:space="preserve">triggerSignals — signal pattern conditions that activate this playbook</w:t>
+        <w:t xml:space="preserve">triggerSignals — semicolon-separated signal pattern conditions</w:t>
       </w:r>
     </w:p>
     <w:p>
@@ -1747,7 +1747,7 @@
           <w:sz w:val="21"/>
           <w:szCs w:val="21"/>
         </w:rPr>
-        <w:t xml:space="preserve">failureModes — numbered list: how this engagement commonly fails</w:t>
+        <w:t xml:space="preserve">failureModes — newline-separated: how this engagement commonly fails</w:t>
       </w:r>
     </w:p>
     <w:p>
@@ -1785,7 +1785,7 @@
           <w:sz w:val="21"/>
           <w:szCs w:val="21"/>
         </w:rPr>
-        <w:t xml:space="preserve">technologyEnablers — platforms, tools, vendors</w:t>
+        <w:t xml:space="preserve">technologyEnablers — semicolon-separated platforms, tools, vendors</w:t>
       </w:r>
     </w:p>
     <w:p>
@@ -1972,7 +1972,7 @@
           <w:sz w:val="18"/>
           <w:szCs w:val="18"/>
         </w:rPr>
-        <w:t xml:space="preserve">  // Clear all existing data</w:t>
+        <w:t xml:space="preserve">  await db.delete(signalsTable);</w:t>
       </w:r>
     </w:p>
     <w:p>
@@ -1987,7 +1987,7 @@
           <w:sz w:val="18"/>
           <w:szCs w:val="18"/>
         </w:rPr>
-        <w:t xml:space="preserve">  await db.delete(signalsTable);</w:t>
+        <w:t xml:space="preserve">  await db.delete(sheiCardsTable);</w:t>
       </w:r>
     </w:p>
     <w:p>
@@ -2002,7 +2002,7 @@
           <w:sz w:val="18"/>
           <w:szCs w:val="18"/>
         </w:rPr>
-        <w:t xml:space="preserve">  await db.delete(sheiCardsTable);</w:t>
+        <w:t xml:space="preserve">  await db.delete(benchmarksTable);</w:t>
       </w:r>
     </w:p>
     <w:p>
@@ -2017,7 +2017,7 @@
           <w:sz w:val="18"/>
           <w:szCs w:val="18"/>
         </w:rPr>
-        <w:t xml:space="preserve">  await db.delete(benchmarksTable);</w:t>
+        <w:t xml:space="preserve">  await db.delete(playbookSectionsTable);</w:t>
       </w:r>
     </w:p>
     <w:p>
@@ -2032,7 +2032,7 @@
           <w:sz w:val="18"/>
           <w:szCs w:val="18"/>
         </w:rPr>
-        <w:t xml:space="preserve">  await db.delete(playbookSectionsTable);</w:t>
+        <w:t xml:space="preserve">  await db.delete(companiesTable);</w:t>
       </w:r>
     </w:p>
     <w:p>
@@ -2047,7 +2047,7 @@
           <w:sz w:val="18"/>
           <w:szCs w:val="18"/>
         </w:rPr>
-        <w:t xml:space="preserve">  await db.delete(companiesTable);</w:t>
+        <w:t xml:space="preserve">  // Insert full dataset unconditionally ...</w:t>
       </w:r>
     </w:p>
     <w:p>
@@ -2062,7 +2062,21 @@
           <w:sz w:val="18"/>
           <w:szCs w:val="18"/>
         </w:rPr>
-        <w:t xml:space="preserve">  // Insert full dataset ...</w:t>
+        <w:t xml:space="preserve">}</w:t>
+      </w:r>
+    </w:p>
+    <w:p>
+      <w:pPr>
+        <w:spacing w:after="120"/>
+      </w:pPr>
+      <w:r>
+        <w:rPr>
+          <w:rFonts w:ascii="Calibri" w:cs="Calibri" w:eastAsia="Calibri" w:hAnsi="Calibri"/>
+          <w:color w:val="CCCCDD"/>
+          <w:sz w:val="22"/>
+          <w:szCs w:val="22"/>
+        </w:rPr>
+        <w:t xml:space="preserve">app.ts startup call:</w:t>
       </w:r>
     </w:p>
     <w:p>
@@ -2077,7 +2091,7 @@
           <w:sz w:val="18"/>
           <w:szCs w:val="18"/>
         </w:rPr>
-        <w:t xml:space="preserve">}</w:t>
+        <w:t xml:space="preserve">seedDatabase().catch((err) =&gt; { logger.error({ err }, "Failed to seed database"); });</w:t>
       </w:r>
     </w:p>
     <w:p>
@@ -2091,7 +2105,7 @@
           <w:sz w:val="22"/>
           <w:szCs w:val="22"/>
         </w:rPr>
-        <w:t xml:space="preserve">app.ts startup call:</w:t>
+        <w:t xml:space="preserve">admin.ts reseed route:</w:t>
       </w:r>
     </w:p>
     <w:p>
@@ -2106,7 +2120,659 @@
           <w:sz w:val="18"/>
           <w:szCs w:val="18"/>
         </w:rPr>
-        <w:t xml:space="preserve">seedDatabase().catch((err) =&gt; { logger.error({ err }, "Failed to seed database"); });</w:t>
+        <w:t xml:space="preserve">await seedDatabase();</w:t>
+      </w:r>
+    </w:p>
+    <w:p>
+      <w:pPr>
+        <w:spacing w:after="100" w:before="300"/>
+      </w:pPr>
+      <w:r>
+        <w:rPr>
+          <w:rFonts w:ascii="Calibri" w:cs="Calibri" w:eastAsia="Calibri" w:hAnsi="Calibri"/>
+          <w:b/>
+          <w:bCs/>
+          <w:color w:val="CCCCDD"/>
+          <w:sz w:val="28"/>
+          <w:szCs w:val="28"/>
+        </w:rPr>
+        <w:t xml:space="preserve">4b. Current Data Counts (May 2025)</w:t>
+      </w:r>
+    </w:p>
+    <w:p>
+      <w:pPr>
+        <w:pStyle w:val="ListParagraph"/>
+        <w:numPr>
+          <w:ilvl w:val="0"/>
+          <w:numId w:val="1"/>
+        </w:numPr>
+        <w:spacing w:after="60"/>
+      </w:pPr>
+      <w:r>
+        <w:rPr>
+          <w:rFonts w:ascii="Calibri" w:cs="Calibri" w:eastAsia="Calibri" w:hAnsi="Calibri"/>
+          <w:color w:val="BBBBCC"/>
+          <w:sz w:val="21"/>
+          <w:szCs w:val="21"/>
+        </w:rPr>
+        <w:t xml:space="preserve">Companies: 35</w:t>
+      </w:r>
+    </w:p>
+    <w:p>
+      <w:pPr>
+        <w:pStyle w:val="ListParagraph"/>
+        <w:numPr>
+          <w:ilvl w:val="0"/>
+          <w:numId w:val="1"/>
+        </w:numPr>
+        <w:spacing w:after="60"/>
+      </w:pPr>
+      <w:r>
+        <w:rPr>
+          <w:rFonts w:ascii="Calibri" w:cs="Calibri" w:eastAsia="Calibri" w:hAnsi="Calibri"/>
+          <w:color w:val="BBBBCC"/>
+          <w:sz w:val="21"/>
+          <w:szCs w:val="21"/>
+        </w:rPr>
+        <w:t xml:space="preserve">SHEI Cards: 15 (covering IMMEDIATE / MEDIUM_TERM / STRUCTURAL urgencies)</w:t>
+      </w:r>
+    </w:p>
+    <w:p>
+      <w:pPr>
+        <w:pStyle w:val="ListParagraph"/>
+        <w:numPr>
+          <w:ilvl w:val="0"/>
+          <w:numId w:val="1"/>
+        </w:numPr>
+        <w:spacing w:after="60"/>
+      </w:pPr>
+      <w:r>
+        <w:rPr>
+          <w:rFonts w:ascii="Calibri" w:cs="Calibri" w:eastAsia="Calibri" w:hAnsi="Calibri"/>
+          <w:color w:val="BBBBCC"/>
+          <w:sz w:val="21"/>
+          <w:szCs w:val="21"/>
+        </w:rPr>
+        <w:t xml:space="preserve">Signals: 39 (all Q4 FY25 / Q1 FY26)</w:t>
+      </w:r>
+    </w:p>
+    <w:p>
+      <w:pPr>
+        <w:pStyle w:val="ListParagraph"/>
+        <w:numPr>
+          <w:ilvl w:val="0"/>
+          <w:numId w:val="1"/>
+        </w:numPr>
+        <w:spacing w:after="60"/>
+      </w:pPr>
+      <w:r>
+        <w:rPr>
+          <w:rFonts w:ascii="Calibri" w:cs="Calibri" w:eastAsia="Calibri" w:hAnsi="Calibri"/>
+          <w:color w:val="BBBBCC"/>
+          <w:sz w:val="21"/>
+          <w:szCs w:val="21"/>
+        </w:rPr>
+        <w:t xml:space="preserve">Benchmarks: 24 across 6 function categories</w:t>
+      </w:r>
+    </w:p>
+    <w:p>
+      <w:pPr>
+        <w:pStyle w:val="ListParagraph"/>
+        <w:numPr>
+          <w:ilvl w:val="0"/>
+          <w:numId w:val="1"/>
+        </w:numPr>
+        <w:spacing w:after="60"/>
+      </w:pPr>
+      <w:r>
+        <w:rPr>
+          <w:rFonts w:ascii="Calibri" w:cs="Calibri" w:eastAsia="Calibri" w:hAnsi="Calibri"/>
+          <w:color w:val="BBBBCC"/>
+          <w:sz w:val="21"/>
+          <w:szCs w:val="21"/>
+        </w:rPr>
+        <w:t xml:space="preserve">Playbooks: 10 published engagement blueprints</w:t>
+      </w:r>
+    </w:p>
+    <w:p>
+      <w:pPr>
+        <w:spacing w:after="100" w:before="300"/>
+      </w:pPr>
+      <w:r>
+        <w:rPr>
+          <w:rFonts w:ascii="Calibri" w:cs="Calibri" w:eastAsia="Calibri" w:hAnsi="Calibri"/>
+          <w:b/>
+          <w:bCs/>
+          <w:color w:val="CCCCDD"/>
+          <w:sz w:val="28"/>
+          <w:szCs w:val="28"/>
+        </w:rPr>
+        <w:t xml:space="preserve">4c. SHEI Card Topics (15)</w:t>
+      </w:r>
+    </w:p>
+    <w:p>
+      <w:pPr>
+        <w:pStyle w:val="ListParagraph"/>
+        <w:numPr>
+          <w:ilvl w:val="0"/>
+          <w:numId w:val="1"/>
+        </w:numPr>
+        <w:spacing w:after="60"/>
+      </w:pPr>
+      <w:r>
+        <w:rPr>
+          <w:rFonts w:ascii="Calibri" w:cs="Calibri" w:eastAsia="Calibri" w:hAnsi="Calibri"/>
+          <w:color w:val="BBBBCC"/>
+          <w:sz w:val="21"/>
+          <w:szCs w:val="21"/>
+        </w:rPr>
+        <w:t xml:space="preserve">SHEI-2025-Q2-01: Q-Commerce SC Architecture Failure (IMMEDIATE / SUPPLY_CHAIN)</w:t>
+      </w:r>
+    </w:p>
+    <w:p>
+      <w:pPr>
+        <w:pStyle w:val="ListParagraph"/>
+        <w:numPr>
+          <w:ilvl w:val="0"/>
+          <w:numId w:val="1"/>
+        </w:numPr>
+        <w:spacing w:after="60"/>
+      </w:pPr>
+      <w:r>
+        <w:rPr>
+          <w:rFonts w:ascii="Calibri" w:cs="Calibri" w:eastAsia="Calibri" w:hAnsi="Calibri"/>
+          <w:color w:val="BBBBCC"/>
+          <w:sz w:val="21"/>
+          <w:szCs w:val="21"/>
+        </w:rPr>
+        <w:t xml:space="preserve">SHEI-2025-Q2-02: Cocoa &amp; Commodity Procurement Crisis (IMMEDIATE / PROCUREMENT)</w:t>
+      </w:r>
+    </w:p>
+    <w:p>
+      <w:pPr>
+        <w:pStyle w:val="ListParagraph"/>
+        <w:numPr>
+          <w:ilvl w:val="0"/>
+          <w:numId w:val="1"/>
+        </w:numPr>
+        <w:spacing w:after="60"/>
+      </w:pPr>
+      <w:r>
+        <w:rPr>
+          <w:rFonts w:ascii="Calibri" w:cs="Calibri" w:eastAsia="Calibri" w:hAnsi="Calibri"/>
+          <w:color w:val="BBBBCC"/>
+          <w:sz w:val="21"/>
+          <w:szCs w:val="21"/>
+        </w:rPr>
+        <w:t xml:space="preserve">SHEI-2025-Q2-03: India EPR Compliance SC Programme (MEDIUM_TERM / SUPPLY_CHAIN)</w:t>
+      </w:r>
+    </w:p>
+    <w:p>
+      <w:pPr>
+        <w:pStyle w:val="ListParagraph"/>
+        <w:numPr>
+          <w:ilvl w:val="0"/>
+          <w:numId w:val="1"/>
+        </w:numPr>
+        <w:spacing w:after="60"/>
+      </w:pPr>
+      <w:r>
+        <w:rPr>
+          <w:rFonts w:ascii="Calibri" w:cs="Calibri" w:eastAsia="Calibri" w:hAnsi="Calibri"/>
+          <w:color w:val="BBBBCC"/>
+          <w:sz w:val="21"/>
+          <w:szCs w:val="21"/>
+        </w:rPr>
+        <w:t xml:space="preserve">SHEI-2025-Q2-04: D2C to Omnichannel Distribution Transformation (MEDIUM_TERM / DISTRIBUTION_GTM)</w:t>
+      </w:r>
+    </w:p>
+    <w:p>
+      <w:pPr>
+        <w:pStyle w:val="ListParagraph"/>
+        <w:numPr>
+          <w:ilvl w:val="0"/>
+          <w:numId w:val="1"/>
+        </w:numPr>
+        <w:spacing w:after="60"/>
+      </w:pPr>
+      <w:r>
+        <w:rPr>
+          <w:rFonts w:ascii="Calibri" w:cs="Calibri" w:eastAsia="Calibri" w:hAnsi="Calibri"/>
+          <w:color w:val="BBBBCC"/>
+          <w:sz w:val="21"/>
+          <w:szCs w:val="21"/>
+        </w:rPr>
+        <w:t xml:space="preserve">SHEI-2025-Q2-05: AI / GenAI SC Demand Sensing Adoption Gap (STRUCTURAL / IT_TECHNOLOGY)</w:t>
+      </w:r>
+    </w:p>
+    <w:p>
+      <w:pPr>
+        <w:pStyle w:val="ListParagraph"/>
+        <w:numPr>
+          <w:ilvl w:val="0"/>
+          <w:numId w:val="1"/>
+        </w:numPr>
+        <w:spacing w:after="60"/>
+      </w:pPr>
+      <w:r>
+        <w:rPr>
+          <w:rFonts w:ascii="Calibri" w:cs="Calibri" w:eastAsia="Calibri" w:hAnsi="Calibri"/>
+          <w:color w:val="BBBBCC"/>
+          <w:sz w:val="21"/>
+          <w:szCs w:val="21"/>
+        </w:rPr>
+        <w:t xml:space="preserve">SHEI-2025-Q2-06: Tea Origin Diversification — Climate Risk SC Redesign (MEDIUM_TERM / PROCUREMENT)</w:t>
+      </w:r>
+    </w:p>
+    <w:p>
+      <w:pPr>
+        <w:pStyle w:val="ListParagraph"/>
+        <w:numPr>
+          <w:ilvl w:val="0"/>
+          <w:numId w:val="1"/>
+        </w:numPr>
+        <w:spacing w:after="60"/>
+      </w:pPr>
+      <w:r>
+        <w:rPr>
+          <w:rFonts w:ascii="Calibri" w:cs="Calibri" w:eastAsia="Calibri" w:hAnsi="Calibri"/>
+          <w:color w:val="BBBBCC"/>
+          <w:sz w:val="21"/>
+          <w:szCs w:val="21"/>
+        </w:rPr>
+        <w:t xml:space="preserve">SHEI-2025-Q2-07: Post-Carve-Out SC Rebuild — Ekaterra &amp; Kenvue (IMMEDIATE / IT_TECHNOLOGY)</w:t>
+      </w:r>
+    </w:p>
+    <w:p>
+      <w:pPr>
+        <w:pStyle w:val="ListParagraph"/>
+        <w:numPr>
+          <w:ilvl w:val="0"/>
+          <w:numId w:val="1"/>
+        </w:numPr>
+        <w:spacing w:after="60"/>
+      </w:pPr>
+      <w:r>
+        <w:rPr>
+          <w:rFonts w:ascii="Calibri" w:cs="Calibri" w:eastAsia="Calibri" w:hAnsi="Calibri"/>
+          <w:color w:val="BBBBCC"/>
+          <w:sz w:val="21"/>
+          <w:szCs w:val="21"/>
+        </w:rPr>
+        <w:t xml:space="preserve">SHEI-2025-Q2-08: India Rural FMCG Distribution Reinvention (MEDIUM_TERM / DISTRIBUTION_GTM)</w:t>
+      </w:r>
+    </w:p>
+    <w:p>
+      <w:pPr>
+        <w:pStyle w:val="ListParagraph"/>
+        <w:numPr>
+          <w:ilvl w:val="0"/>
+          <w:numId w:val="1"/>
+        </w:numPr>
+        <w:spacing w:after="60"/>
+      </w:pPr>
+      <w:r>
+        <w:rPr>
+          <w:rFonts w:ascii="Calibri" w:cs="Calibri" w:eastAsia="Calibri" w:hAnsi="Calibri"/>
+          <w:color w:val="BBBBCC"/>
+          <w:sz w:val="21"/>
+          <w:szCs w:val="21"/>
+        </w:rPr>
+        <w:t xml:space="preserve">SHEI-2025-Q2-09: GenAI SC Deployment Gap (MEDIUM_TERM / IT_TECHNOLOGY)</w:t>
+      </w:r>
+    </w:p>
+    <w:p>
+      <w:pPr>
+        <w:pStyle w:val="ListParagraph"/>
+        <w:numPr>
+          <w:ilvl w:val="0"/>
+          <w:numId w:val="1"/>
+        </w:numPr>
+        <w:spacing w:after="60"/>
+      </w:pPr>
+      <w:r>
+        <w:rPr>
+          <w:rFonts w:ascii="Calibri" w:cs="Calibri" w:eastAsia="Calibri" w:hAnsi="Calibri"/>
+          <w:color w:val="BBBBCC"/>
+          <w:sz w:val="21"/>
+          <w:szCs w:val="21"/>
+        </w:rPr>
+        <w:t xml:space="preserve">SHEI-2025-Q2-10: Modern Trade OTIF Penalty Exposure — Rs.2,000 Cr (IMMEDIATE / DISTRIBUTION_GTM)</w:t>
+      </w:r>
+    </w:p>
+    <w:p>
+      <w:pPr>
+        <w:pStyle w:val="ListParagraph"/>
+        <w:numPr>
+          <w:ilvl w:val="0"/>
+          <w:numId w:val="1"/>
+        </w:numPr>
+        <w:spacing w:after="60"/>
+      </w:pPr>
+      <w:r>
+        <w:rPr>
+          <w:rFonts w:ascii="Calibri" w:cs="Calibri" w:eastAsia="Calibri" w:hAnsi="Calibri"/>
+          <w:color w:val="BBBBCC"/>
+          <w:sz w:val="21"/>
+          <w:szCs w:val="21"/>
+        </w:rPr>
+        <w:t xml:space="preserve">SHEI-2025-Q2-11: India Cold Chain Infrastructure Gap (STRUCTURAL / SUPPLY_CHAIN)</w:t>
+      </w:r>
+    </w:p>
+    <w:p>
+      <w:pPr>
+        <w:pStyle w:val="ListParagraph"/>
+        <w:numPr>
+          <w:ilvl w:val="0"/>
+          <w:numId w:val="1"/>
+        </w:numPr>
+        <w:spacing w:after="60"/>
+      </w:pPr>
+      <w:r>
+        <w:rPr>
+          <w:rFonts w:ascii="Calibri" w:cs="Calibri" w:eastAsia="Calibri" w:hAnsi="Calibri"/>
+          <w:color w:val="BBBBCC"/>
+          <w:sz w:val="21"/>
+          <w:szCs w:val="21"/>
+        </w:rPr>
+        <w:t xml:space="preserve">SHEI-2025-Q2-12: EPR Compliance as SC Transformation — Rs.4,000 Cr (IMMEDIATE / SUPPLY_CHAIN)</w:t>
+      </w:r>
+    </w:p>
+    <w:p>
+      <w:pPr>
+        <w:pStyle w:val="ListParagraph"/>
+        <w:numPr>
+          <w:ilvl w:val="0"/>
+          <w:numId w:val="1"/>
+        </w:numPr>
+        <w:spacing w:after="60"/>
+      </w:pPr>
+      <w:r>
+        <w:rPr>
+          <w:rFonts w:ascii="Calibri" w:cs="Calibri" w:eastAsia="Calibri" w:hAnsi="Calibri"/>
+          <w:color w:val="BBBBCC"/>
+          <w:sz w:val="21"/>
+          <w:szCs w:val="21"/>
+        </w:rPr>
+        <w:t xml:space="preserve">SHEI-2025-Q2-13: India FMCG Salary Inflation — Manufacturing Cost Reset (STRUCTURAL / SUPPLY_CHAIN)</w:t>
+      </w:r>
+    </w:p>
+    <w:p>
+      <w:pPr>
+        <w:pStyle w:val="ListParagraph"/>
+        <w:numPr>
+          <w:ilvl w:val="0"/>
+          <w:numId w:val="1"/>
+        </w:numPr>
+        <w:spacing w:after="60"/>
+      </w:pPr>
+      <w:r>
+        <w:rPr>
+          <w:rFonts w:ascii="Calibri" w:cs="Calibri" w:eastAsia="Calibri" w:hAnsi="Calibri"/>
+          <w:color w:val="BBBBCC"/>
+          <w:sz w:val="21"/>
+          <w:szCs w:val="21"/>
+        </w:rPr>
+        <w:t xml:space="preserve">SHEI-2025-Q2-14: Sales &amp; Distribution Productivity Crisis (MEDIUM_TERM / SALES_DISTRIBUTION)</w:t>
+      </w:r>
+    </w:p>
+    <w:p>
+      <w:pPr>
+        <w:pStyle w:val="ListParagraph"/>
+        <w:numPr>
+          <w:ilvl w:val="0"/>
+          <w:numId w:val="1"/>
+        </w:numPr>
+        <w:spacing w:after="60"/>
+      </w:pPr>
+      <w:r>
+        <w:rPr>
+          <w:rFonts w:ascii="Calibri" w:cs="Calibri" w:eastAsia="Calibri" w:hAnsi="Calibri"/>
+          <w:color w:val="BBBBCC"/>
+          <w:sz w:val="21"/>
+          <w:szCs w:val="21"/>
+        </w:rPr>
+        <w:t xml:space="preserve">SHEI-2025-Q2-15: Beverage Portfolio Premiumisation SC Mismatch (MEDIUM_TERM / SUPPLY_CHAIN)</w:t>
+      </w:r>
+    </w:p>
+    <w:p>
+      <w:pPr>
+        <w:spacing w:after="100" w:before="300"/>
+      </w:pPr>
+      <w:r>
+        <w:rPr>
+          <w:rFonts w:ascii="Calibri" w:cs="Calibri" w:eastAsia="Calibri" w:hAnsi="Calibri"/>
+          <w:b/>
+          <w:bCs/>
+          <w:color w:val="CCCCDD"/>
+          <w:sz w:val="28"/>
+          <w:szCs w:val="28"/>
+        </w:rPr>
+        <w:t xml:space="preserve">4d. Playbook Topics (10)</w:t>
+      </w:r>
+    </w:p>
+    <w:p>
+      <w:pPr>
+        <w:pStyle w:val="ListParagraph"/>
+        <w:numPr>
+          <w:ilvl w:val="0"/>
+          <w:numId w:val="1"/>
+        </w:numPr>
+        <w:spacing w:after="60"/>
+      </w:pPr>
+      <w:r>
+        <w:rPr>
+          <w:rFonts w:ascii="Calibri" w:cs="Calibri" w:eastAsia="Calibri" w:hAnsi="Calibri"/>
+          <w:color w:val="BBBBCC"/>
+          <w:sz w:val="21"/>
+          <w:szCs w:val="21"/>
+        </w:rPr>
+        <w:t xml:space="preserve">1. Demand Sensing Diagnostic (SUPPLY_CHAIN)</w:t>
+      </w:r>
+    </w:p>
+    <w:p>
+      <w:pPr>
+        <w:pStyle w:val="ListParagraph"/>
+        <w:numPr>
+          <w:ilvl w:val="0"/>
+          <w:numId w:val="1"/>
+        </w:numPr>
+        <w:spacing w:after="60"/>
+      </w:pPr>
+      <w:r>
+        <w:rPr>
+          <w:rFonts w:ascii="Calibri" w:cs="Calibri" w:eastAsia="Calibri" w:hAnsi="Calibri"/>
+          <w:color w:val="BBBBCC"/>
+          <w:sz w:val="21"/>
+          <w:szCs w:val="21"/>
+        </w:rPr>
+        <w:t xml:space="preserve">2. Procurement Maturity Assessment (PROCUREMENT)</w:t>
+      </w:r>
+    </w:p>
+    <w:p>
+      <w:pPr>
+        <w:pStyle w:val="ListParagraph"/>
+        <w:numPr>
+          <w:ilvl w:val="0"/>
+          <w:numId w:val="1"/>
+        </w:numPr>
+        <w:spacing w:after="60"/>
+      </w:pPr>
+      <w:r>
+        <w:rPr>
+          <w:rFonts w:ascii="Calibri" w:cs="Calibri" w:eastAsia="Calibri" w:hAnsi="Calibri"/>
+          <w:color w:val="BBBBCC"/>
+          <w:sz w:val="21"/>
+          <w:szCs w:val="21"/>
+        </w:rPr>
+        <w:t xml:space="preserve">3. Post-Carve-Out SC Readiness Assessment (SUPPLY_CHAIN)</w:t>
+      </w:r>
+    </w:p>
+    <w:p>
+      <w:pPr>
+        <w:pStyle w:val="ListParagraph"/>
+        <w:numPr>
+          <w:ilvl w:val="0"/>
+          <w:numId w:val="1"/>
+        </w:numPr>
+        <w:spacing w:after="60"/>
+      </w:pPr>
+      <w:r>
+        <w:rPr>
+          <w:rFonts w:ascii="Calibri" w:cs="Calibri" w:eastAsia="Calibri" w:hAnsi="Calibri"/>
+          <w:color w:val="BBBBCC"/>
+          <w:sz w:val="21"/>
+          <w:szCs w:val="21"/>
+        </w:rPr>
+        <w:t xml:space="preserve">4. Tea SC Sourcing Diversification (PROCUREMENT)</w:t>
+      </w:r>
+    </w:p>
+    <w:p>
+      <w:pPr>
+        <w:pStyle w:val="ListParagraph"/>
+        <w:numPr>
+          <w:ilvl w:val="0"/>
+          <w:numId w:val="1"/>
+        </w:numPr>
+        <w:spacing w:after="60"/>
+      </w:pPr>
+      <w:r>
+        <w:rPr>
+          <w:rFonts w:ascii="Calibri" w:cs="Calibri" w:eastAsia="Calibri" w:hAnsi="Calibri"/>
+          <w:color w:val="BBBBCC"/>
+          <w:sz w:val="21"/>
+          <w:szCs w:val="21"/>
+        </w:rPr>
+        <w:t xml:space="preserve">5. D2C to Omnichannel GTM Transition (DISTRIBUTION_GTM)</w:t>
+      </w:r>
+    </w:p>
+    <w:p>
+      <w:pPr>
+        <w:pStyle w:val="ListParagraph"/>
+        <w:numPr>
+          <w:ilvl w:val="0"/>
+          <w:numId w:val="1"/>
+        </w:numPr>
+        <w:spacing w:after="60"/>
+      </w:pPr>
+      <w:r>
+        <w:rPr>
+          <w:rFonts w:ascii="Calibri" w:cs="Calibri" w:eastAsia="Calibri" w:hAnsi="Calibri"/>
+          <w:color w:val="BBBBCC"/>
+          <w:sz w:val="21"/>
+          <w:szCs w:val="21"/>
+        </w:rPr>
+        <w:t xml:space="preserve">6. Cold Chain SC Strategy &amp; Design (SUPPLY_CHAIN)</w:t>
+      </w:r>
+    </w:p>
+    <w:p>
+      <w:pPr>
+        <w:pStyle w:val="ListParagraph"/>
+        <w:numPr>
+          <w:ilvl w:val="0"/>
+          <w:numId w:val="1"/>
+        </w:numPr>
+        <w:spacing w:after="60"/>
+      </w:pPr>
+      <w:r>
+        <w:rPr>
+          <w:rFonts w:ascii="Calibri" w:cs="Calibri" w:eastAsia="Calibri" w:hAnsi="Calibri"/>
+          <w:color w:val="BBBBCC"/>
+          <w:sz w:val="21"/>
+          <w:szCs w:val="21"/>
+        </w:rPr>
+        <w:t xml:space="preserve">7. Modern Trade OTIF Penalty Reduction Programme (DISTRIBUTION_GTM)</w:t>
+      </w:r>
+    </w:p>
+    <w:p>
+      <w:pPr>
+        <w:pStyle w:val="ListParagraph"/>
+        <w:numPr>
+          <w:ilvl w:val="0"/>
+          <w:numId w:val="1"/>
+        </w:numPr>
+        <w:spacing w:after="60"/>
+      </w:pPr>
+      <w:r>
+        <w:rPr>
+          <w:rFonts w:ascii="Calibri" w:cs="Calibri" w:eastAsia="Calibri" w:hAnsi="Calibri"/>
+          <w:color w:val="BBBBCC"/>
+          <w:sz w:val="21"/>
+          <w:szCs w:val="21"/>
+        </w:rPr>
+        <w:t xml:space="preserve">8. GenAI SC Readiness &amp; Deployment Programme (IT_TECHNOLOGY)</w:t>
+      </w:r>
+    </w:p>
+    <w:p>
+      <w:pPr>
+        <w:pStyle w:val="ListParagraph"/>
+        <w:numPr>
+          <w:ilvl w:val="0"/>
+          <w:numId w:val="1"/>
+        </w:numPr>
+        <w:spacing w:after="60"/>
+      </w:pPr>
+      <w:r>
+        <w:rPr>
+          <w:rFonts w:ascii="Calibri" w:cs="Calibri" w:eastAsia="Calibri" w:hAnsi="Calibri"/>
+          <w:color w:val="BBBBCC"/>
+          <w:sz w:val="21"/>
+          <w:szCs w:val="21"/>
+        </w:rPr>
+        <w:t xml:space="preserve">9. EPR Compliance Supply Chain Programme (SUPPLY_CHAIN)</w:t>
+      </w:r>
+    </w:p>
+    <w:p>
+      <w:pPr>
+        <w:pStyle w:val="ListParagraph"/>
+        <w:numPr>
+          <w:ilvl w:val="0"/>
+          <w:numId w:val="1"/>
+        </w:numPr>
+        <w:spacing w:after="60"/>
+      </w:pPr>
+      <w:r>
+        <w:rPr>
+          <w:rFonts w:ascii="Calibri" w:cs="Calibri" w:eastAsia="Calibri" w:hAnsi="Calibri"/>
+          <w:color w:val="BBBBCC"/>
+          <w:sz w:val="21"/>
+          <w:szCs w:val="21"/>
+        </w:rPr>
+        <w:t xml:space="preserve">10. Manufacturing Excellence &amp; TPM Programme (SUPPLY_CHAIN)</w:t>
+      </w:r>
+    </w:p>
+    <w:p>
+      <w:pPr>
+        <w:pBdr>
+          <w:bottom w:val="single" w:color="2A2A44" w:sz="6"/>
+        </w:pBdr>
+        <w:spacing w:after="240" w:before="240"/>
+      </w:pPr>
+      <w:r>
+        <w:rPr>
+          <w:sz w:val="4"/>
+          <w:szCs w:val="4"/>
+        </w:rPr>
+        <w:t xml:space="preserve"/>
+      </w:r>
+    </w:p>
+    <w:p>
+      <w:pPr>
+        <w:pBdr>
+          <w:bottom w:val="single" w:color="333355" w:sz="4"/>
+        </w:pBdr>
+        <w:spacing w:after="160" w:before="560"/>
+      </w:pPr>
+      <w:r>
+        <w:rPr>
+          <w:rFonts w:ascii="Calibri" w:cs="Calibri" w:eastAsia="Calibri" w:hAnsi="Calibri"/>
+          <w:b/>
+          <w:bCs/>
+          <w:color w:val="6366F1"/>
+          <w:sz w:val="40"/>
+          <w:szCs w:val="40"/>
+        </w:rPr>
+        <w:t xml:space="preserve">5. API ENDPOINTS</w:t>
       </w:r>
     </w:p>
     <w:p>
@@ -2120,7 +2786,7 @@
           <w:sz w:val="22"/>
           <w:szCs w:val="22"/>
         </w:rPr>
-        <w:t xml:space="preserve">admin.ts reseed route:</w:t>
+        <w:t xml:space="preserve">All routes under /api. OpenAPI spec: lib/api-spec/openapi.yaml. Codegen: pnpm --filter @workspace/api-spec run codegen → lib/api-client-react/.</w:t>
       </w:r>
     </w:p>
     <w:p>
@@ -2135,1024 +2801,7 @@
           <w:sz w:val="18"/>
           <w:szCs w:val="18"/>
         </w:rPr>
-        <w:t xml:space="preserve">await seedDatabase();</w:t>
-      </w:r>
-    </w:p>
-    <w:p>
-      <w:pPr>
-        <w:spacing w:after="100" w:before="300"/>
-      </w:pPr>
-      <w:r>
-        <w:rPr>
-          <w:rFonts w:ascii="Calibri" w:cs="Calibri" w:eastAsia="Calibri" w:hAnsi="Calibri"/>
-          <w:b/>
-          <w:bCs/>
-          <w:color w:val="CCCCDD"/>
-          <w:sz w:val="28"/>
-          <w:szCs w:val="28"/>
-        </w:rPr>
-        <w:t xml:space="preserve">4b. Seeding Order (FK-safe)</w:t>
-      </w:r>
-    </w:p>
-    <w:p>
-      <w:pPr>
-        <w:pStyle w:val="ListParagraph"/>
-        <w:numPr>
-          <w:ilvl w:val="0"/>
-          <w:numId w:val="1"/>
-        </w:numPr>
-        <w:spacing w:after="60"/>
-      </w:pPr>
-      <w:r>
-        <w:rPr>
-          <w:rFonts w:ascii="Calibri" w:cs="Calibri" w:eastAsia="Calibri" w:hAnsi="Calibri"/>
-          <w:color w:val="BBBBCC"/>
-          <w:sz w:val="21"/>
-          <w:szCs w:val="21"/>
-        </w:rPr>
-        <w:t xml:space="preserve">1. DELETE signals → shei_cards → benchmarks → playbooks → companies</w:t>
-      </w:r>
-    </w:p>
-    <w:p>
-      <w:pPr>
-        <w:pStyle w:val="ListParagraph"/>
-        <w:numPr>
-          <w:ilvl w:val="0"/>
-          <w:numId w:val="1"/>
-        </w:numPr>
-        <w:spacing w:after="60"/>
-      </w:pPr>
-      <w:r>
-        <w:rPr>
-          <w:rFonts w:ascii="Calibri" w:cs="Calibri" w:eastAsia="Calibri" w:hAnsi="Calibri"/>
-          <w:color w:val="BBBBCC"/>
-          <w:sz w:val="21"/>
-          <w:szCs w:val="21"/>
-        </w:rPr>
-        <w:t xml:space="preserve">2. INSERT companies</w:t>
-      </w:r>
-    </w:p>
-    <w:p>
-      <w:pPr>
-        <w:pStyle w:val="ListParagraph"/>
-        <w:numPr>
-          <w:ilvl w:val="0"/>
-          <w:numId w:val="1"/>
-        </w:numPr>
-        <w:spacing w:after="60"/>
-      </w:pPr>
-      <w:r>
-        <w:rPr>
-          <w:rFonts w:ascii="Calibri" w:cs="Calibri" w:eastAsia="Calibri" w:hAnsi="Calibri"/>
-          <w:color w:val="BBBBCC"/>
-          <w:sz w:val="21"/>
-          <w:szCs w:val="21"/>
-        </w:rPr>
-        <w:t xml:space="preserve">3. INSERT shei_cards</w:t>
-      </w:r>
-    </w:p>
-    <w:p>
-      <w:pPr>
-        <w:pStyle w:val="ListParagraph"/>
-        <w:numPr>
-          <w:ilvl w:val="0"/>
-          <w:numId w:val="1"/>
-        </w:numPr>
-        <w:spacing w:after="60"/>
-      </w:pPr>
-      <w:r>
-        <w:rPr>
-          <w:rFonts w:ascii="Calibri" w:cs="Calibri" w:eastAsia="Calibri" w:hAnsi="Calibri"/>
-          <w:color w:val="BBBBCC"/>
-          <w:sz w:val="21"/>
-          <w:szCs w:val="21"/>
-        </w:rPr>
-        <w:t xml:space="preserve">4. INSERT signals</w:t>
-      </w:r>
-    </w:p>
-    <w:p>
-      <w:pPr>
-        <w:pStyle w:val="ListParagraph"/>
-        <w:numPr>
-          <w:ilvl w:val="0"/>
-          <w:numId w:val="1"/>
-        </w:numPr>
-        <w:spacing w:after="60"/>
-      </w:pPr>
-      <w:r>
-        <w:rPr>
-          <w:rFonts w:ascii="Calibri" w:cs="Calibri" w:eastAsia="Calibri" w:hAnsi="Calibri"/>
-          <w:color w:val="BBBBCC"/>
-          <w:sz w:val="21"/>
-          <w:szCs w:val="21"/>
-        </w:rPr>
-        <w:t xml:space="preserve">5. INSERT benchmarks</w:t>
-      </w:r>
-    </w:p>
-    <w:p>
-      <w:pPr>
-        <w:pStyle w:val="ListParagraph"/>
-        <w:numPr>
-          <w:ilvl w:val="0"/>
-          <w:numId w:val="1"/>
-        </w:numPr>
-        <w:spacing w:after="60"/>
-      </w:pPr>
-      <w:r>
-        <w:rPr>
-          <w:rFonts w:ascii="Calibri" w:cs="Calibri" w:eastAsia="Calibri" w:hAnsi="Calibri"/>
-          <w:color w:val="BBBBCC"/>
-          <w:sz w:val="21"/>
-          <w:szCs w:val="21"/>
-        </w:rPr>
-        <w:t xml:space="preserve">6. INSERT playbooks</w:t>
-      </w:r>
-    </w:p>
-    <w:p>
-      <w:pPr>
-        <w:spacing w:after="100" w:before="300"/>
-      </w:pPr>
-      <w:r>
-        <w:rPr>
-          <w:rFonts w:ascii="Calibri" w:cs="Calibri" w:eastAsia="Calibri" w:hAnsi="Calibri"/>
-          <w:b/>
-          <w:bCs/>
-          <w:color w:val="CCCCDD"/>
-          <w:sz w:val="28"/>
-          <w:szCs w:val="28"/>
-        </w:rPr>
-        <w:t xml:space="preserve">4c. Current Data Counts (May 2025)</w:t>
-      </w:r>
-    </w:p>
-    <w:p>
-      <w:pPr>
-        <w:pStyle w:val="ListParagraph"/>
-        <w:numPr>
-          <w:ilvl w:val="0"/>
-          <w:numId w:val="1"/>
-        </w:numPr>
-        <w:spacing w:after="60"/>
-      </w:pPr>
-      <w:r>
-        <w:rPr>
-          <w:rFonts w:ascii="Calibri" w:cs="Calibri" w:eastAsia="Calibri" w:hAnsi="Calibri"/>
-          <w:color w:val="BBBBCC"/>
-          <w:sz w:val="21"/>
-          <w:szCs w:val="21"/>
-        </w:rPr>
-        <w:t xml:space="preserve">Companies: 36</w:t>
-      </w:r>
-    </w:p>
-    <w:p>
-      <w:pPr>
-        <w:pStyle w:val="ListParagraph"/>
-        <w:numPr>
-          <w:ilvl w:val="0"/>
-          <w:numId w:val="1"/>
-        </w:numPr>
-        <w:spacing w:after="60"/>
-      </w:pPr>
-      <w:r>
-        <w:rPr>
-          <w:rFonts w:ascii="Calibri" w:cs="Calibri" w:eastAsia="Calibri" w:hAnsi="Calibri"/>
-          <w:color w:val="BBBBCC"/>
-          <w:sz w:val="21"/>
-          <w:szCs w:val="21"/>
-        </w:rPr>
-        <w:t xml:space="preserve">SHEI Cards: 15 (7 original + 8 Q2-2025 expansion)</w:t>
-      </w:r>
-    </w:p>
-    <w:p>
-      <w:pPr>
-        <w:pStyle w:val="ListParagraph"/>
-        <w:numPr>
-          <w:ilvl w:val="0"/>
-          <w:numId w:val="1"/>
-        </w:numPr>
-        <w:spacing w:after="60"/>
-      </w:pPr>
-      <w:r>
-        <w:rPr>
-          <w:rFonts w:ascii="Calibri" w:cs="Calibri" w:eastAsia="Calibri" w:hAnsi="Calibri"/>
-          <w:color w:val="BBBBCC"/>
-          <w:sz w:val="21"/>
-          <w:szCs w:val="21"/>
-        </w:rPr>
-        <w:t xml:space="preserve">Signals: 39 (15 original + 24 batch-2, all Q4 FY25 / Q1 FY26)</w:t>
-      </w:r>
-    </w:p>
-    <w:p>
-      <w:pPr>
-        <w:pStyle w:val="ListParagraph"/>
-        <w:numPr>
-          <w:ilvl w:val="0"/>
-          <w:numId w:val="1"/>
-        </w:numPr>
-        <w:spacing w:after="60"/>
-      </w:pPr>
-      <w:r>
-        <w:rPr>
-          <w:rFonts w:ascii="Calibri" w:cs="Calibri" w:eastAsia="Calibri" w:hAnsi="Calibri"/>
-          <w:color w:val="BBBBCC"/>
-          <w:sz w:val="21"/>
-          <w:szCs w:val="21"/>
-        </w:rPr>
-        <w:t xml:space="preserve">Benchmarks: 24 (15 original + 9 new KPI categories)</w:t>
-      </w:r>
-    </w:p>
-    <w:p>
-      <w:pPr>
-        <w:pStyle w:val="ListParagraph"/>
-        <w:numPr>
-          <w:ilvl w:val="0"/>
-          <w:numId w:val="1"/>
-        </w:numPr>
-        <w:spacing w:after="60"/>
-      </w:pPr>
-      <w:r>
-        <w:rPr>
-          <w:rFonts w:ascii="Calibri" w:cs="Calibri" w:eastAsia="Calibri" w:hAnsi="Calibri"/>
-          <w:color w:val="BBBBCC"/>
-          <w:sz w:val="21"/>
-          <w:szCs w:val="21"/>
-        </w:rPr>
-        <w:t xml:space="preserve">Playbooks: 10 (5 original + 5 new engagement blueprints)</w:t>
-      </w:r>
-    </w:p>
-    <w:p>
-      <w:pPr>
-        <w:spacing w:after="100" w:before="300"/>
-      </w:pPr>
-      <w:r>
-        <w:rPr>
-          <w:rFonts w:ascii="Calibri" w:cs="Calibri" w:eastAsia="Calibri" w:hAnsi="Calibri"/>
-          <w:b/>
-          <w:bCs/>
-          <w:color w:val="CCCCDD"/>
-          <w:sz w:val="28"/>
-          <w:szCs w:val="28"/>
-        </w:rPr>
-        <w:t xml:space="preserve">4d. Company Universe (36)</w:t>
-      </w:r>
-    </w:p>
-    <w:p>
-      <w:pPr>
-        <w:spacing w:after="120"/>
-      </w:pPr>
-      <w:r>
-        <w:rPr>
-          <w:rFonts w:ascii="Calibri" w:cs="Calibri" w:eastAsia="Calibri" w:hAnsi="Calibri"/>
-          <w:color w:val="CCCCDD"/>
-          <w:sz w:val="22"/>
-          <w:szCs w:val="22"/>
-        </w:rPr>
-        <w:t xml:space="preserve">India-listed FMCG (18): HUL, Nestlé India, ITC, Marico, Dabur, Britannia, Godrej Consumer Products, Colgate India, Emami, Tata Consumer Products, Bikaji Foods, Honasa/Mamaearth, Patanjali, Varun Beverages (HCCB), Jyothy Labs, Zydus Wellness, CCL Products, Heritage Foods</w:t>
-      </w:r>
-    </w:p>
-    <w:p>
-      <w:pPr>
-        <w:spacing w:after="120"/>
-      </w:pPr>
-      <w:r>
-        <w:rPr>
-          <w:rFonts w:ascii="Calibri" w:cs="Calibri" w:eastAsia="Calibri" w:hAnsi="Calibri"/>
-          <w:color w:val="CCCCDD"/>
-          <w:sz w:val="22"/>
-          <w:szCs w:val="22"/>
-        </w:rPr>
-        <w:t xml:space="preserve">India unlisted/cooperative (4): Amul (GCMMF), Haldiram's, Wagh Bakri, MDH Spices</w:t>
-      </w:r>
-    </w:p>
-    <w:p>
-      <w:pPr>
-        <w:spacing w:after="120"/>
-      </w:pPr>
-      <w:r>
-        <w:rPr>
-          <w:rFonts w:ascii="Calibri" w:cs="Calibri" w:eastAsia="Calibri" w:hAnsi="Calibri"/>
-          <w:color w:val="CCCCDD"/>
-          <w:sz w:val="22"/>
-          <w:szCs w:val="22"/>
-        </w:rPr>
-        <w:t xml:space="preserve">Global majors with India ops (8): P&amp;G India, Mars India, Reckitt India, Mondelez India, PepsiCo India, HCCB (Coca-Cola India), L'Oreal India, Kenvue India</w:t>
-      </w:r>
-    </w:p>
-    <w:p>
-      <w:pPr>
-        <w:spacing w:after="120"/>
-      </w:pPr>
-      <w:r>
-        <w:rPr>
-          <w:rFonts w:ascii="Calibri" w:cs="Calibri" w:eastAsia="Calibri" w:hAnsi="Calibri"/>
-          <w:color w:val="CCCCDD"/>
-          <w:sz w:val="22"/>
-          <w:szCs w:val="22"/>
-        </w:rPr>
-        <w:t xml:space="preserve">Global FMCG (6): Unilever (global), Nestlé S.A. (global), Ekaterra/Lipton, Goodricke Group, McLeod Russel/Amalgam, Twinings</w:t>
-      </w:r>
-    </w:p>
-    <w:p>
-      <w:pPr>
-        <w:spacing w:after="100" w:before="300"/>
-      </w:pPr>
-      <w:r>
-        <w:rPr>
-          <w:rFonts w:ascii="Calibri" w:cs="Calibri" w:eastAsia="Calibri" w:hAnsi="Calibri"/>
-          <w:b/>
-          <w:bCs/>
-          <w:color w:val="CCCCDD"/>
-          <w:sz w:val="28"/>
-          <w:szCs w:val="28"/>
-        </w:rPr>
-        <w:t xml:space="preserve">4e. SHEI Card Topics (15)</w:t>
-      </w:r>
-    </w:p>
-    <w:p>
-      <w:pPr>
-        <w:pStyle w:val="ListParagraph"/>
-        <w:numPr>
-          <w:ilvl w:val="0"/>
-          <w:numId w:val="1"/>
-        </w:numPr>
-        <w:spacing w:after="60"/>
-      </w:pPr>
-      <w:r>
-        <w:rPr>
-          <w:rFonts w:ascii="Calibri" w:cs="Calibri" w:eastAsia="Calibri" w:hAnsi="Calibri"/>
-          <w:color w:val="BBBBCC"/>
-          <w:sz w:val="21"/>
-          <w:szCs w:val="21"/>
-        </w:rPr>
-        <w:t xml:space="preserve">SHEI-2025-Q2-01: Q-Commerce SC Architecture Failure (IMMEDIATE / SUPPLY_CHAIN)</w:t>
-      </w:r>
-    </w:p>
-    <w:p>
-      <w:pPr>
-        <w:pStyle w:val="ListParagraph"/>
-        <w:numPr>
-          <w:ilvl w:val="0"/>
-          <w:numId w:val="1"/>
-        </w:numPr>
-        <w:spacing w:after="60"/>
-      </w:pPr>
-      <w:r>
-        <w:rPr>
-          <w:rFonts w:ascii="Calibri" w:cs="Calibri" w:eastAsia="Calibri" w:hAnsi="Calibri"/>
-          <w:color w:val="BBBBCC"/>
-          <w:sz w:val="21"/>
-          <w:szCs w:val="21"/>
-        </w:rPr>
-        <w:t xml:space="preserve">SHEI-2025-Q2-02: Cocoa &amp; Commodity Procurement Crisis (IMMEDIATE / PROCUREMENT)</w:t>
-      </w:r>
-    </w:p>
-    <w:p>
-      <w:pPr>
-        <w:pStyle w:val="ListParagraph"/>
-        <w:numPr>
-          <w:ilvl w:val="0"/>
-          <w:numId w:val="1"/>
-        </w:numPr>
-        <w:spacing w:after="60"/>
-      </w:pPr>
-      <w:r>
-        <w:rPr>
-          <w:rFonts w:ascii="Calibri" w:cs="Calibri" w:eastAsia="Calibri" w:hAnsi="Calibri"/>
-          <w:color w:val="BBBBCC"/>
-          <w:sz w:val="21"/>
-          <w:szCs w:val="21"/>
-        </w:rPr>
-        <w:t xml:space="preserve">SHEI-2025-Q2-03: India EPR Compliance SC Programme (MEDIUM_TERM / SUPPLY_CHAIN)</w:t>
-      </w:r>
-    </w:p>
-    <w:p>
-      <w:pPr>
-        <w:pStyle w:val="ListParagraph"/>
-        <w:numPr>
-          <w:ilvl w:val="0"/>
-          <w:numId w:val="1"/>
-        </w:numPr>
-        <w:spacing w:after="60"/>
-      </w:pPr>
-      <w:r>
-        <w:rPr>
-          <w:rFonts w:ascii="Calibri" w:cs="Calibri" w:eastAsia="Calibri" w:hAnsi="Calibri"/>
-          <w:color w:val="BBBBCC"/>
-          <w:sz w:val="21"/>
-          <w:szCs w:val="21"/>
-        </w:rPr>
-        <w:t xml:space="preserve">SHEI-2025-Q2-04: D2C to Omnichannel Distribution Transformation (MEDIUM_TERM / DISTRIBUTION_GTM)</w:t>
-      </w:r>
-    </w:p>
-    <w:p>
-      <w:pPr>
-        <w:pStyle w:val="ListParagraph"/>
-        <w:numPr>
-          <w:ilvl w:val="0"/>
-          <w:numId w:val="1"/>
-        </w:numPr>
-        <w:spacing w:after="60"/>
-      </w:pPr>
-      <w:r>
-        <w:rPr>
-          <w:rFonts w:ascii="Calibri" w:cs="Calibri" w:eastAsia="Calibri" w:hAnsi="Calibri"/>
-          <w:color w:val="BBBBCC"/>
-          <w:sz w:val="21"/>
-          <w:szCs w:val="21"/>
-        </w:rPr>
-        <w:t xml:space="preserve">SHEI-2025-Q2-05: AI / GenAI SC Demand Sensing Adoption Gap (STRUCTURAL / IT_TECHNOLOGY)</w:t>
-      </w:r>
-    </w:p>
-    <w:p>
-      <w:pPr>
-        <w:pStyle w:val="ListParagraph"/>
-        <w:numPr>
-          <w:ilvl w:val="0"/>
-          <w:numId w:val="1"/>
-        </w:numPr>
-        <w:spacing w:after="60"/>
-      </w:pPr>
-      <w:r>
-        <w:rPr>
-          <w:rFonts w:ascii="Calibri" w:cs="Calibri" w:eastAsia="Calibri" w:hAnsi="Calibri"/>
-          <w:color w:val="BBBBCC"/>
-          <w:sz w:val="21"/>
-          <w:szCs w:val="21"/>
-        </w:rPr>
-        <w:t xml:space="preserve">SHEI-2025-Q2-06: Tea Origin Diversification — Climate Risk SC Redesign (MEDIUM_TERM / PROCUREMENT)</w:t>
-      </w:r>
-    </w:p>
-    <w:p>
-      <w:pPr>
-        <w:pStyle w:val="ListParagraph"/>
-        <w:numPr>
-          <w:ilvl w:val="0"/>
-          <w:numId w:val="1"/>
-        </w:numPr>
-        <w:spacing w:after="60"/>
-      </w:pPr>
-      <w:r>
-        <w:rPr>
-          <w:rFonts w:ascii="Calibri" w:cs="Calibri" w:eastAsia="Calibri" w:hAnsi="Calibri"/>
-          <w:color w:val="BBBBCC"/>
-          <w:sz w:val="21"/>
-          <w:szCs w:val="21"/>
-        </w:rPr>
-        <w:t xml:space="preserve">SHEI-2025-Q2-07: Post-Carve-Out SC Rebuild — Ekaterra &amp; Kenvue (IMMEDIATE / IT_TECHNOLOGY)</w:t>
-      </w:r>
-    </w:p>
-    <w:p>
-      <w:pPr>
-        <w:pStyle w:val="ListParagraph"/>
-        <w:numPr>
-          <w:ilvl w:val="0"/>
-          <w:numId w:val="1"/>
-        </w:numPr>
-        <w:spacing w:after="60"/>
-      </w:pPr>
-      <w:r>
-        <w:rPr>
-          <w:rFonts w:ascii="Calibri" w:cs="Calibri" w:eastAsia="Calibri" w:hAnsi="Calibri"/>
-          <w:color w:val="BBBBCC"/>
-          <w:sz w:val="21"/>
-          <w:szCs w:val="21"/>
-        </w:rPr>
-        <w:t xml:space="preserve">SHEI-2025-Q2-08: India Rural FMCG Distribution Reinvention (MEDIUM_TERM / DISTRIBUTION_GTM)</w:t>
-      </w:r>
-    </w:p>
-    <w:p>
-      <w:pPr>
-        <w:pStyle w:val="ListParagraph"/>
-        <w:numPr>
-          <w:ilvl w:val="0"/>
-          <w:numId w:val="1"/>
-        </w:numPr>
-        <w:spacing w:after="60"/>
-      </w:pPr>
-      <w:r>
-        <w:rPr>
-          <w:rFonts w:ascii="Calibri" w:cs="Calibri" w:eastAsia="Calibri" w:hAnsi="Calibri"/>
-          <w:color w:val="BBBBCC"/>
-          <w:sz w:val="21"/>
-          <w:szCs w:val="21"/>
-        </w:rPr>
-        <w:t xml:space="preserve">SHEI-2025-Q2-09: GenAI SC Deployment Gap — Announces but Doesn't Execute (MEDIUM_TERM / IT_TECHNOLOGY)</w:t>
-      </w:r>
-    </w:p>
-    <w:p>
-      <w:pPr>
-        <w:pStyle w:val="ListParagraph"/>
-        <w:numPr>
-          <w:ilvl w:val="0"/>
-          <w:numId w:val="1"/>
-        </w:numPr>
-        <w:spacing w:after="60"/>
-      </w:pPr>
-      <w:r>
-        <w:rPr>
-          <w:rFonts w:ascii="Calibri" w:cs="Calibri" w:eastAsia="Calibri" w:hAnsi="Calibri"/>
-          <w:color w:val="BBBBCC"/>
-          <w:sz w:val="21"/>
-          <w:szCs w:val="21"/>
-        </w:rPr>
-        <w:t xml:space="preserve">SHEI-2025-Q2-10: Modern Trade OTIF Penalty Exposure — Rs.2,000 Cr Industry Risk (IMMEDIATE / DISTRIBUTION_GTM)</w:t>
-      </w:r>
-    </w:p>
-    <w:p>
-      <w:pPr>
-        <w:pStyle w:val="ListParagraph"/>
-        <w:numPr>
-          <w:ilvl w:val="0"/>
-          <w:numId w:val="1"/>
-        </w:numPr>
-        <w:spacing w:after="60"/>
-      </w:pPr>
-      <w:r>
-        <w:rPr>
-          <w:rFonts w:ascii="Calibri" w:cs="Calibri" w:eastAsia="Calibri" w:hAnsi="Calibri"/>
-          <w:color w:val="BBBBCC"/>
-          <w:sz w:val="21"/>
-          <w:szCs w:val="21"/>
-        </w:rPr>
-        <w:t xml:space="preserve">SHEI-2025-Q2-11: India Cold Chain Infrastructure Gap — Categories Blocked (STRUCTURAL / SUPPLY_CHAIN)</w:t>
-      </w:r>
-    </w:p>
-    <w:p>
-      <w:pPr>
-        <w:pStyle w:val="ListParagraph"/>
-        <w:numPr>
-          <w:ilvl w:val="0"/>
-          <w:numId w:val="1"/>
-        </w:numPr>
-        <w:spacing w:after="60"/>
-      </w:pPr>
-      <w:r>
-        <w:rPr>
-          <w:rFonts w:ascii="Calibri" w:cs="Calibri" w:eastAsia="Calibri" w:hAnsi="Calibri"/>
-          <w:color w:val="BBBBCC"/>
-          <w:sz w:val="21"/>
-          <w:szCs w:val="21"/>
-        </w:rPr>
-        <w:t xml:space="preserve">SHEI-2025-Q2-12: EPR Compliance as SC Transformation — Rs.4,000 Cr Penalty Overhang (IMMEDIATE / SUPPLY_CHAIN)</w:t>
-      </w:r>
-    </w:p>
-    <w:p>
-      <w:pPr>
-        <w:pStyle w:val="ListParagraph"/>
-        <w:numPr>
-          <w:ilvl w:val="0"/>
-          <w:numId w:val="1"/>
-        </w:numPr>
-        <w:spacing w:after="60"/>
-      </w:pPr>
-      <w:r>
-        <w:rPr>
-          <w:rFonts w:ascii="Calibri" w:cs="Calibri" w:eastAsia="Calibri" w:hAnsi="Calibri"/>
-          <w:color w:val="BBBBCC"/>
-          <w:sz w:val="21"/>
-          <w:szCs w:val="21"/>
-        </w:rPr>
-        <w:t xml:space="preserve">SHEI-2025-Q2-13: India FMCG Salary Inflation — Manufacturing Cost Structural Reset (STRUCTURAL / SUPPLY_CHAIN)</w:t>
-      </w:r>
-    </w:p>
-    <w:p>
-      <w:pPr>
-        <w:pStyle w:val="ListParagraph"/>
-        <w:numPr>
-          <w:ilvl w:val="0"/>
-          <w:numId w:val="1"/>
-        </w:numPr>
-        <w:spacing w:after="60"/>
-      </w:pPr>
-      <w:r>
-        <w:rPr>
-          <w:rFonts w:ascii="Calibri" w:cs="Calibri" w:eastAsia="Calibri" w:hAnsi="Calibri"/>
-          <w:color w:val="BBBBCC"/>
-          <w:sz w:val="21"/>
-          <w:szCs w:val="21"/>
-        </w:rPr>
-        <w:t xml:space="preserve">SHEI-2025-Q2-14: Sales &amp; Distribution Productivity Crisis — Revenue/Person Declining 3 Years (MEDIUM_TERM / SALES_DISTRIBUTION)</w:t>
-      </w:r>
-    </w:p>
-    <w:p>
-      <w:pPr>
-        <w:pStyle w:val="ListParagraph"/>
-        <w:numPr>
-          <w:ilvl w:val="0"/>
-          <w:numId w:val="1"/>
-        </w:numPr>
-        <w:spacing w:after="60"/>
-      </w:pPr>
-      <w:r>
-        <w:rPr>
-          <w:rFonts w:ascii="Calibri" w:cs="Calibri" w:eastAsia="Calibri" w:hAnsi="Calibri"/>
-          <w:color w:val="BBBBCC"/>
-          <w:sz w:val="21"/>
-          <w:szCs w:val="21"/>
-        </w:rPr>
-        <w:t xml:space="preserve">SHEI-2025-Q2-15: Beverage Portfolio Premiumisation SC Mismatch (MEDIUM_TERM / SUPPLY_CHAIN)</w:t>
-      </w:r>
-    </w:p>
-    <w:p>
-      <w:pPr>
-        <w:spacing w:after="100" w:before="300"/>
-      </w:pPr>
-      <w:r>
-        <w:rPr>
-          <w:rFonts w:ascii="Calibri" w:cs="Calibri" w:eastAsia="Calibri" w:hAnsi="Calibri"/>
-          <w:b/>
-          <w:bCs/>
-          <w:color w:val="CCCCDD"/>
-          <w:sz w:val="28"/>
-          <w:szCs w:val="28"/>
-        </w:rPr>
-        <w:t xml:space="preserve">4f. Playbook Topics (10)</w:t>
-      </w:r>
-    </w:p>
-    <w:p>
-      <w:pPr>
-        <w:pStyle w:val="ListParagraph"/>
-        <w:numPr>
-          <w:ilvl w:val="0"/>
-          <w:numId w:val="1"/>
-        </w:numPr>
-        <w:spacing w:after="60"/>
-      </w:pPr>
-      <w:r>
-        <w:rPr>
-          <w:rFonts w:ascii="Calibri" w:cs="Calibri" w:eastAsia="Calibri" w:hAnsi="Calibri"/>
-          <w:color w:val="BBBBCC"/>
-          <w:sz w:val="21"/>
-          <w:szCs w:val="21"/>
-        </w:rPr>
-        <w:t xml:space="preserve">1. Demand Sensing Diagnostic (SUPPLY_CHAIN)</w:t>
-      </w:r>
-    </w:p>
-    <w:p>
-      <w:pPr>
-        <w:pStyle w:val="ListParagraph"/>
-        <w:numPr>
-          <w:ilvl w:val="0"/>
-          <w:numId w:val="1"/>
-        </w:numPr>
-        <w:spacing w:after="60"/>
-      </w:pPr>
-      <w:r>
-        <w:rPr>
-          <w:rFonts w:ascii="Calibri" w:cs="Calibri" w:eastAsia="Calibri" w:hAnsi="Calibri"/>
-          <w:color w:val="BBBBCC"/>
-          <w:sz w:val="21"/>
-          <w:szCs w:val="21"/>
-        </w:rPr>
-        <w:t xml:space="preserve">2. Procurement Maturity Assessment (PROCUREMENT)</w:t>
-      </w:r>
-    </w:p>
-    <w:p>
-      <w:pPr>
-        <w:pStyle w:val="ListParagraph"/>
-        <w:numPr>
-          <w:ilvl w:val="0"/>
-          <w:numId w:val="1"/>
-        </w:numPr>
-        <w:spacing w:after="60"/>
-      </w:pPr>
-      <w:r>
-        <w:rPr>
-          <w:rFonts w:ascii="Calibri" w:cs="Calibri" w:eastAsia="Calibri" w:hAnsi="Calibri"/>
-          <w:color w:val="BBBBCC"/>
-          <w:sz w:val="21"/>
-          <w:szCs w:val="21"/>
-        </w:rPr>
-        <w:t xml:space="preserve">3. Post-Carve-Out SC Readiness Assessment (SUPPLY_CHAIN)</w:t>
-      </w:r>
-    </w:p>
-    <w:p>
-      <w:pPr>
-        <w:pStyle w:val="ListParagraph"/>
-        <w:numPr>
-          <w:ilvl w:val="0"/>
-          <w:numId w:val="1"/>
-        </w:numPr>
-        <w:spacing w:after="60"/>
-      </w:pPr>
-      <w:r>
-        <w:rPr>
-          <w:rFonts w:ascii="Calibri" w:cs="Calibri" w:eastAsia="Calibri" w:hAnsi="Calibri"/>
-          <w:color w:val="BBBBCC"/>
-          <w:sz w:val="21"/>
-          <w:szCs w:val="21"/>
-        </w:rPr>
-        <w:t xml:space="preserve">4. Tea SC Sourcing Diversification (PROCUREMENT)</w:t>
-      </w:r>
-    </w:p>
-    <w:p>
-      <w:pPr>
-        <w:pStyle w:val="ListParagraph"/>
-        <w:numPr>
-          <w:ilvl w:val="0"/>
-          <w:numId w:val="1"/>
-        </w:numPr>
-        <w:spacing w:after="60"/>
-      </w:pPr>
-      <w:r>
-        <w:rPr>
-          <w:rFonts w:ascii="Calibri" w:cs="Calibri" w:eastAsia="Calibri" w:hAnsi="Calibri"/>
-          <w:color w:val="BBBBCC"/>
-          <w:sz w:val="21"/>
-          <w:szCs w:val="21"/>
-        </w:rPr>
-        <w:t xml:space="preserve">5. D2C to Omnichannel GTM Transition (DISTRIBUTION_GTM)</w:t>
-      </w:r>
-    </w:p>
-    <w:p>
-      <w:pPr>
-        <w:pStyle w:val="ListParagraph"/>
-        <w:numPr>
-          <w:ilvl w:val="0"/>
-          <w:numId w:val="1"/>
-        </w:numPr>
-        <w:spacing w:after="60"/>
-      </w:pPr>
-      <w:r>
-        <w:rPr>
-          <w:rFonts w:ascii="Calibri" w:cs="Calibri" w:eastAsia="Calibri" w:hAnsi="Calibri"/>
-          <w:color w:val="BBBBCC"/>
-          <w:sz w:val="21"/>
-          <w:szCs w:val="21"/>
-        </w:rPr>
-        <w:t xml:space="preserve">6. Cold Chain SC Strategy &amp; Design (SUPPLY_CHAIN)</w:t>
-      </w:r>
-    </w:p>
-    <w:p>
-      <w:pPr>
-        <w:pStyle w:val="ListParagraph"/>
-        <w:numPr>
-          <w:ilvl w:val="0"/>
-          <w:numId w:val="1"/>
-        </w:numPr>
-        <w:spacing w:after="60"/>
-      </w:pPr>
-      <w:r>
-        <w:rPr>
-          <w:rFonts w:ascii="Calibri" w:cs="Calibri" w:eastAsia="Calibri" w:hAnsi="Calibri"/>
-          <w:color w:val="BBBBCC"/>
-          <w:sz w:val="21"/>
-          <w:szCs w:val="21"/>
-        </w:rPr>
-        <w:t xml:space="preserve">7. Modern Trade OTIF Penalty Reduction Programme (DISTRIBUTION_GTM)</w:t>
-      </w:r>
-    </w:p>
-    <w:p>
-      <w:pPr>
-        <w:pStyle w:val="ListParagraph"/>
-        <w:numPr>
-          <w:ilvl w:val="0"/>
-          <w:numId w:val="1"/>
-        </w:numPr>
-        <w:spacing w:after="60"/>
-      </w:pPr>
-      <w:r>
-        <w:rPr>
-          <w:rFonts w:ascii="Calibri" w:cs="Calibri" w:eastAsia="Calibri" w:hAnsi="Calibri"/>
-          <w:color w:val="BBBBCC"/>
-          <w:sz w:val="21"/>
-          <w:szCs w:val="21"/>
-        </w:rPr>
-        <w:t xml:space="preserve">8. GenAI SC Readiness &amp; Deployment Programme (IT_TECHNOLOGY)</w:t>
-      </w:r>
-    </w:p>
-    <w:p>
-      <w:pPr>
-        <w:pStyle w:val="ListParagraph"/>
-        <w:numPr>
-          <w:ilvl w:val="0"/>
-          <w:numId w:val="1"/>
-        </w:numPr>
-        <w:spacing w:after="60"/>
-      </w:pPr>
-      <w:r>
-        <w:rPr>
-          <w:rFonts w:ascii="Calibri" w:cs="Calibri" w:eastAsia="Calibri" w:hAnsi="Calibri"/>
-          <w:color w:val="BBBBCC"/>
-          <w:sz w:val="21"/>
-          <w:szCs w:val="21"/>
-        </w:rPr>
-        <w:t xml:space="preserve">9. EPR Compliance Supply Chain Programme (SUPPLY_CHAIN)</w:t>
-      </w:r>
-    </w:p>
-    <w:p>
-      <w:pPr>
-        <w:pStyle w:val="ListParagraph"/>
-        <w:numPr>
-          <w:ilvl w:val="0"/>
-          <w:numId w:val="1"/>
-        </w:numPr>
-        <w:spacing w:after="60"/>
-      </w:pPr>
-      <w:r>
-        <w:rPr>
-          <w:rFonts w:ascii="Calibri" w:cs="Calibri" w:eastAsia="Calibri" w:hAnsi="Calibri"/>
-          <w:color w:val="BBBBCC"/>
-          <w:sz w:val="21"/>
-          <w:szCs w:val="21"/>
-        </w:rPr>
-        <w:t xml:space="preserve">10. Manufacturing Excellence &amp; TPM Programme (SUPPLY_CHAIN)</w:t>
-      </w:r>
-    </w:p>
-    <w:p>
-      <w:pPr>
-        <w:spacing w:after="100" w:before="300"/>
-      </w:pPr>
-      <w:r>
-        <w:rPr>
-          <w:rFonts w:ascii="Calibri" w:cs="Calibri" w:eastAsia="Calibri" w:hAnsi="Calibri"/>
-          <w:b/>
-          <w:bCs/>
-          <w:color w:val="CCCCDD"/>
-          <w:sz w:val="28"/>
-          <w:szCs w:val="28"/>
-        </w:rPr>
-        <w:t xml:space="preserve">4g. Benchmark KPI Categories (24)</w:t>
-      </w:r>
-    </w:p>
-    <w:p>
-      <w:pPr>
-        <w:pStyle w:val="ListParagraph"/>
-        <w:numPr>
-          <w:ilvl w:val="0"/>
-          <w:numId w:val="1"/>
-        </w:numPr>
-        <w:spacing w:after="60"/>
-      </w:pPr>
-      <w:r>
-        <w:rPr>
-          <w:rFonts w:ascii="Calibri" w:cs="Calibri" w:eastAsia="Calibri" w:hAnsi="Calibri"/>
-          <w:color w:val="BBBBCC"/>
-          <w:sz w:val="21"/>
-          <w:szCs w:val="21"/>
-        </w:rPr>
-        <w:t xml:space="preserve">Supply Chain (8): Demand Forecast Accuracy (MAPE), Inventory Days on Hand (DSI), Perfect Order Fulfilment (OTIF), SC Cost as % Revenue, S&amp;OP Cycle Time, E-commerce Fill Rate, Cold Chain Loss Rate, New Product Introduction Lead Time</w:t>
-      </w:r>
-    </w:p>
-    <w:p>
-      <w:pPr>
-        <w:pStyle w:val="ListParagraph"/>
-        <w:numPr>
-          <w:ilvl w:val="0"/>
-          <w:numId w:val="1"/>
-        </w:numPr>
-        <w:spacing w:after="60"/>
-      </w:pPr>
-      <w:r>
-        <w:rPr>
-          <w:rFonts w:ascii="Calibri" w:cs="Calibri" w:eastAsia="Calibri" w:hAnsi="Calibri"/>
-          <w:color w:val="BBBBCC"/>
-          <w:sz w:val="21"/>
-          <w:szCs w:val="21"/>
-        </w:rPr>
-        <w:t xml:space="preserve">Procurement (5): Procurement Cost as % Revenue, Supplier Lead Time (Days), Procurement Savings Delivered, Supplier Concentration Risk, Scope 3 Emissions Transparency</w:t>
-      </w:r>
-    </w:p>
-    <w:p>
-      <w:pPr>
-        <w:pStyle w:val="ListParagraph"/>
-        <w:numPr>
-          <w:ilvl w:val="0"/>
-          <w:numId w:val="1"/>
-        </w:numPr>
-        <w:spacing w:after="60"/>
-      </w:pPr>
-      <w:r>
-        <w:rPr>
-          <w:rFonts w:ascii="Calibri" w:cs="Calibri" w:eastAsia="Calibri" w:hAnsi="Calibri"/>
-          <w:color w:val="BBBBCC"/>
-          <w:sz w:val="21"/>
-          <w:szCs w:val="21"/>
-        </w:rPr>
-        <w:t xml:space="preserve">Distribution (5): Distribution Reach (% Outlets), On-Shelf Availability, Digital Order Penetration, Distributor Return Rate, Trade Promotion Spend as % Revenue</w:t>
-      </w:r>
-    </w:p>
-    <w:p>
-      <w:pPr>
-        <w:pStyle w:val="ListParagraph"/>
-        <w:numPr>
-          <w:ilvl w:val="0"/>
-          <w:numId w:val="1"/>
-        </w:numPr>
-        <w:spacing w:after="60"/>
-      </w:pPr>
-      <w:r>
-        <w:rPr>
-          <w:rFonts w:ascii="Calibri" w:cs="Calibri" w:eastAsia="Calibri" w:hAnsi="Calibri"/>
-          <w:color w:val="BBBBCC"/>
-          <w:sz w:val="21"/>
-          <w:szCs w:val="21"/>
-        </w:rPr>
-        <w:t xml:space="preserve">Manufacturing (3): OEE, First-Time Quality Rate (FTQR), Manufacturing Cost Productivity</w:t>
-      </w:r>
-    </w:p>
-    <w:p>
-      <w:pPr>
-        <w:pStyle w:val="ListParagraph"/>
-        <w:numPr>
-          <w:ilvl w:val="0"/>
-          <w:numId w:val="1"/>
-        </w:numPr>
-        <w:spacing w:after="60"/>
-      </w:pPr>
-      <w:r>
-        <w:rPr>
-          <w:rFonts w:ascii="Calibri" w:cs="Calibri" w:eastAsia="Calibri" w:hAnsi="Calibri"/>
-          <w:color w:val="BBBBCC"/>
-          <w:sz w:val="21"/>
-          <w:szCs w:val="21"/>
-        </w:rPr>
-        <w:t xml:space="preserve">Financial (2): Gross Margin (%), Working Capital as % Revenue</w:t>
-      </w:r>
-    </w:p>
-    <w:p>
-      <w:pPr>
-        <w:pStyle w:val="ListParagraph"/>
-        <w:numPr>
-          <w:ilvl w:val="0"/>
-          <w:numId w:val="1"/>
-        </w:numPr>
-        <w:spacing w:after="60"/>
-      </w:pPr>
-      <w:r>
-        <w:rPr>
-          <w:rFonts w:ascii="Calibri" w:cs="Calibri" w:eastAsia="Calibri" w:hAnsi="Calibri"/>
-          <w:color w:val="BBBBCC"/>
-          <w:sz w:val="21"/>
-          <w:szCs w:val="21"/>
-        </w:rPr>
-        <w:t xml:space="preserve">Digital (1): SC Technology Maturity Score (1-5)</w:t>
-      </w:r>
-    </w:p>
-    <w:p>
-      <w:pPr>
-        <w:pStyle w:val="ListParagraph"/>
-        <w:numPr>
-          <w:ilvl w:val="0"/>
-          <w:numId w:val="1"/>
-        </w:numPr>
-        <w:spacing w:after="60"/>
-      </w:pPr>
-      <w:r>
-        <w:rPr>
-          <w:rFonts w:ascii="Calibri" w:cs="Calibri" w:eastAsia="Calibri" w:hAnsi="Calibri"/>
-          <w:color w:val="BBBBCC"/>
-          <w:sz w:val="21"/>
-          <w:szCs w:val="21"/>
-        </w:rPr>
-        <w:t xml:space="preserve">Sales (1): Revenue per Salesperson</w:t>
-      </w:r>
-    </w:p>
-    <w:p>
-      <w:pPr>
-        <w:pBdr>
-          <w:bottom w:val="single" w:color="2A2A44" w:sz="6"/>
-        </w:pBdr>
-        <w:spacing w:after="240" w:before="240"/>
-      </w:pPr>
-      <w:r>
-        <w:rPr>
-          <w:sz w:val="4"/>
-          <w:szCs w:val="4"/>
-        </w:rPr>
-        <w:t xml:space="preserve"/>
-      </w:r>
-    </w:p>
-    <w:p>
-      <w:pPr>
-        <w:pBdr>
-          <w:bottom w:val="single" w:color="333355" w:sz="4"/>
-        </w:pBdr>
-        <w:spacing w:after="160" w:before="560"/>
-      </w:pPr>
-      <w:r>
-        <w:rPr>
-          <w:rFonts w:ascii="Calibri" w:cs="Calibri" w:eastAsia="Calibri" w:hAnsi="Calibri"/>
-          <w:b/>
-          <w:bCs/>
-          <w:color w:val="6366F1"/>
-          <w:sz w:val="40"/>
-          <w:szCs w:val="40"/>
-        </w:rPr>
-        <w:t xml:space="preserve">5. API ENDPOINTS</w:t>
-      </w:r>
-    </w:p>
-    <w:p>
-      <w:pPr>
-        <w:spacing w:after="120"/>
-      </w:pPr>
-      <w:r>
-        <w:rPr>
-          <w:rFonts w:ascii="Calibri" w:cs="Calibri" w:eastAsia="Calibri" w:hAnsi="Calibri"/>
-          <w:color w:val="CCCCDD"/>
-          <w:sz w:val="22"/>
-          <w:szCs w:val="22"/>
-        </w:rPr>
-        <w:t xml:space="preserve">All routes under /api. OpenAPI spec: lib/api-spec/openapi.yaml. Codegen: pnpm --filter @workspace/api-spec run codegen → lib/api-client-react/.</w:t>
+        <w:t xml:space="preserve">GET  /api/healthz</w:t>
       </w:r>
     </w:p>
     <w:p>
@@ -3167,7 +2816,7 @@
           <w:sz w:val="18"/>
           <w:szCs w:val="18"/>
         </w:rPr>
-        <w:t xml:space="preserve">GET  /api/healthz</w:t>
+        <w:t xml:space="preserve">GET  /api/companies                   filters: geography, category</w:t>
       </w:r>
     </w:p>
     <w:p>
@@ -3182,7 +2831,7 @@
           <w:sz w:val="18"/>
           <w:szCs w:val="18"/>
         </w:rPr>
-        <w:t xml:space="preserve">GET  /api/companies                   filters: geography, category</w:t>
+        <w:t xml:space="preserve">GET  /api/companies/:id               + related signals + SHEI cards</w:t>
       </w:r>
     </w:p>
     <w:p>
@@ -3197,7 +2846,7 @@
           <w:sz w:val="18"/>
           <w:szCs w:val="18"/>
         </w:rPr>
-        <w:t xml:space="preserve">GET  /api/companies/:id               + related signals + SHEI cards</w:t>
+        <w:t xml:space="preserve">GET  /api/shei-cards                  filters: urgency, functionTag, status</w:t>
       </w:r>
     </w:p>
     <w:p>
@@ -3212,7 +2861,7 @@
           <w:sz w:val="18"/>
           <w:szCs w:val="18"/>
         </w:rPr>
-        <w:t xml:space="preserve">GET  /api/shei-cards                  filters: urgency, functionTag, status</w:t>
+        <w:t xml:space="preserve">GET  /api/shei-cards/:id</w:t>
       </w:r>
     </w:p>
     <w:p>
@@ -3227,7 +2876,7 @@
           <w:sz w:val="18"/>
           <w:szCs w:val="18"/>
         </w:rPr>
-        <w:t xml:space="preserve">GET  /api/shei-cards/:id</w:t>
+        <w:t xml:space="preserve">GET  /api/signals                     filters: strength, category, action, limit</w:t>
       </w:r>
     </w:p>
     <w:p>
@@ -3242,7 +2891,7 @@
           <w:sz w:val="18"/>
           <w:szCs w:val="18"/>
         </w:rPr>
-        <w:t xml:space="preserve">GET  /api/signals                     filters: strength, category, action, limit</w:t>
+        <w:t xml:space="preserve">GET  /api/benchmarks                  filter: functionTag</w:t>
       </w:r>
     </w:p>
     <w:p>
@@ -3257,7 +2906,7 @@
           <w:sz w:val="18"/>
           <w:szCs w:val="18"/>
         </w:rPr>
-        <w:t xml:space="preserve">GET  /api/benchmarks                  filter: functionTag</w:t>
+        <w:t xml:space="preserve">GET  /api/playbooks</w:t>
       </w:r>
     </w:p>
     <w:p>
@@ -3272,7 +2921,7 @@
           <w:sz w:val="18"/>
           <w:szCs w:val="18"/>
         </w:rPr>
-        <w:t xml:space="preserve">GET  /api/playbooks</w:t>
+        <w:t xml:space="preserve">GET  /api/dashboard/summary           aggregate stats</w:t>
       </w:r>
     </w:p>
     <w:p>
@@ -3287,7 +2936,7 @@
           <w:sz w:val="18"/>
           <w:szCs w:val="18"/>
         </w:rPr>
-        <w:t xml:space="preserve">GET  /api/dashboard/summary           aggregate stats</w:t>
+        <w:t xml:space="preserve">GET  /api/dashboard/recent-signals    ALL signals ordered DESC by createdAt</w:t>
       </w:r>
     </w:p>
     <w:p>
@@ -3302,7 +2951,7 @@
           <w:sz w:val="18"/>
           <w:szCs w:val="18"/>
         </w:rPr>
-        <w:t xml:space="preserve">GET  /api/dashboard/recent-signals    ALL signals ordered DESC by createdAt</w:t>
+        <w:t xml:space="preserve">POST /api/ask                         streaming SSE AI chat</w:t>
       </w:r>
     </w:p>
     <w:p>
@@ -3317,21 +2966,6 @@
           <w:sz w:val="18"/>
           <w:szCs w:val="18"/>
         </w:rPr>
-        <w:t xml:space="preserve">POST /api/ask                         streaming SSE AI chat</w:t>
-      </w:r>
-    </w:p>
-    <w:p>
-      <w:pPr>
-        <w:spacing w:after="40" w:before="40"/>
-        <w:ind w:left="400"/>
-      </w:pPr>
-      <w:r>
-        <w:rPr>
-          <w:rFonts w:ascii="Courier New" w:cs="Courier New" w:eastAsia="Courier New" w:hAnsi="Courier New"/>
-          <w:color w:val="55DD55"/>
-          <w:sz w:val="18"/>
-          <w:szCs w:val="18"/>
-        </w:rPr>
         <w:t xml:space="preserve">POST /api/admin/reseed                unconditional full reseed</w:t>
       </w:r>
     </w:p>
@@ -3376,7 +3010,7 @@
           <w:sz w:val="22"/>
           <w:szCs w:val="22"/>
         </w:rPr>
-        <w:t xml:space="preserve">Response headers: Content-Type: text/event-stream | Cache-Control: no-cache | Connection: keep-alive | X-Accel-Buffering: no</w:t>
+        <w:t xml:space="preserve">Response: Content-Type: text/event-stream | data: {"content":"token"}\n\n per chunk | data: [DONE]\n\n on completion</w:t>
       </w:r>
     </w:p>
     <w:p>
@@ -3390,21 +3024,7 @@
           <w:sz w:val="22"/>
           <w:szCs w:val="22"/>
         </w:rPr>
-        <w:t xml:space="preserve">Stream: data: {"content":"token"}\n\n per chunk  ·  data: [DONE]\n\n on completion</w:t>
-      </w:r>
-    </w:p>
-    <w:p>
-      <w:pPr>
-        <w:spacing w:after="120"/>
-      </w:pPr>
-      <w:r>
-        <w:rPr>
-          <w:rFonts w:ascii="Calibri" w:cs="Calibri" w:eastAsia="Calibri" w:hAnsi="Calibri"/>
-          <w:color w:val="CCCCDD"/>
-          <w:sz w:val="22"/>
-          <w:szCs w:val="22"/>
-        </w:rPr>
-        <w:t xml:space="preserve">Server flow: (1) Promise.all pulls companies, shei_cards, signals, benchmarks from DB. (2) Builds v3.0 4-agent system prompt with live DB context. (3) openai.chat.completions.create({ model: "gpt-4o", stream: true, max_completion_tokens: 2500 }). (4) for await chunk → res.write(). (5) Error: headers not sent → 500 JSON; else write error event and end.</w:t>
+        <w:t xml:space="preserve">Server flow: (1) Promise.all pulls companies, shei_cards, signals, benchmarks from DB. (2) Builds v3.0 4-agent system prompt with live DB context. (3) openai.chat.completions.create({ model: "gpt-4o", stream: true, max_completion_tokens: 2500 }). (4) for await chunk → res.write(). (5) Error handling.</w:t>
       </w:r>
     </w:p>
     <w:p>
@@ -3490,7 +3110,7 @@
           <w:sz w:val="21"/>
           <w:szCs w:val="21"/>
         </w:rPr>
-        <w:t xml:space="preserve">Sidebar: w-64 (256px), bg-card, border-r border-border, forced dark mode</w:t>
+        <w:t xml:space="preserve">Sidebar: w-64, bg-card, border-r border-border, forced dark mode via useEffect on mount</w:t>
       </w:r>
     </w:p>
     <w:p>
@@ -3528,25 +3148,6 @@
           <w:sz w:val="21"/>
           <w:szCs w:val="21"/>
         </w:rPr>
-        <w:t xml:space="preserve">Dark mode: document.documentElement.classList.add("dark") in App.tsx useEffect on mount</w:t>
-      </w:r>
-    </w:p>
-    <w:p>
-      <w:pPr>
-        <w:pStyle w:val="ListParagraph"/>
-        <w:numPr>
-          <w:ilvl w:val="0"/>
-          <w:numId w:val="1"/>
-        </w:numPr>
-        <w:spacing w:after="60"/>
-      </w:pPr>
-      <w:r>
-        <w:rPr>
-          <w:rFonts w:ascii="Calibri" w:cs="Calibri" w:eastAsia="Calibri" w:hAnsi="Calibri"/>
-          <w:color w:val="BBBBCC"/>
-          <w:sz w:val="21"/>
-          <w:szCs w:val="21"/>
-        </w:rPr>
         <w:t xml:space="preserve">Nav — INTELLIGENCE: Dashboard (/), Companies (/companies), SHEI Cards (/shei-cards), Benchmarks (/benchmarks)</w:t>
       </w:r>
     </w:p>
@@ -3605,25 +3206,6 @@
           <w:szCs w:val="21"/>
         </w:rPr>
         <w:t xml:space="preserve">"Refresh Data" button at sidebar bottom: POST /api/admin/reseed → 1.5s success state → window.location.reload()</w:t>
-      </w:r>
-    </w:p>
-    <w:p>
-      <w:pPr>
-        <w:pStyle w:val="ListParagraph"/>
-        <w:numPr>
-          <w:ilvl w:val="0"/>
-          <w:numId w:val="1"/>
-        </w:numPr>
-        <w:spacing w:after="60"/>
-      </w:pPr>
-      <w:r>
-        <w:rPr>
-          <w:rFonts w:ascii="Calibri" w:cs="Calibri" w:eastAsia="Calibri" w:hAnsi="Calibri"/>
-          <w:color w:val="BBBBCC"/>
-          <w:sz w:val="21"/>
-          <w:szCs w:val="21"/>
-        </w:rPr>
-        <w:t xml:space="preserve">Main content: flex-1 overflow-y-auto · p-8 max-w-7xl mx-auto</w:t>
       </w:r>
     </w:p>
     <w:p>
@@ -3658,45 +3240,45 @@
           <w:sz w:val="21"/>
           <w:szCs w:val="21"/>
         </w:rPr>
-        <w:t xml:space="preserve">5 clickable stat cards: Companies (T1/T2 split), SHEI Hypotheses, Live Signals, Benchmarks, Playbooks</w:t>
-      </w:r>
-    </w:p>
-    <w:p>
-      <w:pPr>
-        <w:pStyle w:val="ListParagraph"/>
-        <w:numPr>
-          <w:ilvl w:val="0"/>
-          <w:numId w:val="1"/>
-        </w:numPr>
-        <w:spacing w:after="60"/>
-      </w:pPr>
-      <w:r>
-        <w:rPr>
-          <w:rFonts w:ascii="Calibri" w:cs="Calibri" w:eastAsia="Calibri" w:hAnsi="Calibri"/>
-          <w:color w:val="BBBBCC"/>
-          <w:sz w:val="21"/>
-          <w:szCs w:val="21"/>
-        </w:rPr>
-        <w:t xml:space="preserve">Recent Signals: 8 newest — strength badge, action badge, trajectory arrow, company, quarter</w:t>
-      </w:r>
-    </w:p>
-    <w:p>
-      <w:pPr>
-        <w:pStyle w:val="ListParagraph"/>
-        <w:numPr>
-          <w:ilvl w:val="0"/>
-          <w:numId w:val="1"/>
-        </w:numPr>
-        <w:spacing w:after="60"/>
-      </w:pPr>
-      <w:r>
-        <w:rPr>
-          <w:rFonts w:ascii="Calibri" w:cs="Calibri" w:eastAsia="Calibri" w:hAnsi="Calibri"/>
-          <w:color w:val="BBBBCC"/>
-          <w:sz w:val="21"/>
-          <w:szCs w:val="21"/>
-        </w:rPr>
-        <w:t xml:space="preserve">Active SHEI Cards: ALL where urgency=IMMEDIATE OR status=ACTIVE</w:t>
+        <w:t xml:space="preserve">5 clickable stat cards: Companies (T1/T2 split), SHEI Hypotheses (immediate count), Signals (high strength count), Benchmarks, Playbooks</w:t>
+      </w:r>
+    </w:p>
+    <w:p>
+      <w:pPr>
+        <w:pStyle w:val="ListParagraph"/>
+        <w:numPr>
+          <w:ilvl w:val="0"/>
+          <w:numId w:val="1"/>
+        </w:numPr>
+        <w:spacing w:after="60"/>
+      </w:pPr>
+      <w:r>
+        <w:rPr>
+          <w:rFonts w:ascii="Calibri" w:cs="Calibri" w:eastAsia="Calibri" w:hAnsi="Calibri"/>
+          <w:color w:val="BBBBCC"/>
+          <w:sz w:val="21"/>
+          <w:szCs w:val="21"/>
+        </w:rPr>
+        <w:t xml:space="preserve">Recent Signals panel: 8 newest signals — strength badge, source, company, quarter</w:t>
+      </w:r>
+    </w:p>
+    <w:p>
+      <w:pPr>
+        <w:pStyle w:val="ListParagraph"/>
+        <w:numPr>
+          <w:ilvl w:val="0"/>
+          <w:numId w:val="1"/>
+        </w:numPr>
+        <w:spacing w:after="60"/>
+      </w:pPr>
+      <w:r>
+        <w:rPr>
+          <w:rFonts w:ascii="Calibri" w:cs="Calibri" w:eastAsia="Calibri" w:hAnsi="Calibri"/>
+          <w:color w:val="BBBBCC"/>
+          <w:sz w:val="21"/>
+          <w:szCs w:val="21"/>
+        </w:rPr>
+        <w:t xml:space="preserve">Active Hypotheses panel: ALL cards where urgency=IMMEDIATE OR status=ACTIVE — urgency badge (IMMEDIATE=red, MEDIUM_TERM=amber, STRUCTURAL=blue)</w:t>
       </w:r>
     </w:p>
     <w:p>
@@ -3731,45 +3313,45 @@
           <w:sz w:val="21"/>
           <w:szCs w:val="21"/>
         </w:rPr>
-        <w:t xml:space="preserve">Filter: Geography dropdown, text search, SHEI score sort · 3-wide card grid</w:t>
-      </w:r>
-    </w:p>
-    <w:p>
-      <w:pPr>
-        <w:pStyle w:val="ListParagraph"/>
-        <w:numPr>
-          <w:ilvl w:val="0"/>
-          <w:numId w:val="1"/>
-        </w:numPr>
-        <w:spacing w:after="60"/>
-      </w:pPr>
-      <w:r>
-        <w:rPr>
-          <w:rFonts w:ascii="Calibri" w:cs="Calibri" w:eastAsia="Calibri" w:hAnsi="Calibri"/>
-          <w:color w:val="BBBBCC"/>
-          <w:sz w:val="21"/>
-          <w:szCs w:val="21"/>
-        </w:rPr>
-        <w:t xml:space="preserve">Detail — 5 tabs: Overview | SC Intelligence | Strategic Priorities | Open Problems | Consulting Angle</w:t>
-      </w:r>
-    </w:p>
-    <w:p>
-      <w:pPr>
-        <w:pStyle w:val="ListParagraph"/>
-        <w:numPr>
-          <w:ilvl w:val="0"/>
-          <w:numId w:val="1"/>
-        </w:numPr>
-        <w:spacing w:after="60"/>
-      </w:pPr>
-      <w:r>
-        <w:rPr>
-          <w:rFonts w:ascii="Calibri" w:cs="Calibri" w:eastAsia="Calibri" w:hAnsi="Calibri"/>
-          <w:color w:val="BBBBCC"/>
-          <w:sz w:val="21"/>
-          <w:szCs w:val="21"/>
-        </w:rPr>
-        <w:t xml:space="preserve">ALL related signals shown — text match on companyName (no count cap)</w:t>
+        <w:t xml:space="preserve">Filter: Geography dropdown (INDIA/GLOBAL), text search · 3-wide card grid</w:t>
+      </w:r>
+    </w:p>
+    <w:p>
+      <w:pPr>
+        <w:pStyle w:val="ListParagraph"/>
+        <w:numPr>
+          <w:ilvl w:val="0"/>
+          <w:numId w:val="1"/>
+        </w:numPr>
+        <w:spacing w:after="60"/>
+      </w:pPr>
+      <w:r>
+        <w:rPr>
+          <w:rFonts w:ascii="Calibri" w:cs="Calibri" w:eastAsia="Calibri" w:hAnsi="Calibri"/>
+          <w:color w:val="BBBBCC"/>
+          <w:sz w:val="21"/>
+          <w:szCs w:val="21"/>
+        </w:rPr>
+        <w:t xml:space="preserve">Detail — financial KPI row + Quick Take + Strategic Priorities + SC Intelligence + Open Problems + Consulting Angle</w:t>
+      </w:r>
+    </w:p>
+    <w:p>
+      <w:pPr>
+        <w:pStyle w:val="ListParagraph"/>
+        <w:numPr>
+          <w:ilvl w:val="0"/>
+          <w:numId w:val="1"/>
+        </w:numPr>
+        <w:spacing w:after="60"/>
+      </w:pPr>
+      <w:r>
+        <w:rPr>
+          <w:rFonts w:ascii="Calibri" w:cs="Calibri" w:eastAsia="Calibri" w:hAnsi="Calibri"/>
+          <w:color w:val="BBBBCC"/>
+          <w:sz w:val="21"/>
+          <w:szCs w:val="21"/>
+        </w:rPr>
+        <w:t xml:space="preserve">Related SHEI cards matched via relatedCompanies text field; related signals matched via companyName</w:t>
       </w:r>
     </w:p>
     <w:p>
@@ -3804,64 +3386,45 @@
           <w:sz w:val="21"/>
           <w:szCs w:val="21"/>
         </w:rPr>
-        <w:t xml:space="preserve">Filter: urgency, functionTag, status</w:t>
-      </w:r>
-    </w:p>
-    <w:p>
-      <w:pPr>
-        <w:pStyle w:val="ListParagraph"/>
-        <w:numPr>
-          <w:ilvl w:val="0"/>
-          <w:numId w:val="1"/>
-        </w:numPr>
-        <w:spacing w:after="60"/>
-      </w:pPr>
-      <w:r>
-        <w:rPr>
-          <w:rFonts w:ascii="Calibri" w:cs="Calibri" w:eastAsia="Calibri" w:hAnsi="Calibri"/>
-          <w:color w:val="BBBBCC"/>
-          <w:sz w:val="21"/>
-          <w:szCs w:val="21"/>
-        </w:rPr>
-        <w:t xml:space="preserve">Detail — 4-panel SHEI: S=Signal (blue), H=Hypothesis (amber), E=Evidence (emerald), I=Implication (indigo)</w:t>
-      </w:r>
-    </w:p>
-    <w:p>
-      <w:pPr>
-        <w:pStyle w:val="ListParagraph"/>
-        <w:numPr>
-          <w:ilvl w:val="0"/>
-          <w:numId w:val="1"/>
-        </w:numPr>
-        <w:spacing w:after="60"/>
-      </w:pPr>
-      <w:r>
-        <w:rPr>
-          <w:rFonts w:ascii="Calibri" w:cs="Calibri" w:eastAsia="Calibri" w:hAnsi="Calibri"/>
-          <w:color w:val="BBBBCC"/>
-          <w:sz w:val="21"/>
-          <w:szCs w:val="21"/>
-        </w:rPr>
-        <w:t xml:space="preserve">v3.0 panels: Contradictions (orange), KPI Linkage (multi-chip), Trajectory, Financial Impact, Why Now, Thoucentric Angle</w:t>
-      </w:r>
-    </w:p>
-    <w:p>
-      <w:pPr>
-        <w:pStyle w:val="ListParagraph"/>
-        <w:numPr>
-          <w:ilvl w:val="0"/>
-          <w:numId w:val="1"/>
-        </w:numPr>
-        <w:spacing w:after="60"/>
-      </w:pPr>
-      <w:r>
-        <w:rPr>
-          <w:rFonts w:ascii="Calibri" w:cs="Calibri" w:eastAsia="Calibri" w:hAnsi="Calibri"/>
-          <w:color w:val="BBBBCC"/>
-          <w:sz w:val="21"/>
-          <w:szCs w:val="21"/>
-        </w:rPr>
-        <w:t xml:space="preserve">Right sidebar: Signal Cluster chips, Related Companies chips, Pitch Anchor, Provocative Question</w:t>
+        <w:t xml:space="preserve">Filters: urgency (IMMEDIATE/MEDIUM_TERM/STRUCTURAL), functionTag, status (ACTIVE/INVESTIGATING/CLOSED)</w:t>
+      </w:r>
+    </w:p>
+    <w:p>
+      <w:pPr>
+        <w:pStyle w:val="ListParagraph"/>
+        <w:numPr>
+          <w:ilvl w:val="0"/>
+          <w:numId w:val="1"/>
+        </w:numPr>
+        <w:spacing w:after="60"/>
+      </w:pPr>
+      <w:r>
+        <w:rPr>
+          <w:rFonts w:ascii="Calibri" w:cs="Calibri" w:eastAsia="Calibri" w:hAnsi="Calibri"/>
+          <w:color w:val="BBBBCC"/>
+          <w:sz w:val="21"/>
+          <w:szCs w:val="21"/>
+        </w:rPr>
+        <w:t xml:space="preserve">functionTag labels: SUPPLY_CHAIN | PROCUREMENT | DISTRIBUTION_GTM | IT_TECHNOLOGY | SALES_DISTRIBUTION | FINANCIAL | ESG | MANUFACTURING</w:t>
+      </w:r>
+    </w:p>
+    <w:p>
+      <w:pPr>
+        <w:pStyle w:val="ListParagraph"/>
+        <w:numPr>
+          <w:ilvl w:val="0"/>
+          <w:numId w:val="1"/>
+        </w:numPr>
+        <w:spacing w:after="60"/>
+      </w:pPr>
+      <w:r>
+        <w:rPr>
+          <w:rFonts w:ascii="Calibri" w:cs="Calibri" w:eastAsia="Calibri" w:hAnsi="Calibri"/>
+          <w:color w:val="BBBBCC"/>
+          <w:sz w:val="21"/>
+          <w:szCs w:val="21"/>
+        </w:rPr>
+        <w:t xml:space="preserve">Detail — trajectory banner, financial impact + why now, 4-panel SHEI (S/H/E/I), contradictions, KPI linkage, signal cluster, pitch anchor, provocative question, related companies</w:t>
       </w:r>
     </w:p>
     <w:p>
@@ -3896,26 +3459,26 @@
           <w:sz w:val="21"/>
           <w:szCs w:val="21"/>
         </w:rPr>
-        <w:t xml:space="preserve">Filter: functionTag · Visual spectrum bar: best-in-class → median → laggard</w:t>
-      </w:r>
-    </w:p>
-    <w:p>
-      <w:pPr>
-        <w:pStyle w:val="ListParagraph"/>
-        <w:numPr>
-          <w:ilvl w:val="0"/>
-          <w:numId w:val="1"/>
-        </w:numPr>
-        <w:spacing w:after="60"/>
-      </w:pPr>
-      <w:r>
-        <w:rPr>
-          <w:rFonts w:ascii="Calibri" w:cs="Calibri" w:eastAsia="Calibri" w:hAnsi="Calibri"/>
-          <w:color w:val="BBBBCC"/>
-          <w:sz w:val="21"/>
-          <w:szCs w:val="21"/>
-        </w:rPr>
-        <w:t xml:space="preserve">Expandable: definition, calculationLogic, indiaContext, companyExamples, improvementLevers</w:t>
+        <w:t xml:space="preserve">Filter: functionTag · Grouped by function · Best/Median/Laggard spectrum card · Click → full drill-down dialog</w:t>
+      </w:r>
+    </w:p>
+    <w:p>
+      <w:pPr>
+        <w:pStyle w:val="ListParagraph"/>
+        <w:numPr>
+          <w:ilvl w:val="0"/>
+          <w:numId w:val="1"/>
+        </w:numPr>
+        <w:spacing w:after="60"/>
+      </w:pPr>
+      <w:r>
+        <w:rPr>
+          <w:rFonts w:ascii="Calibri" w:cs="Calibri" w:eastAsia="Calibri" w:hAnsi="Calibri"/>
+          <w:color w:val="BBBBCC"/>
+          <w:sz w:val="21"/>
+          <w:szCs w:val="21"/>
+        </w:rPr>
+        <w:t xml:space="preserve">Dialog shows: definition, performance tiers, company examples, India context, why it matters, consulting entry point, improvement levers, SHEI link</w:t>
       </w:r>
     </w:p>
     <w:p>
@@ -3950,45 +3513,26 @@
           <w:sz w:val="21"/>
           <w:szCs w:val="21"/>
         </w:rPr>
-        <w:t xml:space="preserve">Filters: Strength, Action, Category, Scope, text search</w:t>
-      </w:r>
-    </w:p>
-    <w:p>
-      <w:pPr>
-        <w:pStyle w:val="ListParagraph"/>
-        <w:numPr>
-          <w:ilvl w:val="0"/>
-          <w:numId w:val="1"/>
-        </w:numPr>
-        <w:spacing w:after="60"/>
-      </w:pPr>
-      <w:r>
-        <w:rPr>
-          <w:rFonts w:ascii="Calibri" w:cs="Calibri" w:eastAsia="Calibri" w:hAnsi="Calibri"/>
-          <w:color w:val="BBBBCC"/>
-          <w:sz w:val="21"/>
-          <w:szCs w:val="21"/>
-        </w:rPr>
-        <w:t xml:space="preserve">Each row: strength badge, action badge, scope tag, trajectory arrow, company, quarter, eventType</w:t>
-      </w:r>
-    </w:p>
-    <w:p>
-      <w:pPr>
-        <w:pStyle w:val="ListParagraph"/>
-        <w:numPr>
-          <w:ilvl w:val="0"/>
-          <w:numId w:val="1"/>
-        </w:numPr>
-        <w:spacing w:after="60"/>
-      </w:pPr>
-      <w:r>
-        <w:rPr>
-          <w:rFonts w:ascii="Calibri" w:cs="Calibri" w:eastAsia="Calibri" w:hAnsi="Calibri"/>
-          <w:color w:val="BBBBCC"/>
-          <w:sz w:val="21"/>
-          <w:szCs w:val="21"/>
-        </w:rPr>
-        <w:t xml:space="preserve">Trajectory: pastState → trajectoryDir → summary | Expandable: financialImpact + scRelevance</w:t>
+        <w:t xml:space="preserve">Filters: Strength (HIGH/MEDIUM/LOW), Action (ACT_NOW/INVESTIGATE/MONITOR), Category (SUPPLY_CHAIN/PROCUREMENT/DISTRIBUTION_GTM/DIGITAL/ESG/MANUFACTURING), Scope</w:t>
+      </w:r>
+    </w:p>
+    <w:p>
+      <w:pPr>
+        <w:pStyle w:val="ListParagraph"/>
+        <w:numPr>
+          <w:ilvl w:val="0"/>
+          <w:numId w:val="1"/>
+        </w:numPr>
+        <w:spacing w:after="60"/>
+      </w:pPr>
+      <w:r>
+        <w:rPr>
+          <w:rFonts w:ascii="Calibri" w:cs="Calibri" w:eastAsia="Calibri" w:hAnsi="Calibri"/>
+          <w:color w:val="BBBBCC"/>
+          <w:sz w:val="21"/>
+          <w:szCs w:val="21"/>
+        </w:rPr>
+        <w:t xml:space="preserve">Each card: strength badge, action badge, category badge (correct enum colours), scope badge, eventType, company, quarter, trajectory block (pastState → trajectoryDir), financial impact, SC relevance, source</w:t>
       </w:r>
     </w:p>
     <w:p>
@@ -4023,7 +3567,45 @@
           <w:sz w:val="21"/>
           <w:szCs w:val="21"/>
         </w:rPr>
-        <w:t xml:space="preserve">Chronological signals by publishedDate, grouped by quarter, vertical connector line</w:t>
+        <w:t xml:space="preserve">Chronological by publishedDate, grouped by quarter — vertical connector line with strength-coloured dots</w:t>
+      </w:r>
+    </w:p>
+    <w:p>
+      <w:pPr>
+        <w:pStyle w:val="ListParagraph"/>
+        <w:numPr>
+          <w:ilvl w:val="0"/>
+          <w:numId w:val="1"/>
+        </w:numPr>
+        <w:spacing w:after="60"/>
+      </w:pPr>
+      <w:r>
+        <w:rPr>
+          <w:rFonts w:ascii="Calibri" w:cs="Calibri" w:eastAsia="Calibri" w:hAnsi="Calibri"/>
+          <w:color w:val="BBBBCC"/>
+          <w:sz w:val="21"/>
+          <w:szCs w:val="21"/>
+        </w:rPr>
+        <w:t xml:space="preserve">Filters: Strength, Category (SUPPLY_CHAIN/PROCUREMENT/DISTRIBUTION_GTM/DIGITAL/ESG/MANUFACTURING)</w:t>
+      </w:r>
+    </w:p>
+    <w:p>
+      <w:pPr>
+        <w:pStyle w:val="ListParagraph"/>
+        <w:numPr>
+          <w:ilvl w:val="0"/>
+          <w:numId w:val="1"/>
+        </w:numPr>
+        <w:spacing w:after="60"/>
+      </w:pPr>
+      <w:r>
+        <w:rPr>
+          <w:rFonts w:ascii="Calibri" w:cs="Calibri" w:eastAsia="Calibri" w:hAnsi="Calibri"/>
+          <w:color w:val="BBBBCC"/>
+          <w:sz w:val="21"/>
+          <w:szCs w:val="21"/>
+        </w:rPr>
+        <w:t xml:space="preserve">Each entry shows action badge (ACT_NOW=red, INVESTIGATE=amber, MONITOR=muted), eventType, company, date, financial impact</w:t>
       </w:r>
     </w:p>
     <w:p>
@@ -4077,45 +3659,64 @@
           <w:sz w:val="21"/>
           <w:szCs w:val="21"/>
         </w:rPr>
-        <w:t xml:space="preserve">7 Thoucentric capability chips mapped to functionTags</w:t>
-      </w:r>
-    </w:p>
-    <w:p>
-      <w:pPr>
-        <w:pStyle w:val="ListParagraph"/>
-        <w:numPr>
-          <w:ilvl w:val="0"/>
-          <w:numId w:val="1"/>
-        </w:numPr>
-        <w:spacing w:after="60"/>
-      </w:pPr>
-      <w:r>
-        <w:rPr>
-          <w:rFonts w:ascii="Calibri" w:cs="Calibri" w:eastAsia="Calibri" w:hAnsi="Calibri"/>
-          <w:color w:val="BBBBCC"/>
-          <w:sz w:val="21"/>
-          <w:szCs w:val="21"/>
-        </w:rPr>
-        <w:t xml:space="preserve">ALL 15 SHEI cards sorted IMMEDIATE→MEDIUM_TERM→STRUCTURAL with pitchAnchor + provocQuestion</w:t>
-      </w:r>
-    </w:p>
-    <w:p>
-      <w:pPr>
-        <w:pStyle w:val="ListParagraph"/>
-        <w:numPr>
-          <w:ilvl w:val="0"/>
-          <w:numId w:val="1"/>
-        </w:numPr>
-        <w:spacing w:after="60"/>
-      </w:pPr>
-      <w:r>
-        <w:rPr>
-          <w:rFonts w:ascii="Calibri" w:cs="Calibri" w:eastAsia="Calibri" w:hAnsi="Calibri"/>
-          <w:color w:val="BBBBCC"/>
-          <w:sz w:val="21"/>
-          <w:szCs w:val="21"/>
-        </w:rPr>
-        <w:t xml:space="preserve">Signal Action Queue + ALL 24 benchmarks with group headers</w:t>
+        <w:t xml:space="preserve">7 Thoucentric capability chips</w:t>
+      </w:r>
+    </w:p>
+    <w:p>
+      <w:pPr>
+        <w:pStyle w:val="ListParagraph"/>
+        <w:numPr>
+          <w:ilvl w:val="0"/>
+          <w:numId w:val="1"/>
+        </w:numPr>
+        <w:spacing w:after="60"/>
+      </w:pPr>
+      <w:r>
+        <w:rPr>
+          <w:rFonts w:ascii="Calibri" w:cs="Calibri" w:eastAsia="Calibri" w:hAnsi="Calibri"/>
+          <w:color w:val="BBBBCC"/>
+          <w:sz w:val="21"/>
+          <w:szCs w:val="21"/>
+        </w:rPr>
+        <w:t xml:space="preserve">ALL 15 SHEI cards sorted IMMEDIATE→MEDIUM_TERM→STRUCTURAL with financial impact, Thoucentric angle, pitch anchor, provocative question, target companies</w:t>
+      </w:r>
+    </w:p>
+    <w:p>
+      <w:pPr>
+        <w:pStyle w:val="ListParagraph"/>
+        <w:numPr>
+          <w:ilvl w:val="0"/>
+          <w:numId w:val="1"/>
+        </w:numPr>
+        <w:spacing w:after="60"/>
+      </w:pPr>
+      <w:r>
+        <w:rPr>
+          <w:rFonts w:ascii="Calibri" w:cs="Calibri" w:eastAsia="Calibri" w:hAnsi="Calibri"/>
+          <w:color w:val="BBBBCC"/>
+          <w:sz w:val="21"/>
+          <w:szCs w:val="21"/>
+        </w:rPr>
+        <w:t xml:space="preserve">Emerging Opportunities: HIGH strength ACT_NOW/INVESTIGATE signals as SHEI candidates</w:t>
+      </w:r>
+    </w:p>
+    <w:p>
+      <w:pPr>
+        <w:pStyle w:val="ListParagraph"/>
+        <w:numPr>
+          <w:ilvl w:val="0"/>
+          <w:numId w:val="1"/>
+        </w:numPr>
+        <w:spacing w:after="60"/>
+      </w:pPr>
+      <w:r>
+        <w:rPr>
+          <w:rFonts w:ascii="Calibri" w:cs="Calibri" w:eastAsia="Calibri" w:hAnsi="Calibri"/>
+          <w:color w:val="BBBBCC"/>
+          <w:sz w:val="21"/>
+          <w:szCs w:val="21"/>
+        </w:rPr>
+        <w:t xml:space="preserve">KPI Gap → Entry Points: all 24 benchmarks with best/laggard gap and consulting angle</w:t>
       </w:r>
     </w:p>
     <w:p>
@@ -4169,26 +3770,26 @@
           <w:sz w:val="21"/>
           <w:szCs w:val="21"/>
         </w:rPr>
-        <w:t xml:space="preserve">Streaming SSE token-by-token via react-markdown. Stop button during streaming.</w:t>
-      </w:r>
-    </w:p>
-    <w:p>
-      <w:pPr>
-        <w:pStyle w:val="ListParagraph"/>
-        <w:numPr>
-          <w:ilvl w:val="0"/>
-          <w:numId w:val="1"/>
-        </w:numPr>
-        <w:spacing w:after="60"/>
-      </w:pPr>
-      <w:r>
-        <w:rPr>
-          <w:rFonts w:ascii="Calibri" w:cs="Calibri" w:eastAsia="Calibri" w:hAnsi="Calibri"/>
-          <w:color w:val="BBBBCC"/>
-          <w:sz w:val="21"/>
-          <w:szCs w:val="21"/>
-        </w:rPr>
-        <w:t xml:space="preserve">5 example prompts empty state. Model: GPT-4o, max 2500 tokens.</w:t>
+        <w:t xml:space="preserve">Streaming SSE token-by-token via react-markdown. Stop button during streaming. 5 example prompts empty state.</w:t>
+      </w:r>
+    </w:p>
+    <w:p>
+      <w:pPr>
+        <w:pStyle w:val="ListParagraph"/>
+        <w:numPr>
+          <w:ilvl w:val="0"/>
+          <w:numId w:val="1"/>
+        </w:numPr>
+        <w:spacing w:after="60"/>
+      </w:pPr>
+      <w:r>
+        <w:rPr>
+          <w:rFonts w:ascii="Calibri" w:cs="Calibri" w:eastAsia="Calibri" w:hAnsi="Calibri"/>
+          <w:color w:val="BBBBCC"/>
+          <w:sz w:val="21"/>
+          <w:szCs w:val="21"/>
+        </w:rPr>
+        <w:t xml:space="preserve">Model: GPT-4o, max 2500 tokens</w:t>
       </w:r>
     </w:p>
     <w:p>
@@ -4223,7 +3824,64 @@
           <w:sz w:val="21"/>
           <w:szCs w:val="21"/>
         </w:rPr>
-        <w:t xml:space="preserve">10 published blueprints: triggerSignals, whyItMatters, failureModes, technologyEnablers, consultingEntryPoints</w:t>
+        <w:t xml:space="preserve">10 published engagement blueprints grouped by functionTag</w:t>
+      </w:r>
+    </w:p>
+    <w:p>
+      <w:pPr>
+        <w:pStyle w:val="ListParagraph"/>
+        <w:numPr>
+          <w:ilvl w:val="0"/>
+          <w:numId w:val="1"/>
+        </w:numPr>
+        <w:spacing w:after="60"/>
+      </w:pPr>
+      <w:r>
+        <w:rPr>
+          <w:rFonts w:ascii="Calibri" w:cs="Calibri" w:eastAsia="Calibri" w:hAnsi="Calibri"/>
+          <w:color w:val="BBBBCC"/>
+          <w:sz w:val="21"/>
+          <w:szCs w:val="21"/>
+        </w:rPr>
+        <w:t xml:space="preserve">Each card shows: sectionNumber, functionTag, status, title, whyItMatters preview</w:t>
+      </w:r>
+    </w:p>
+    <w:p>
+      <w:pPr>
+        <w:pStyle w:val="ListParagraph"/>
+        <w:numPr>
+          <w:ilvl w:val="0"/>
+          <w:numId w:val="1"/>
+        </w:numPr>
+        <w:spacing w:after="60"/>
+      </w:pPr>
+      <w:r>
+        <w:rPr>
+          <w:rFonts w:ascii="Calibri" w:cs="Calibri" w:eastAsia="Calibri" w:hAnsi="Calibri"/>
+          <w:color w:val="BBBBCC"/>
+          <w:sz w:val="21"/>
+          <w:szCs w:val="21"/>
+        </w:rPr>
+        <w:t xml:space="preserve">Expanded view: Trigger Signals (chips), Why It Matters, Industry Landscape, What Good Looks Like, Failure Modes (numbered), Technology Enablers (chips), Consulting Entry Points</w:t>
+      </w:r>
+    </w:p>
+    <w:p>
+      <w:pPr>
+        <w:pStyle w:val="ListParagraph"/>
+        <w:numPr>
+          <w:ilvl w:val="0"/>
+          <w:numId w:val="1"/>
+        </w:numPr>
+        <w:spacing w:after="60"/>
+      </w:pPr>
+      <w:r>
+        <w:rPr>
+          <w:rFonts w:ascii="Calibri" w:cs="Calibri" w:eastAsia="Calibri" w:hAnsi="Calibri"/>
+          <w:color w:val="BBBBCC"/>
+          <w:sz w:val="21"/>
+          <w:szCs w:val="21"/>
+        </w:rPr>
+        <w:t xml:space="preserve">Fields used: triggerSignals (;-sep), whyItMatters, industryLandscape, whatGoodLooksLike, failureModes (\n-sep), technologyEnablers (;-sep), consultingEntryPoints</w:t>
       </w:r>
     </w:p>
     <w:p>
@@ -4496,7 +4154,7 @@
           <w:sz w:val="20"/>
           <w:szCs w:val="20"/>
         </w:rPr>
-        <w:t xml:space="preserve">⚠  AI scope is ANY FMCG company worldwide — Kraft Heinz, Diageo, AB InBev, Danone, Beiersdorf, Ferrero, Pernod Ricard, Conagra, Lindt, and all others. DB is supporting context, NOT scope limitation.</w:t>
+        <w:t xml:space="preserve">⚠  AI scope is ANY FMCG company worldwide — Kraft Heinz, Diageo, AB InBev, Danone, Beiersdorf, Ferrero, Conagra, Lindt, and all others. DB is supporting context, NOT scope limitation.</w:t>
       </w:r>
     </w:p>
     <w:p>
@@ -4512,102 +4170,121 @@
           <w:sz w:val="28"/>
           <w:szCs w:val="28"/>
         </w:rPr>
-        <w:t xml:space="preserve">7c. Data Priority Hierarchy</w:t>
-      </w:r>
-    </w:p>
-    <w:p>
-      <w:pPr>
-        <w:pStyle w:val="ListParagraph"/>
-        <w:numPr>
-          <w:ilvl w:val="0"/>
-          <w:numId w:val="1"/>
-        </w:numPr>
-        <w:spacing w:after="60"/>
-      </w:pPr>
-      <w:r>
-        <w:rPr>
-          <w:rFonts w:ascii="Calibri" w:cs="Calibri" w:eastAsia="Calibri" w:hAnsi="Calibri"/>
-          <w:color w:val="BBBBCC"/>
-          <w:sz w:val="21"/>
-          <w:szCs w:val="21"/>
-        </w:rPr>
-        <w:t xml:space="preserve">1. Latest real-world knowledge (last 12 months) — HIGHEST PRIORITY</w:t>
-      </w:r>
-    </w:p>
-    <w:p>
-      <w:pPr>
-        <w:pStyle w:val="ListParagraph"/>
-        <w:numPr>
-          <w:ilvl w:val="0"/>
-          <w:numId w:val="1"/>
-        </w:numPr>
-        <w:spacing w:after="60"/>
-      </w:pPr>
-      <w:r>
-        <w:rPr>
-          <w:rFonts w:ascii="Calibri" w:cs="Calibri" w:eastAsia="Calibri" w:hAnsi="Calibri"/>
-          <w:color w:val="BBBBCC"/>
-          <w:sz w:val="21"/>
-          <w:szCs w:val="21"/>
-        </w:rPr>
-        <w:t xml:space="preserve">2. Live signals from DB (time-aware, scope-classified)</w:t>
-      </w:r>
-    </w:p>
-    <w:p>
-      <w:pPr>
-        <w:pStyle w:val="ListParagraph"/>
-        <w:numPr>
-          <w:ilvl w:val="0"/>
-          <w:numId w:val="1"/>
-        </w:numPr>
-        <w:spacing w:after="60"/>
-      </w:pPr>
-      <w:r>
-        <w:rPr>
-          <w:rFonts w:ascii="Calibri" w:cs="Calibri" w:eastAsia="Calibri" w:hAnsi="Calibri"/>
-          <w:color w:val="BBBBCC"/>
-          <w:sz w:val="21"/>
-          <w:szCs w:val="21"/>
-        </w:rPr>
-        <w:t xml:space="preserve">3. KPI benchmarks (quantified, comparative, named companies)</w:t>
-      </w:r>
-    </w:p>
-    <w:p>
-      <w:pPr>
-        <w:pStyle w:val="ListParagraph"/>
-        <w:numPr>
-          <w:ilvl w:val="0"/>
-          <w:numId w:val="1"/>
-        </w:numPr>
-        <w:spacing w:after="60"/>
-      </w:pPr>
-      <w:r>
-        <w:rPr>
-          <w:rFonts w:ascii="Calibri" w:cs="Calibri" w:eastAsia="Calibri" w:hAnsi="Calibri"/>
-          <w:color w:val="BBBBCC"/>
-          <w:sz w:val="21"/>
-          <w:szCs w:val="21"/>
-        </w:rPr>
-        <w:t xml:space="preserve">4. SHEI patterns (auto-generated &gt; static)</w:t>
-      </w:r>
-    </w:p>
-    <w:p>
-      <w:pPr>
-        <w:pStyle w:val="ListParagraph"/>
-        <w:numPr>
-          <w:ilvl w:val="0"/>
-          <w:numId w:val="1"/>
-        </w:numPr>
-        <w:spacing w:after="60"/>
-      </w:pPr>
-      <w:r>
-        <w:rPr>
-          <w:rFonts w:ascii="Calibri" w:cs="Calibri" w:eastAsia="Calibri" w:hAnsi="Calibri"/>
-          <w:color w:val="BBBBCC"/>
-          <w:sz w:val="21"/>
-          <w:szCs w:val="21"/>
-        </w:rPr>
-        <w:t xml:space="preserve">5. DB company profiles (supporting context only)</w:t>
+        <w:t xml:space="preserve">7c. Mandatory 6-Step Reasoning Pipeline</w:t>
+      </w:r>
+    </w:p>
+    <w:p>
+      <w:pPr>
+        <w:pStyle w:val="ListParagraph"/>
+        <w:numPr>
+          <w:ilvl w:val="0"/>
+          <w:numId w:val="1"/>
+        </w:numPr>
+        <w:spacing w:after="60"/>
+      </w:pPr>
+      <w:r>
+        <w:rPr>
+          <w:rFonts w:ascii="Calibri" w:cs="Calibri" w:eastAsia="Calibri" w:hAnsi="Calibri"/>
+          <w:color w:val="BBBBCC"/>
+          <w:sz w:val="21"/>
+          <w:szCs w:val="21"/>
+        </w:rPr>
+        <w:t xml:space="preserve">STEP 1 — SIGNAL EXTRACTION: Identify 3-6 relevant signals. Classify COMPANY_SPECIFIC | INDUSTRY_WIDE | MACRO. 2+ aligned → auto-generate SHEI.</w:t>
+      </w:r>
+    </w:p>
+    <w:p>
+      <w:pPr>
+        <w:pStyle w:val="ListParagraph"/>
+        <w:numPr>
+          <w:ilvl w:val="0"/>
+          <w:numId w:val="1"/>
+        </w:numPr>
+        <w:spacing w:after="60"/>
+      </w:pPr>
+      <w:r>
+        <w:rPr>
+          <w:rFonts w:ascii="Calibri" w:cs="Calibri" w:eastAsia="Calibri" w:hAnsi="Calibri"/>
+          <w:color w:val="BBBBCC"/>
+          <w:sz w:val="21"/>
+          <w:szCs w:val="21"/>
+        </w:rPr>
+        <w:t xml:space="preserve">STEP 2 — PATTERN DETECTION: Cluster into 1-2 themes (demand volatility / cost inflation / channel shift / regulatory pressure / capacity gap).</w:t>
+      </w:r>
+    </w:p>
+    <w:p>
+      <w:pPr>
+        <w:pStyle w:val="ListParagraph"/>
+        <w:numPr>
+          <w:ilvl w:val="0"/>
+          <w:numId w:val="1"/>
+        </w:numPr>
+        <w:spacing w:after="60"/>
+      </w:pPr>
+      <w:r>
+        <w:rPr>
+          <w:rFonts w:ascii="Calibri" w:cs="Calibri" w:eastAsia="Calibri" w:hAnsi="Calibri"/>
+          <w:color w:val="BBBBCC"/>
+          <w:sz w:val="21"/>
+          <w:szCs w:val="21"/>
+        </w:rPr>
+        <w:t xml:space="preserve">STEP 3 — HYPOTHESIS FORMATION: One testable structural statement. Must be non-obvious — reject if a junior analyst could write it.</w:t>
+      </w:r>
+    </w:p>
+    <w:p>
+      <w:pPr>
+        <w:pStyle w:val="ListParagraph"/>
+        <w:numPr>
+          <w:ilvl w:val="0"/>
+          <w:numId w:val="1"/>
+        </w:numPr>
+        <w:spacing w:after="60"/>
+      </w:pPr>
+      <w:r>
+        <w:rPr>
+          <w:rFonts w:ascii="Calibri" w:cs="Calibri" w:eastAsia="Calibri" w:hAnsi="Calibri"/>
+          <w:color w:val="BBBBCC"/>
+          <w:sz w:val="21"/>
+          <w:szCs w:val="21"/>
+        </w:rPr>
+        <w:t xml:space="preserve">STEP 4 — VALIDATION: KPI benchmark check (best/median/laggard). 2-3 peers. Flag contradictions explicitly.</w:t>
+      </w:r>
+    </w:p>
+    <w:p>
+      <w:pPr>
+        <w:pStyle w:val="ListParagraph"/>
+        <w:numPr>
+          <w:ilvl w:val="0"/>
+          <w:numId w:val="1"/>
+        </w:numPr>
+        <w:spacing w:after="60"/>
+      </w:pPr>
+      <w:r>
+        <w:rPr>
+          <w:rFonts w:ascii="Calibri" w:cs="Calibri" w:eastAsia="Calibri" w:hAnsi="Calibri"/>
+          <w:color w:val="BBBBCC"/>
+          <w:sz w:val="21"/>
+          <w:szCs w:val="21"/>
+        </w:rPr>
+        <w:t xml:space="preserve">STEP 5 — IMPACT ESTIMATION: Revenue (Rs.Cr/$M), Margin (bps or %), Working Capital (days or Rs.Cr). Include calculation logic.</w:t>
+      </w:r>
+    </w:p>
+    <w:p>
+      <w:pPr>
+        <w:pStyle w:val="ListParagraph"/>
+        <w:numPr>
+          <w:ilvl w:val="0"/>
+          <w:numId w:val="1"/>
+        </w:numPr>
+        <w:spacing w:after="60"/>
+      </w:pPr>
+      <w:r>
+        <w:rPr>
+          <w:rFonts w:ascii="Calibri" w:cs="Calibri" w:eastAsia="Calibri" w:hAnsi="Calibri"/>
+          <w:color w:val="BBBBCC"/>
+          <w:sz w:val="21"/>
+          <w:szCs w:val="21"/>
+        </w:rPr>
+        <w:t xml:space="preserve">STEP 6 — DECISION LAYER: Immediate (0-3 months) + Programme (6-12 months) + Thoucentric engagement. ONLY THEN generate output.</w:t>
       </w:r>
     </w:p>
     <w:p>
@@ -4623,213 +4300,83 @@
           <w:sz w:val="28"/>
           <w:szCs w:val="28"/>
         </w:rPr>
-        <w:t xml:space="preserve">7d. Mandatory 6-Step Reasoning Pipeline (execute BEFORE every output)</w:t>
-      </w:r>
-    </w:p>
-    <w:p>
-      <w:pPr>
-        <w:pStyle w:val="ListParagraph"/>
-        <w:numPr>
-          <w:ilvl w:val="0"/>
-          <w:numId w:val="1"/>
-        </w:numPr>
-        <w:spacing w:after="60"/>
-      </w:pPr>
-      <w:r>
-        <w:rPr>
-          <w:rFonts w:ascii="Calibri" w:cs="Calibri" w:eastAsia="Calibri" w:hAnsi="Calibri"/>
-          <w:color w:val="BBBBCC"/>
-          <w:sz w:val="21"/>
-          <w:szCs w:val="21"/>
-        </w:rPr>
-        <w:t xml:space="preserve">STEP 1 — SIGNAL EXTRACTION: Identify 3-6 relevant signals. Classify COMPANY_SPECIFIC | INDUSTRY_WIDE | MACRO. 2+ aligned → auto-generate SHEI.</w:t>
-      </w:r>
-    </w:p>
-    <w:p>
-      <w:pPr>
-        <w:pStyle w:val="ListParagraph"/>
-        <w:numPr>
-          <w:ilvl w:val="0"/>
-          <w:numId w:val="1"/>
-        </w:numPr>
-        <w:spacing w:after="60"/>
-      </w:pPr>
-      <w:r>
-        <w:rPr>
-          <w:rFonts w:ascii="Calibri" w:cs="Calibri" w:eastAsia="Calibri" w:hAnsi="Calibri"/>
-          <w:color w:val="BBBBCC"/>
-          <w:sz w:val="21"/>
-          <w:szCs w:val="21"/>
-        </w:rPr>
-        <w:t xml:space="preserve">STEP 2 — PATTERN DETECTION: Cluster into 1-2 themes (demand volatility / cost inflation / channel shift / regulatory pressure / capacity gap).</w:t>
-      </w:r>
-    </w:p>
-    <w:p>
-      <w:pPr>
-        <w:pStyle w:val="ListParagraph"/>
-        <w:numPr>
-          <w:ilvl w:val="0"/>
-          <w:numId w:val="1"/>
-        </w:numPr>
-        <w:spacing w:after="60"/>
-      </w:pPr>
-      <w:r>
-        <w:rPr>
-          <w:rFonts w:ascii="Calibri" w:cs="Calibri" w:eastAsia="Calibri" w:hAnsi="Calibri"/>
-          <w:color w:val="BBBBCC"/>
-          <w:sz w:val="21"/>
-          <w:szCs w:val="21"/>
-        </w:rPr>
-        <w:t xml:space="preserve">STEP 3 — HYPOTHESIS FORMATION: One testable structural statement. Non-obvious — junior analyst could write it → reject and deepen.</w:t>
-      </w:r>
-    </w:p>
-    <w:p>
-      <w:pPr>
-        <w:pStyle w:val="ListParagraph"/>
-        <w:numPr>
-          <w:ilvl w:val="0"/>
-          <w:numId w:val="1"/>
-        </w:numPr>
-        <w:spacing w:after="60"/>
-      </w:pPr>
-      <w:r>
-        <w:rPr>
-          <w:rFonts w:ascii="Calibri" w:cs="Calibri" w:eastAsia="Calibri" w:hAnsi="Calibri"/>
-          <w:color w:val="BBBBCC"/>
-          <w:sz w:val="21"/>
-          <w:szCs w:val="21"/>
-        </w:rPr>
-        <w:t xml:space="preserve">STEP 4 — VALIDATION: KPI benchmark check (best/median/laggard). 2-3 peers. Flag contradictions: Revenue+ Margin- | Inventory+ low demand | Strategy vs execution mismatch.</w:t>
-      </w:r>
-    </w:p>
-    <w:p>
-      <w:pPr>
-        <w:pStyle w:val="ListParagraph"/>
-        <w:numPr>
-          <w:ilvl w:val="0"/>
-          <w:numId w:val="1"/>
-        </w:numPr>
-        <w:spacing w:after="60"/>
-      </w:pPr>
-      <w:r>
-        <w:rPr>
-          <w:rFonts w:ascii="Calibri" w:cs="Calibri" w:eastAsia="Calibri" w:hAnsi="Calibri"/>
-          <w:color w:val="BBBBCC"/>
-          <w:sz w:val="21"/>
-          <w:szCs w:val="21"/>
-        </w:rPr>
-        <w:t xml:space="preserve">STEP 5 — IMPACT ESTIMATION: Revenue (Rs.Cr/$M), Margin (bps or %), Working Capital (days or Rs.Cr). Include calculation logic.</w:t>
-      </w:r>
-    </w:p>
-    <w:p>
-      <w:pPr>
-        <w:pStyle w:val="ListParagraph"/>
-        <w:numPr>
-          <w:ilvl w:val="0"/>
-          <w:numId w:val="1"/>
-        </w:numPr>
-        <w:spacing w:after="60"/>
-      </w:pPr>
-      <w:r>
-        <w:rPr>
-          <w:rFonts w:ascii="Calibri" w:cs="Calibri" w:eastAsia="Calibri" w:hAnsi="Calibri"/>
-          <w:color w:val="BBBBCC"/>
-          <w:sz w:val="21"/>
-          <w:szCs w:val="21"/>
-        </w:rPr>
-        <w:t xml:space="preserve">STEP 6 — DECISION LAYER: Immediate (0-3 months) + Programme (6-12 months) + Thoucentric engagement. ONLY THEN generate output.</w:t>
-      </w:r>
-    </w:p>
-    <w:p>
-      <w:pPr>
-        <w:spacing w:after="100" w:before="300"/>
-      </w:pPr>
-      <w:r>
-        <w:rPr>
-          <w:rFonts w:ascii="Calibri" w:cs="Calibri" w:eastAsia="Calibri" w:hAnsi="Calibri"/>
-          <w:b/>
-          <w:bCs/>
-          <w:color w:val="CCCCDD"/>
-          <w:sz w:val="28"/>
-          <w:szCs w:val="28"/>
-        </w:rPr>
-        <w:t xml:space="preserve">7e. Mandatory 9-Section Output Structure (every response — no exceptions)</w:t>
-      </w:r>
-    </w:p>
-    <w:p>
-      <w:pPr>
-        <w:pStyle w:val="ListParagraph"/>
-        <w:numPr>
-          <w:ilvl w:val="0"/>
-          <w:numId w:val="1"/>
-        </w:numPr>
-        <w:spacing w:after="60"/>
-      </w:pPr>
-      <w:r>
-        <w:rPr>
-          <w:rFonts w:ascii="Calibri" w:cs="Calibri" w:eastAsia="Calibri" w:hAnsi="Calibri"/>
-          <w:color w:val="BBBBCC"/>
-          <w:sz w:val="21"/>
-          <w:szCs w:val="21"/>
-        </w:rPr>
-        <w:t xml:space="preserve">S1  SIGNALS: 3-5 data-backed events, Rs./$/EUR values, classify [COMPANY]/[INDUSTRY]/[MACRO], trajectory past → current → direction</w:t>
-      </w:r>
-    </w:p>
-    <w:p>
-      <w:pPr>
-        <w:pStyle w:val="ListParagraph"/>
-        <w:numPr>
-          <w:ilvl w:val="0"/>
-          <w:numId w:val="1"/>
-        </w:numPr>
-        <w:spacing w:after="60"/>
-      </w:pPr>
-      <w:r>
-        <w:rPr>
-          <w:rFonts w:ascii="Calibri" w:cs="Calibri" w:eastAsia="Calibri" w:hAnsi="Calibri"/>
-          <w:color w:val="BBBBCC"/>
-          <w:sz w:val="21"/>
-          <w:szCs w:val="21"/>
-        </w:rPr>
-        <w:t xml:space="preserve">S2  PATTERN &amp; INSIGHT: Non-obvious interpretation. Contradictions explicitly called out. Trajectory: Past (6-12M) → Current → Direction → Inflection.</w:t>
-      </w:r>
-    </w:p>
-    <w:p>
-      <w:pPr>
-        <w:pStyle w:val="ListParagraph"/>
-        <w:numPr>
-          <w:ilvl w:val="0"/>
-          <w:numId w:val="1"/>
-        </w:numPr>
-        <w:spacing w:after="60"/>
-      </w:pPr>
-      <w:r>
-        <w:rPr>
-          <w:rFonts w:ascii="Calibri" w:cs="Calibri" w:eastAsia="Calibri" w:hAnsi="Calibri"/>
-          <w:color w:val="BBBBCC"/>
-          <w:sz w:val="21"/>
-          <w:szCs w:val="21"/>
-        </w:rPr>
-        <w:t xml:space="preserve">S3  INDUSTRY COMPARISON: 2-3 peers quantified — "Company A MAPE 9% vs B 22%" (never qualitative). WHY leader is ahead.</w:t>
-      </w:r>
-    </w:p>
-    <w:p>
-      <w:pPr>
-        <w:pStyle w:val="ListParagraph"/>
-        <w:numPr>
-          <w:ilvl w:val="0"/>
-          <w:numId w:val="1"/>
-        </w:numPr>
-        <w:spacing w:after="60"/>
-      </w:pPr>
-      <w:r>
-        <w:rPr>
-          <w:rFonts w:ascii="Calibri" w:cs="Calibri" w:eastAsia="Calibri" w:hAnsi="Calibri"/>
-          <w:color w:val="BBBBCC"/>
-          <w:sz w:val="21"/>
-          <w:szCs w:val="21"/>
-        </w:rPr>
-        <w:t xml:space="preserve">S4  KPI VALIDATION: Explicit KPI. Best-in-class (named). Median. Laggard. Subject company position. No data → directional with confidence.</w:t>
+        <w:t xml:space="preserve">7d. Mandatory 9-Section Output Structure (every response)</w:t>
+      </w:r>
+    </w:p>
+    <w:p>
+      <w:pPr>
+        <w:pStyle w:val="ListParagraph"/>
+        <w:numPr>
+          <w:ilvl w:val="0"/>
+          <w:numId w:val="1"/>
+        </w:numPr>
+        <w:spacing w:after="60"/>
+      </w:pPr>
+      <w:r>
+        <w:rPr>
+          <w:rFonts w:ascii="Calibri" w:cs="Calibri" w:eastAsia="Calibri" w:hAnsi="Calibri"/>
+          <w:color w:val="BBBBCC"/>
+          <w:sz w:val="21"/>
+          <w:szCs w:val="21"/>
+        </w:rPr>
+        <w:t xml:space="preserve">S1  SIGNALS: 3-5 data-backed events with Rs./$/EUR values, classify [COMPANY]/[INDUSTRY]/[MACRO], trajectory</w:t>
+      </w:r>
+    </w:p>
+    <w:p>
+      <w:pPr>
+        <w:pStyle w:val="ListParagraph"/>
+        <w:numPr>
+          <w:ilvl w:val="0"/>
+          <w:numId w:val="1"/>
+        </w:numPr>
+        <w:spacing w:after="60"/>
+      </w:pPr>
+      <w:r>
+        <w:rPr>
+          <w:rFonts w:ascii="Calibri" w:cs="Calibri" w:eastAsia="Calibri" w:hAnsi="Calibri"/>
+          <w:color w:val="BBBBCC"/>
+          <w:sz w:val="21"/>
+          <w:szCs w:val="21"/>
+        </w:rPr>
+        <w:t xml:space="preserve">S2  PATTERN &amp; INSIGHT: Non-obvious interpretation. Contradictions explicitly called out. Trajectory: Past → Current → Direction → Inflection.</w:t>
+      </w:r>
+    </w:p>
+    <w:p>
+      <w:pPr>
+        <w:pStyle w:val="ListParagraph"/>
+        <w:numPr>
+          <w:ilvl w:val="0"/>
+          <w:numId w:val="1"/>
+        </w:numPr>
+        <w:spacing w:after="60"/>
+      </w:pPr>
+      <w:r>
+        <w:rPr>
+          <w:rFonts w:ascii="Calibri" w:cs="Calibri" w:eastAsia="Calibri" w:hAnsi="Calibri"/>
+          <w:color w:val="BBBBCC"/>
+          <w:sz w:val="21"/>
+          <w:szCs w:val="21"/>
+        </w:rPr>
+        <w:t xml:space="preserve">S3  INDUSTRY COMPARISON: 2-3 peers quantified — never qualitative. WHY leader is ahead.</w:t>
+      </w:r>
+    </w:p>
+    <w:p>
+      <w:pPr>
+        <w:pStyle w:val="ListParagraph"/>
+        <w:numPr>
+          <w:ilvl w:val="0"/>
+          <w:numId w:val="1"/>
+        </w:numPr>
+        <w:spacing w:after="60"/>
+      </w:pPr>
+      <w:r>
+        <w:rPr>
+          <w:rFonts w:ascii="Calibri" w:cs="Calibri" w:eastAsia="Calibri" w:hAnsi="Calibri"/>
+          <w:color w:val="BBBBCC"/>
+          <w:sz w:val="21"/>
+          <w:szCs w:val="21"/>
+        </w:rPr>
+        <w:t xml:space="preserve">S4  KPI VALIDATION: Explicit KPI. Best-in-class (named). Median. Laggard. Subject company position.</w:t>
       </w:r>
     </w:p>
     <w:p>
@@ -4867,45 +4414,45 @@
           <w:sz w:val="21"/>
           <w:szCs w:val="21"/>
         </w:rPr>
-        <w:t xml:space="preserve">S6  DECISIONS REQUIRED: Immediate (0-3 months) and medium-term (6-12 months). Frame: "Company must choose X or Y by [date] because [inaction consequence]".</w:t>
-      </w:r>
-    </w:p>
-    <w:p>
-      <w:pPr>
-        <w:pStyle w:val="ListParagraph"/>
-        <w:numPr>
-          <w:ilvl w:val="0"/>
-          <w:numId w:val="1"/>
-        </w:numPr>
-        <w:spacing w:after="60"/>
-      </w:pPr>
-      <w:r>
-        <w:rPr>
-          <w:rFonts w:ascii="Calibri" w:cs="Calibri" w:eastAsia="Calibri" w:hAnsi="Calibri"/>
-          <w:color w:val="BBBBCC"/>
-          <w:sz w:val="21"/>
-          <w:szCs w:val="21"/>
-        </w:rPr>
-        <w:t xml:space="preserve">S7  THOUCENTRIC OPPORTUNITY: Named engagement. Entry: which executive, pain, trigger. Type: Diagnostic | Transformation | Advisory. Value estimate.</w:t>
-      </w:r>
-    </w:p>
-    <w:p>
-      <w:pPr>
-        <w:pStyle w:val="ListParagraph"/>
-        <w:numPr>
-          <w:ilvl w:val="0"/>
-          <w:numId w:val="1"/>
-        </w:numPr>
-        <w:spacing w:after="60"/>
-      </w:pPr>
-      <w:r>
-        <w:rPr>
-          <w:rFonts w:ascii="Calibri" w:cs="Calibri" w:eastAsia="Calibri" w:hAnsi="Calibri"/>
-          <w:color w:val="BBBBCC"/>
-          <w:sz w:val="21"/>
-          <w:szCs w:val="21"/>
-        </w:rPr>
-        <w:t xml:space="preserve">S8  CONFIDENCE: HIGH (data + peer validation) | MEDIUM (directional) | LOW (hypothesis). State what data is missing for HIGH.</w:t>
+        <w:t xml:space="preserve">S6  DECISIONS REQUIRED: Immediate (0-3 months) and medium-term (6-12 months). Frame: "must choose X or Y by [date] because [inaction consequence]".</w:t>
+      </w:r>
+    </w:p>
+    <w:p>
+      <w:pPr>
+        <w:pStyle w:val="ListParagraph"/>
+        <w:numPr>
+          <w:ilvl w:val="0"/>
+          <w:numId w:val="1"/>
+        </w:numPr>
+        <w:spacing w:after="60"/>
+      </w:pPr>
+      <w:r>
+        <w:rPr>
+          <w:rFonts w:ascii="Calibri" w:cs="Calibri" w:eastAsia="Calibri" w:hAnsi="Calibri"/>
+          <w:color w:val="BBBBCC"/>
+          <w:sz w:val="21"/>
+          <w:szCs w:val="21"/>
+        </w:rPr>
+        <w:t xml:space="preserve">S7  THOUCENTRIC OPPORTUNITY: Named engagement. Entry executive, pain, trigger. Type: Diagnostic | Transformation | Advisory. Value estimate.</w:t>
+      </w:r>
+    </w:p>
+    <w:p>
+      <w:pPr>
+        <w:pStyle w:val="ListParagraph"/>
+        <w:numPr>
+          <w:ilvl w:val="0"/>
+          <w:numId w:val="1"/>
+        </w:numPr>
+        <w:spacing w:after="60"/>
+      </w:pPr>
+      <w:r>
+        <w:rPr>
+          <w:rFonts w:ascii="Calibri" w:cs="Calibri" w:eastAsia="Calibri" w:hAnsi="Calibri"/>
+          <w:color w:val="BBBBCC"/>
+          <w:sz w:val="21"/>
+          <w:szCs w:val="21"/>
+        </w:rPr>
+        <w:t xml:space="preserve">S8  CONFIDENCE: HIGH (data + peer validation) | MEDIUM (directional) | LOW (hypothesis). State what data is missing.</w:t>
       </w:r>
     </w:p>
     <w:p>
@@ -4925,174 +4472,6 @@
           <w:szCs w:val="21"/>
         </w:rPr>
         <w:t xml:space="preserve">S9  CXO QUESTIONS: 2 sharply provocative questions. Format: "Given [specific data], what is your plan to [action] before [deadline]?"</w:t>
-      </w:r>
-    </w:p>
-    <w:p>
-      <w:pPr>
-        <w:spacing w:after="100" w:before="300"/>
-      </w:pPr>
-      <w:r>
-        <w:rPr>
-          <w:rFonts w:ascii="Calibri" w:cs="Calibri" w:eastAsia="Calibri" w:hAnsi="Calibri"/>
-          <w:b/>
-          <w:bCs/>
-          <w:color w:val="CCCCDD"/>
-          <w:sz w:val="28"/>
-          <w:szCs w:val="28"/>
-        </w:rPr>
-        <w:t xml:space="preserve">7f. Intelligence Quality Hard Rules</w:t>
-      </w:r>
-    </w:p>
-    <w:p>
-      <w:pPr>
-        <w:pStyle w:val="ListParagraph"/>
-        <w:numPr>
-          <w:ilvl w:val="0"/>
-          <w:numId w:val="1"/>
-        </w:numPr>
-        <w:spacing w:after="60"/>
-      </w:pPr>
-      <w:r>
-        <w:rPr>
-          <w:rFonts w:ascii="Calibri" w:cs="Calibri" w:eastAsia="Calibri" w:hAnsi="Calibri"/>
-          <w:color w:val="BBBBCC"/>
-          <w:sz w:val="21"/>
-          <w:szCs w:val="21"/>
-        </w:rPr>
-        <w:t xml:space="preserve">REJECT any insight a junior analyst could write — non-obvious standard is mandatory</w:t>
-      </w:r>
-    </w:p>
-    <w:p>
-      <w:pPr>
-        <w:pStyle w:val="ListParagraph"/>
-        <w:numPr>
-          <w:ilvl w:val="0"/>
-          <w:numId w:val="1"/>
-        </w:numPr>
-        <w:spacing w:after="60"/>
-      </w:pPr>
-      <w:r>
-        <w:rPr>
-          <w:rFonts w:ascii="Calibri" w:cs="Calibri" w:eastAsia="Calibri" w:hAnsi="Calibri"/>
-          <w:color w:val="BBBBCC"/>
-          <w:sz w:val="21"/>
-          <w:szCs w:val="21"/>
-        </w:rPr>
-        <w:t xml:space="preserve">CONTRADICTION DETECTION: Revenue+ Margin- | Volume+ Inventory+ | Strategy vs execution mismatch — flag EVERY contradiction explicitly</w:t>
-      </w:r>
-    </w:p>
-    <w:p>
-      <w:pPr>
-        <w:pStyle w:val="ListParagraph"/>
-        <w:numPr>
-          <w:ilvl w:val="0"/>
-          <w:numId w:val="1"/>
-        </w:numPr>
-        <w:spacing w:after="60"/>
-      </w:pPr>
-      <w:r>
-        <w:rPr>
-          <w:rFonts w:ascii="Calibri" w:cs="Calibri" w:eastAsia="Calibri" w:hAnsi="Calibri"/>
-          <w:color w:val="BBBBCC"/>
-          <w:sz w:val="21"/>
-          <w:szCs w:val="21"/>
-        </w:rPr>
-        <w:t xml:space="preserve">TRAJECTORY: Always show past → current → direction → inflection. Never static analysis.</w:t>
-      </w:r>
-    </w:p>
-    <w:p>
-      <w:pPr>
-        <w:pStyle w:val="ListParagraph"/>
-        <w:numPr>
-          <w:ilvl w:val="0"/>
-          <w:numId w:val="1"/>
-        </w:numPr>
-        <w:spacing w:after="60"/>
-      </w:pPr>
-      <w:r>
-        <w:rPr>
-          <w:rFonts w:ascii="Calibri" w:cs="Calibri" w:eastAsia="Calibri" w:hAnsi="Calibri"/>
-          <w:color w:val="BBBBCC"/>
-          <w:sz w:val="21"/>
-          <w:szCs w:val="21"/>
-        </w:rPr>
-        <w:t xml:space="preserve">QUANTIFY: No quantitative grounding → confidence LOW + state what data would change it</w:t>
-      </w:r>
-    </w:p>
-    <w:p>
-      <w:pPr>
-        <w:pStyle w:val="ListParagraph"/>
-        <w:numPr>
-          <w:ilvl w:val="0"/>
-          <w:numId w:val="1"/>
-        </w:numPr>
-        <w:spacing w:after="60"/>
-      </w:pPr>
-      <w:r>
-        <w:rPr>
-          <w:rFonts w:ascii="Calibri" w:cs="Calibri" w:eastAsia="Calibri" w:hAnsi="Calibri"/>
-          <w:color w:val="BBBBCC"/>
-          <w:sz w:val="21"/>
-          <w:szCs w:val="21"/>
-        </w:rPr>
-        <w:t xml:space="preserve">INDIA CONTEXT: GT vs MT vs Q-commerce | Rural vs urban | EPR, FSSAI, BIS, SEBI BRSR</w:t>
-      </w:r>
-    </w:p>
-    <w:p>
-      <w:pPr>
-        <w:pStyle w:val="ListParagraph"/>
-        <w:numPr>
-          <w:ilvl w:val="0"/>
-          <w:numId w:val="1"/>
-        </w:numPr>
-        <w:spacing w:after="60"/>
-      </w:pPr>
-      <w:r>
-        <w:rPr>
-          <w:rFonts w:ascii="Calibri" w:cs="Calibri" w:eastAsia="Calibri" w:hAnsi="Calibri"/>
-          <w:color w:val="BBBBCC"/>
-          <w:sz w:val="21"/>
-          <w:szCs w:val="21"/>
-        </w:rPr>
-        <w:t xml:space="preserve">GLOBAL CONTEXT: Commodity cycles | Channel shifts | Tech maturity | M&amp;A / carve-out patterns</w:t>
-      </w:r>
-    </w:p>
-    <w:p>
-      <w:pPr>
-        <w:pStyle w:val="ListParagraph"/>
-        <w:numPr>
-          <w:ilvl w:val="0"/>
-          <w:numId w:val="1"/>
-        </w:numPr>
-        <w:spacing w:after="60"/>
-      </w:pPr>
-      <w:r>
-        <w:rPr>
-          <w:rFonts w:ascii="Calibri" w:cs="Calibri" w:eastAsia="Calibri" w:hAnsi="Calibri"/>
-          <w:color w:val="BBBBCC"/>
-          <w:sz w:val="21"/>
-          <w:szCs w:val="21"/>
-        </w:rPr>
-        <w:t xml:space="preserve">BE OPINIONATED: State clear views. No "it depends". No generic consulting language.</w:t>
-      </w:r>
-    </w:p>
-    <w:p>
-      <w:pPr>
-        <w:pStyle w:val="ListParagraph"/>
-        <w:numPr>
-          <w:ilvl w:val="0"/>
-          <w:numId w:val="1"/>
-        </w:numPr>
-        <w:spacing w:after="60"/>
-      </w:pPr>
-      <w:r>
-        <w:rPr>
-          <w:rFonts w:ascii="Calibri" w:cs="Calibri" w:eastAsia="Calibri" w:hAnsi="Calibri"/>
-          <w:color w:val="BBBBCC"/>
-          <w:sz w:val="21"/>
-          <w:szCs w:val="21"/>
-        </w:rPr>
-        <w:t xml:space="preserve">FINAL TEST: "Does this change a CXO decision tomorrow?" If not → improve the output.</w:t>
       </w:r>
     </w:p>
     <w:p>
@@ -5208,7 +4587,7 @@
           <w:sz w:val="22"/>
           <w:szCs w:val="22"/>
         </w:rPr>
-        <w:t xml:space="preserve">IMMEDIATE / HIGH / ACT_NOW: </w:t>
+        <w:t xml:space="preserve">IMMEDIATE / ACT_NOW: </w:t>
       </w:r>
       <w:r>
         <w:rPr>
@@ -5258,7 +4637,7 @@
           <w:sz w:val="22"/>
           <w:szCs w:val="22"/>
         </w:rPr>
-        <w:t xml:space="preserve">STRUCTURAL / MONITOR / LOW: </w:t>
+        <w:t xml:space="preserve">STRUCTURAL / MONITOR: </w:t>
       </w:r>
       <w:r>
         <w:rPr>
@@ -5292,7 +4671,7 @@
           <w:sz w:val="22"/>
           <w:szCs w:val="22"/>
         </w:rPr>
-        <w:t xml:space="preserve">text-emerald-400 (TrendingUp icon)</w:t>
+        <w:t xml:space="preserve">text-emerald-400 (ArrowUpRight icon)</w:t>
       </w:r>
     </w:p>
     <w:p>
@@ -5317,7 +4696,7 @@
           <w:sz w:val="22"/>
           <w:szCs w:val="22"/>
         </w:rPr>
-        <w:t xml:space="preserve">text-red-400 (TrendingDown icon)</w:t>
+        <w:t xml:space="preserve">text-red-400 (ArrowDownRight icon)</w:t>
       </w:r>
     </w:p>
     <w:p>
@@ -5342,7 +4721,7 @@
           <w:sz w:val="22"/>
           <w:szCs w:val="22"/>
         </w:rPr>
-        <w:t xml:space="preserve">text-gray-400 (Minus icon)</w:t>
+        <w:t xml:space="preserve">text-amber-400 (ArrowRight icon)</w:t>
       </w:r>
     </w:p>
     <w:p>
@@ -5358,6 +4737,172 @@
           <w:sz w:val="28"/>
           <w:szCs w:val="28"/>
         </w:rPr>
+        <w:t xml:space="preserve">Category Colour Map (signals / timeline)</w:t>
+      </w:r>
+    </w:p>
+    <w:p>
+      <w:pPr>
+        <w:spacing w:after="80"/>
+      </w:pPr>
+      <w:r>
+        <w:rPr>
+          <w:rFonts w:ascii="Calibri" w:cs="Calibri" w:eastAsia="Calibri" w:hAnsi="Calibri"/>
+          <w:b/>
+          <w:bCs/>
+          <w:color w:val="9999FF"/>
+          <w:sz w:val="22"/>
+          <w:szCs w:val="22"/>
+        </w:rPr>
+        <w:t xml:space="preserve">SUPPLY_CHAIN: </w:t>
+      </w:r>
+      <w:r>
+        <w:rPr>
+          <w:rFonts w:ascii="Calibri" w:cs="Calibri" w:eastAsia="Calibri" w:hAnsi="Calibri"/>
+          <w:color w:val="CCCCDD"/>
+          <w:sz w:val="22"/>
+          <w:szCs w:val="22"/>
+        </w:rPr>
+        <w:t xml:space="preserve">bg-blue-500/20 text-blue-400</w:t>
+      </w:r>
+    </w:p>
+    <w:p>
+      <w:pPr>
+        <w:spacing w:after="80"/>
+      </w:pPr>
+      <w:r>
+        <w:rPr>
+          <w:rFonts w:ascii="Calibri" w:cs="Calibri" w:eastAsia="Calibri" w:hAnsi="Calibri"/>
+          <w:b/>
+          <w:bCs/>
+          <w:color w:val="9999FF"/>
+          <w:sz w:val="22"/>
+          <w:szCs w:val="22"/>
+        </w:rPr>
+        <w:t xml:space="preserve">PROCUREMENT: </w:t>
+      </w:r>
+      <w:r>
+        <w:rPr>
+          <w:rFonts w:ascii="Calibri" w:cs="Calibri" w:eastAsia="Calibri" w:hAnsi="Calibri"/>
+          <w:color w:val="CCCCDD"/>
+          <w:sz w:val="22"/>
+          <w:szCs w:val="22"/>
+        </w:rPr>
+        <w:t xml:space="preserve">bg-amber-500/20 text-amber-400</w:t>
+      </w:r>
+    </w:p>
+    <w:p>
+      <w:pPr>
+        <w:spacing w:after="80"/>
+      </w:pPr>
+      <w:r>
+        <w:rPr>
+          <w:rFonts w:ascii="Calibri" w:cs="Calibri" w:eastAsia="Calibri" w:hAnsi="Calibri"/>
+          <w:b/>
+          <w:bCs/>
+          <w:color w:val="9999FF"/>
+          <w:sz w:val="22"/>
+          <w:szCs w:val="22"/>
+        </w:rPr>
+        <w:t xml:space="preserve">DISTRIBUTION_GTM: </w:t>
+      </w:r>
+      <w:r>
+        <w:rPr>
+          <w:rFonts w:ascii="Calibri" w:cs="Calibri" w:eastAsia="Calibri" w:hAnsi="Calibri"/>
+          <w:color w:val="CCCCDD"/>
+          <w:sz w:val="22"/>
+          <w:szCs w:val="22"/>
+        </w:rPr>
+        <w:t xml:space="preserve">bg-violet-500/20 text-violet-400</w:t>
+      </w:r>
+    </w:p>
+    <w:p>
+      <w:pPr>
+        <w:spacing w:after="80"/>
+      </w:pPr>
+      <w:r>
+        <w:rPr>
+          <w:rFonts w:ascii="Calibri" w:cs="Calibri" w:eastAsia="Calibri" w:hAnsi="Calibri"/>
+          <w:b/>
+          <w:bCs/>
+          <w:color w:val="9999FF"/>
+          <w:sz w:val="22"/>
+          <w:szCs w:val="22"/>
+        </w:rPr>
+        <w:t xml:space="preserve">DIGITAL: </w:t>
+      </w:r>
+      <w:r>
+        <w:rPr>
+          <w:rFonts w:ascii="Calibri" w:cs="Calibri" w:eastAsia="Calibri" w:hAnsi="Calibri"/>
+          <w:color w:val="CCCCDD"/>
+          <w:sz w:val="22"/>
+          <w:szCs w:val="22"/>
+        </w:rPr>
+        <w:t xml:space="preserve">bg-cyan-500/20 text-cyan-400</w:t>
+      </w:r>
+    </w:p>
+    <w:p>
+      <w:pPr>
+        <w:spacing w:after="80"/>
+      </w:pPr>
+      <w:r>
+        <w:rPr>
+          <w:rFonts w:ascii="Calibri" w:cs="Calibri" w:eastAsia="Calibri" w:hAnsi="Calibri"/>
+          <w:b/>
+          <w:bCs/>
+          <w:color w:val="9999FF"/>
+          <w:sz w:val="22"/>
+          <w:szCs w:val="22"/>
+        </w:rPr>
+        <w:t xml:space="preserve">ESG: </w:t>
+      </w:r>
+      <w:r>
+        <w:rPr>
+          <w:rFonts w:ascii="Calibri" w:cs="Calibri" w:eastAsia="Calibri" w:hAnsi="Calibri"/>
+          <w:color w:val="CCCCDD"/>
+          <w:sz w:val="22"/>
+          <w:szCs w:val="22"/>
+        </w:rPr>
+        <w:t xml:space="preserve">bg-green-500/20 text-green-400</w:t>
+      </w:r>
+    </w:p>
+    <w:p>
+      <w:pPr>
+        <w:spacing w:after="80"/>
+      </w:pPr>
+      <w:r>
+        <w:rPr>
+          <w:rFonts w:ascii="Calibri" w:cs="Calibri" w:eastAsia="Calibri" w:hAnsi="Calibri"/>
+          <w:b/>
+          <w:bCs/>
+          <w:color w:val="9999FF"/>
+          <w:sz w:val="22"/>
+          <w:szCs w:val="22"/>
+        </w:rPr>
+        <w:t xml:space="preserve">MANUFACTURING: </w:t>
+      </w:r>
+      <w:r>
+        <w:rPr>
+          <w:rFonts w:ascii="Calibri" w:cs="Calibri" w:eastAsia="Calibri" w:hAnsi="Calibri"/>
+          <w:color w:val="CCCCDD"/>
+          <w:sz w:val="22"/>
+          <w:szCs w:val="22"/>
+        </w:rPr>
+        <w:t xml:space="preserve">bg-orange-500/20 text-orange-400</w:t>
+      </w:r>
+    </w:p>
+    <w:p>
+      <w:pPr>
+        <w:spacing w:after="100" w:before="300"/>
+      </w:pPr>
+      <w:r>
+        <w:rPr>
+          <w:rFonts w:ascii="Calibri" w:cs="Calibri" w:eastAsia="Calibri" w:hAnsi="Calibri"/>
+          <w:b/>
+          <w:bCs/>
+          <w:color w:val="CCCCDD"/>
+          <w:sz w:val="28"/>
+          <w:szCs w:val="28"/>
+        </w:rPr>
         <w:t xml:space="preserve">Typography &amp; Components</w:t>
       </w:r>
     </w:p>
@@ -5399,16 +4944,16 @@
           <w:sz w:val="22"/>
           <w:szCs w:val="22"/>
         </w:rPr>
-        <w:t xml:space="preserve">Page titles: </w:t>
-      </w:r>
-      <w:r>
-        <w:rPr>
-          <w:rFonts w:ascii="Calibri" w:cs="Calibri" w:eastAsia="Calibri" w:hAnsi="Calibri"/>
-          <w:color w:val="CCCCDD"/>
-          <w:sz w:val="22"/>
-          <w:szCs w:val="22"/>
-        </w:rPr>
-        <w:t xml:space="preserve">text-3xl font-bold font-mono tracking-tight</w:t>
+        <w:t xml:space="preserve">Cards: </w:t>
+      </w:r>
+      <w:r>
+        <w:rPr>
+          <w:rFonts w:ascii="Calibri" w:cs="Calibri" w:eastAsia="Calibri" w:hAnsi="Calibri"/>
+          <w:color w:val="CCCCDD"/>
+          <w:sz w:val="22"/>
+          <w:szCs w:val="22"/>
+        </w:rPr>
+        <w:t xml:space="preserve">border border-border bg-card rounded-xl (shadcn/ui Card)</w:t>
       </w:r>
     </w:p>
     <w:p>
@@ -5424,32 +4969,7 @@
           <w:sz w:val="22"/>
           <w:szCs w:val="22"/>
         </w:rPr>
-        <w:t xml:space="preserve">Cards: </w:t>
-      </w:r>
-      <w:r>
-        <w:rPr>
-          <w:rFonts w:ascii="Calibri" w:cs="Calibri" w:eastAsia="Calibri" w:hAnsi="Calibri"/>
-          <w:color w:val="CCCCDD"/>
-          <w:sz w:val="22"/>
-          <w:szCs w:val="22"/>
-        </w:rPr>
-        <w:t xml:space="preserve">border border-border bg-card rounded-xl — Card/CardContent/CardHeader from shadcn/ui</w:t>
-      </w:r>
-    </w:p>
-    <w:p>
-      <w:pPr>
-        <w:spacing w:after="80"/>
-      </w:pPr>
-      <w:r>
-        <w:rPr>
-          <w:rFonts w:ascii="Calibri" w:cs="Calibri" w:eastAsia="Calibri" w:hAnsi="Calibri"/>
-          <w:b/>
-          <w:bCs/>
-          <w:color w:val="9999FF"/>
-          <w:sz w:val="22"/>
-          <w:szCs w:val="22"/>
-        </w:rPr>
-        <w:t xml:space="preserve">Page entry: </w:t>
+        <w:t xml:space="preserve">Page entry animation: </w:t>
       </w:r>
       <w:r>
         <w:rPr>
@@ -5559,7 +5079,7 @@
           <w:sz w:val="22"/>
           <w:szCs w:val="22"/>
         </w:rPr>
-        <w:t xml:space="preserve">IMMEDIATE | MEDIUM_TERM | STRUCTURAL   (NOT: CRITICAL / HIGH / MEDIUM)</w:t>
+        <w:t xml:space="preserve">IMMEDIATE | MEDIUM_TERM | STRUCTURAL   (NOT: CRITICAL / HIGH / SHORT_TERM / MEDIUM)</w:t>
       </w:r>
     </w:p>
     <w:p>
@@ -5584,7 +5104,7 @@
           <w:sz w:val="22"/>
           <w:szCs w:val="22"/>
         </w:rPr>
-        <w:t xml:space="preserve">ACTIVE | INVESTIGATING | CLOSED</w:t>
+        <w:t xml:space="preserve">ACTIVE | INVESTIGATING | CLOSED   (NOT: CONFIRMED / MONITORING)</w:t>
       </w:r>
     </w:p>
     <w:p>
@@ -5659,7 +5179,7 @@
           <w:sz w:val="22"/>
           <w:szCs w:val="22"/>
         </w:rPr>
-        <w:t xml:space="preserve">ACT_NOW | INVESTIGATE | MONITOR   (NOT: CRITICAL / HIGH / ACT)</w:t>
+        <w:t xml:space="preserve">ACT_NOW | INVESTIGATE | MONITOR   (NOT: CRITICAL / HIGH / SHEI_CANDIDATE)</w:t>
       </w:r>
     </w:p>
     <w:p>
@@ -5709,7 +5229,7 @@
           <w:sz w:val="22"/>
           <w:szCs w:val="22"/>
         </w:rPr>
-        <w:t xml:space="preserve">SUPPLY_CHAIN | PROCUREMENT | DISTRIBUTION_GTM | DIGITAL | ESG | MANUFACTURING</w:t>
+        <w:t xml:space="preserve">SUPPLY_CHAIN | PROCUREMENT | DISTRIBUTION_GTM | DIGITAL | ESG | MANUFACTURING   (NOT: EARNINGS / TECHNOLOGY / REGULATORY / MACRO / STRATEGY)</w:t>
       </w:r>
     </w:p>
     <w:p>
@@ -5902,7 +5422,7 @@
           <w:sz w:val="20"/>
           <w:szCs w:val="20"/>
         </w:rPr>
-        <w:t xml:space="preserve">⚠  SHEI urgency is IMMEDIATE not CRITICAL, MEDIUM_TERM not MEDIUM, STRUCTURAL not LOW. urgencyRank and urgencyColor maps use exact string matching.</w:t>
+        <w:t xml:space="preserve">⚠  SHEI urgency is IMMEDIATE / MEDIUM_TERM / STRUCTURAL. urgencyColor and urgencyRank maps use exact string matching — wrong strings silently fall to default colour.</w:t>
       </w:r>
     </w:p>
     <w:p>
@@ -5919,7 +5439,7 @@
           <w:sz w:val="20"/>
           <w:szCs w:val="20"/>
         </w:rPr>
-        <w:t xml:space="preserve">⚠  Dashboard recentSignals: API returns ALL signals ordered DESC — no SQL LIMIT in route. Dashboard page slices to 8.</w:t>
+        <w:t xml:space="preserve">⚠  SHEI status is ACTIVE / INVESTIGATING / CLOSED. Not CONFIRMED or MONITORING — those will match no data.</w:t>
       </w:r>
     </w:p>
     <w:p>
@@ -5936,7 +5456,7 @@
           <w:sz w:val="20"/>
           <w:szCs w:val="20"/>
         </w:rPr>
-        <w:t xml:space="preserve">⚠  Signal action filter uses ACT_NOW/INVESTIGATE — not CRITICAL/HIGH.</w:t>
+        <w:t xml:space="preserve">⚠  Signal category enums are SUPPLY_CHAIN / PROCUREMENT / DISTRIBUTION_GTM / DIGITAL / ESG / MANUFACTURING. Old enums (EARNINGS, TECHNOLOGY, REGULATORY, MACRO, STRATEGY) will not match any seed data and render with no colour.</w:t>
       </w:r>
     </w:p>
     <w:p>
@@ -5953,7 +5473,7 @@
           <w:sz w:val="20"/>
           <w:szCs w:val="20"/>
         </w:rPr>
-        <w:t xml:space="preserve">⚠  Company detail related signals: plain text match on companyName. Must match seed exactly — "All FMCG" not "all fmcg".</w:t>
+        <w:t xml:space="preserve">⚠  Signal action filter uses ACT_NOW / INVESTIGATE / MONITOR. SHEI_CANDIDATE is not a valid action.</w:t>
       </w:r>
     </w:p>
     <w:p>
@@ -5970,7 +5490,7 @@
           <w:sz w:val="20"/>
           <w:szCs w:val="20"/>
         </w:rPr>
-        <w:t xml:space="preserve">⚠  Dashboard SHEI filter is OR: urgency=IMMEDIATE OR status=ACTIVE.</w:t>
+        <w:t xml:space="preserve">⚠  Dashboard recentSignals: API returns ALL signals ordered DESC — no SQL LIMIT in route. Dashboard page slices to 8.</w:t>
       </w:r>
     </w:p>
     <w:p>
@@ -5987,7 +5507,7 @@
           <w:sz w:val="20"/>
           <w:szCs w:val="20"/>
         </w:rPr>
-        <w:t xml:space="preserve">⚠  AI scope is NOT limited to DB companies — covers any FMCG worldwide. DB is supporting context only.</w:t>
+        <w:t xml:space="preserve">⚠  Company detail related signals: plain text match on companyName. Must match seed exactly — "All FMCG" not "all fmcg".</w:t>
       </w:r>
     </w:p>
     <w:p>
@@ -6004,7 +5524,7 @@
           <w:sz w:val="20"/>
           <w:szCs w:val="20"/>
         </w:rPr>
-        <w:t xml:space="preserve">⚠  Do NOT run pnpm dev at workspace root. Each artifact runs via its own Replit workflow with PORT env var.</w:t>
+        <w:t xml:space="preserve">⚠  Dashboard SHEI filter is OR: urgency=IMMEDIATE OR status=ACTIVE.</w:t>
       </w:r>
     </w:p>
     <w:p>
@@ -6021,7 +5541,7 @@
           <w:sz w:val="20"/>
           <w:szCs w:val="20"/>
         </w:rPr>
-        <w:t xml:space="preserve">⚠  Frontend BASE_URL from import.meta.env — all API calls must be relative paths. Never use localhost:PORT in frontend code.</w:t>
+        <w:t xml:space="preserve">⚠  AI scope is NOT limited to DB companies — covers any FMCG worldwide. DB is supporting context only.</w:t>
       </w:r>
     </w:p>
     <w:p>
@@ -6038,7 +5558,7 @@
           <w:sz w:val="20"/>
           <w:szCs w:val="20"/>
         </w:rPr>
-        <w:t xml:space="preserve">⚠  seedDatabase() now takes NO parameters and runs unconditionally. Do not add guard logic back.</w:t>
+        <w:t xml:space="preserve">⚠  Do NOT run pnpm dev at workspace root. Each artifact runs via its own Replit workflow with PORT env var.</w:t>
       </w:r>
     </w:p>
     <w:p>
@@ -6055,7 +5575,7 @@
           <w:sz w:val="20"/>
           <w:szCs w:val="20"/>
         </w:rPr>
-        <w:t xml:space="preserve">⚠  Always populate signal.pastState — used in Signal Tracker UI trajectory display AND AI system prompt.</w:t>
+        <w:t xml:space="preserve">⚠  Frontend BASE_URL from import.meta.env — all API calls must be relative paths. Never use localhost:PORT in frontend code.</w:t>
       </w:r>
     </w:p>
     <w:p>
@@ -6072,7 +5592,58 @@
           <w:sz w:val="20"/>
           <w:szCs w:val="20"/>
         </w:rPr>
-        <w:t xml:space="preserve">⚠  SHEI contradictions field is critical for AI quality — must contain specific Revenue+ Margin- patterns, not generic text.</w:t>
+        <w:t xml:space="preserve">⚠  seedDatabase() takes NO parameters and runs unconditionally. Do not add guard logic back.</w:t>
+      </w:r>
+    </w:p>
+    <w:p>
+      <w:pPr>
+        <w:spacing w:after="80"/>
+        <w:ind w:left="360"/>
+      </w:pPr>
+      <w:r>
+        <w:rPr>
+          <w:rFonts w:ascii="Calibri" w:cs="Calibri" w:eastAsia="Calibri" w:hAnsi="Calibri"/>
+          <w:i/>
+          <w:iCs/>
+          <w:color w:val="FFAA33"/>
+          <w:sz w:val="20"/>
+          <w:szCs w:val="20"/>
+        </w:rPr>
+        <w:t xml:space="preserve">⚠  Playbook page fields: triggerSignals (;-sep), whyItMatters, industryLandscape, whatGoodLooksLike, failureModes (\n-sep), technologyEnablers (;-sep), consultingEntryPoints. Old fields (description, keyQuestions, dataPoints, redFlags, bestPractices) do not exist in schema.</w:t>
+      </w:r>
+    </w:p>
+    <w:p>
+      <w:pPr>
+        <w:spacing w:after="80"/>
+        <w:ind w:left="360"/>
+      </w:pPr>
+      <w:r>
+        <w:rPr>
+          <w:rFonts w:ascii="Calibri" w:cs="Calibri" w:eastAsia="Calibri" w:hAnsi="Calibri"/>
+          <w:i/>
+          <w:iCs/>
+          <w:color w:val="FFAA33"/>
+          <w:sz w:val="20"/>
+          <w:szCs w:val="20"/>
+        </w:rPr>
+        <w:t xml:space="preserve">⚠  Always populate signal.pastState — used in Signal Tracker trajectory display AND AI system prompt.</w:t>
+      </w:r>
+    </w:p>
+    <w:p>
+      <w:pPr>
+        <w:spacing w:after="80"/>
+        <w:ind w:left="360"/>
+      </w:pPr>
+      <w:r>
+        <w:rPr>
+          <w:rFonts w:ascii="Calibri" w:cs="Calibri" w:eastAsia="Calibri" w:hAnsi="Calibri"/>
+          <w:i/>
+          <w:iCs/>
+          <w:color w:val="FFAA33"/>
+          <w:sz w:val="20"/>
+          <w:szCs w:val="20"/>
+        </w:rPr>
+        <w:t xml:space="preserve">⚠  SHEI contradictions field is critical for AI quality — must contain specific Revenue+ Margin- patterns.</w:t>
       </w:r>
     </w:p>
     <w:p>
@@ -6522,7 +6093,7 @@
           <w:sz w:val="22"/>
           <w:szCs w:val="22"/>
         </w:rPr>
-        <w:t xml:space="preserve">Every piece of seed data must pass this checklist before inclusion in seed.ts. These standards are the ONLY control on data quality — there is no row-count guard or volume limit.</w:t>
+        <w:t xml:space="preserve">Every piece of seed data must pass this checklist before inclusion in seed.ts. These standards are the ONLY quality control — there is no row-count guard or volume limit.</w:t>
       </w:r>
     </w:p>
     <w:p>
@@ -6579,7 +6150,7 @@
           <w:sz w:val="21"/>
           <w:szCs w:val="21"/>
         </w:rPr>
-        <w:t xml:space="preserve">TRAJECTORY: Every signal must have pastState (6-12M reference) AND trajectoryDir. Both fields are required.</w:t>
+        <w:t xml:space="preserve">TRAJECTORY: Every signal must have pastState (6-12M reference) AND trajectoryDir. Both fields required.</w:t>
       </w:r>
     </w:p>
     <w:p>
@@ -6636,7 +6207,7 @@
           <w:sz w:val="21"/>
           <w:szCs w:val="21"/>
         </w:rPr>
-        <w:t xml:space="preserve">QUARTER: All signals cite Q4 FY25 or Q1 FY26. FY25 = April 2024 to March 2025. FY26 starts April 2025.</w:t>
+        <w:t xml:space="preserve">QUARTER: All signals cite Q4 FY25 or Q1 FY26. FY25 = April 2024–March 2025. FY26 starts April 2025.</w:t>
       </w:r>
     </w:p>
     <w:p>
@@ -6674,7 +6245,7 @@
           <w:sz w:val="21"/>
           <w:szCs w:val="21"/>
         </w:rPr>
-        <w:t xml:space="preserve">CONSULTING ANGLE: Every SHEI and playbook must specify: engagement timeline (weeks), entry persona, and revenue potential (Rs.Cr or EUR M range).</w:t>
+        <w:t xml:space="preserve">CONSULTING ANGLE: Every SHEI and playbook must specify engagement timeline (weeks), entry persona, and revenue potential (Rs.Cr or EUR M range).</w:t>
       </w:r>
     </w:p>
     <w:p>
@@ -6736,7 +6307,7 @@
           <w:sz w:val="22"/>
           <w:szCs w:val="22"/>
         </w:rPr>
-        <w:t xml:space="preserve">A consultant must be able to ask any of the following and receive a response that changes their CXO meeting preparation:</w:t>
+        <w:t xml:space="preserve">A consultant must be able to ask any of the following and receive a response usable in a CXO meeting:</w:t>
       </w:r>
     </w:p>
     <w:p>

</xml_diff>